<commit_message>
Date: 05 Dec 2025
</commit_message>
<xml_diff>
--- a/Notes_Selenium_15.docx
+++ b/Notes_Selenium_15.docx
@@ -2536,183 +2536,7 @@
           <w:szCs w:val="24"/>
           <w:lang w:val="en-US"/>
         </w:rPr>
-        <w:t xml:space="preserve"> Will close the current browser window which is opened by WebDriver object.</w:t>
-      </w:r>
-    </w:p>
-    <w:p>
-      <w:pPr>
-        <w:pStyle w:val="ListParagraph"/>
-        <w:numPr>
-          <w:ilvl w:val="0"/>
-          <w:numId w:val="12"/>
-        </w:numPr>
-        <w:rPr>
-          <w:sz w:val="26"/>
-          <w:szCs w:val="24"/>
-          <w:lang w:val="en-US"/>
-        </w:rPr>
-      </w:pPr>
-      <w:r>
-        <w:rPr>
-          <w:sz w:val="26"/>
-          <w:szCs w:val="24"/>
-          <w:lang w:val="en-US"/>
-        </w:rPr>
-        <w:t xml:space="preserve">getTitle() </w:t>
-      </w:r>
-      <w:r>
-        <w:rPr>
-          <w:sz w:val="26"/>
-          <w:szCs w:val="24"/>
-          <w:lang w:val="en-US"/>
-        </w:rPr>
-        <w:sym w:font="Wingdings" w:char="F0E0"/>
-      </w:r>
-      <w:r>
-        <w:rPr>
-          <w:sz w:val="26"/>
-          <w:szCs w:val="24"/>
-          <w:lang w:val="en-US"/>
-        </w:rPr>
-        <w:t xml:space="preserve"> Will return the title of the web page that is currently opened in browser.</w:t>
-      </w:r>
-      <w:r>
-        <w:rPr>
-          <w:sz w:val="26"/>
-          <w:szCs w:val="24"/>
-          <w:lang w:val="en-US"/>
-        </w:rPr>
-        <w:t xml:space="preserve"> (String)</w:t>
-      </w:r>
-    </w:p>
-    <w:p>
-      <w:pPr>
-        <w:pStyle w:val="ListParagraph"/>
-        <w:numPr>
-          <w:ilvl w:val="0"/>
-          <w:numId w:val="12"/>
-        </w:numPr>
-        <w:rPr>
-          <w:sz w:val="26"/>
-          <w:szCs w:val="24"/>
-          <w:lang w:val="en-US"/>
-        </w:rPr>
-      </w:pPr>
-      <w:r>
-        <w:rPr>
-          <w:sz w:val="26"/>
-          <w:szCs w:val="24"/>
-          <w:lang w:val="en-US"/>
-        </w:rPr>
-        <w:t xml:space="preserve">getCurrentUrl() </w:t>
-      </w:r>
-      <w:r>
-        <w:rPr>
-          <w:sz w:val="26"/>
-          <w:szCs w:val="24"/>
-          <w:lang w:val="en-US"/>
-        </w:rPr>
-        <w:sym w:font="Wingdings" w:char="F0E0"/>
-      </w:r>
-      <w:r>
-        <w:rPr>
-          <w:sz w:val="26"/>
-          <w:szCs w:val="24"/>
-          <w:lang w:val="en-US"/>
-        </w:rPr>
-        <w:t xml:space="preserve"> Will return the URL of the page that is currently opened in browser. (String)</w:t>
-      </w:r>
-    </w:p>
-    <w:p>
-      <w:pPr>
-        <w:pStyle w:val="ListParagraph"/>
-        <w:numPr>
-          <w:ilvl w:val="0"/>
-          <w:numId w:val="12"/>
-        </w:numPr>
-        <w:rPr>
-          <w:sz w:val="26"/>
-          <w:szCs w:val="24"/>
-          <w:lang w:val="en-US"/>
-        </w:rPr>
-      </w:pPr>
-      <w:r>
-        <w:rPr>
-          <w:sz w:val="26"/>
-          <w:szCs w:val="24"/>
-          <w:lang w:val="en-US"/>
-        </w:rPr>
-        <w:t xml:space="preserve">getPageSource() </w:t>
-      </w:r>
-      <w:r>
-        <w:rPr>
-          <w:sz w:val="26"/>
-          <w:szCs w:val="24"/>
-          <w:lang w:val="en-US"/>
-        </w:rPr>
-        <w:sym w:font="Wingdings" w:char="F0E0"/>
-      </w:r>
-      <w:r>
-        <w:rPr>
-          <w:sz w:val="26"/>
-          <w:szCs w:val="24"/>
-          <w:lang w:val="en-US"/>
-        </w:rPr>
-        <w:t xml:space="preserve"> Will return the HTML code of the web page. (</w:t>
-      </w:r>
-      <w:r>
-        <w:rPr>
-          <w:sz w:val="26"/>
-          <w:szCs w:val="24"/>
-          <w:lang w:val="en-US"/>
-        </w:rPr>
-        <w:t>String)</w:t>
-      </w:r>
-    </w:p>
-    <w:p>
-      <w:pPr>
-        <w:pStyle w:val="ListParagraph"/>
-        <w:numPr>
-          <w:ilvl w:val="0"/>
-          <w:numId w:val="12"/>
-        </w:numPr>
-        <w:rPr>
-          <w:sz w:val="26"/>
-          <w:szCs w:val="24"/>
-          <w:lang w:val="en-US"/>
-        </w:rPr>
-      </w:pPr>
-      <w:r>
-        <w:rPr>
-          <w:sz w:val="26"/>
-          <w:szCs w:val="24"/>
-          <w:lang w:val="en-US"/>
-        </w:rPr>
-        <w:t xml:space="preserve">findElement() </w:t>
-      </w:r>
-      <w:r>
-        <w:rPr>
-          <w:sz w:val="26"/>
-          <w:szCs w:val="24"/>
-          <w:lang w:val="en-US"/>
-        </w:rPr>
-        <w:sym w:font="Wingdings" w:char="F0E0"/>
-      </w:r>
-      <w:r>
-        <w:rPr>
-          <w:sz w:val="26"/>
-          <w:szCs w:val="24"/>
-          <w:lang w:val="en-US"/>
-        </w:rPr>
-        <w:t xml:space="preserve"> </w:t>
-      </w:r>
-      <w:r>
-        <w:rPr>
-          <w:sz w:val="26"/>
-          <w:szCs w:val="24"/>
-          <w:lang w:val="en-US"/>
-        </w:rPr>
-        <w:t xml:space="preserve">Will find and return the single control on the web page. </w:t>
+        <w:t xml:space="preserve"> Will close the </w:t>
       </w:r>
       <w:r>
         <w:rPr>
@@ -2722,7 +2546,191 @@
           <w:szCs w:val="24"/>
           <w:lang w:val="en-US"/>
         </w:rPr>
-        <w:t xml:space="preserve">It locates the first </w:t>
+        <w:t>current browser window</w:t>
+      </w:r>
+      <w:r>
+        <w:rPr>
+          <w:sz w:val="26"/>
+          <w:szCs w:val="24"/>
+          <w:lang w:val="en-US"/>
+        </w:rPr>
+        <w:t xml:space="preserve"> which is opened by WebDriver object.</w:t>
+      </w:r>
+    </w:p>
+    <w:p>
+      <w:pPr>
+        <w:pStyle w:val="ListParagraph"/>
+        <w:numPr>
+          <w:ilvl w:val="0"/>
+          <w:numId w:val="12"/>
+        </w:numPr>
+        <w:rPr>
+          <w:sz w:val="26"/>
+          <w:szCs w:val="24"/>
+          <w:lang w:val="en-US"/>
+        </w:rPr>
+      </w:pPr>
+      <w:r>
+        <w:rPr>
+          <w:sz w:val="26"/>
+          <w:szCs w:val="24"/>
+          <w:lang w:val="en-US"/>
+        </w:rPr>
+        <w:t xml:space="preserve">getTitle() </w:t>
+      </w:r>
+      <w:r>
+        <w:rPr>
+          <w:sz w:val="26"/>
+          <w:szCs w:val="24"/>
+          <w:lang w:val="en-US"/>
+        </w:rPr>
+        <w:sym w:font="Wingdings" w:char="F0E0"/>
+      </w:r>
+      <w:r>
+        <w:rPr>
+          <w:sz w:val="26"/>
+          <w:szCs w:val="24"/>
+          <w:lang w:val="en-US"/>
+        </w:rPr>
+        <w:t xml:space="preserve"> Will return the title of the web page that is currently opened in browser.</w:t>
+      </w:r>
+      <w:r>
+        <w:rPr>
+          <w:sz w:val="26"/>
+          <w:szCs w:val="24"/>
+          <w:lang w:val="en-US"/>
+        </w:rPr>
+        <w:t xml:space="preserve"> (String)</w:t>
+      </w:r>
+    </w:p>
+    <w:p>
+      <w:pPr>
+        <w:pStyle w:val="ListParagraph"/>
+        <w:numPr>
+          <w:ilvl w:val="0"/>
+          <w:numId w:val="12"/>
+        </w:numPr>
+        <w:rPr>
+          <w:sz w:val="26"/>
+          <w:szCs w:val="24"/>
+          <w:lang w:val="en-US"/>
+        </w:rPr>
+      </w:pPr>
+      <w:r>
+        <w:rPr>
+          <w:sz w:val="26"/>
+          <w:szCs w:val="24"/>
+          <w:lang w:val="en-US"/>
+        </w:rPr>
+        <w:t xml:space="preserve">getCurrentUrl() </w:t>
+      </w:r>
+      <w:r>
+        <w:rPr>
+          <w:sz w:val="26"/>
+          <w:szCs w:val="24"/>
+          <w:lang w:val="en-US"/>
+        </w:rPr>
+        <w:sym w:font="Wingdings" w:char="F0E0"/>
+      </w:r>
+      <w:r>
+        <w:rPr>
+          <w:sz w:val="26"/>
+          <w:szCs w:val="24"/>
+          <w:lang w:val="en-US"/>
+        </w:rPr>
+        <w:t xml:space="preserve"> Will return the URL of the page that is currently opened in browser. (String)</w:t>
+      </w:r>
+    </w:p>
+    <w:p>
+      <w:pPr>
+        <w:pStyle w:val="ListParagraph"/>
+        <w:numPr>
+          <w:ilvl w:val="0"/>
+          <w:numId w:val="12"/>
+        </w:numPr>
+        <w:rPr>
+          <w:sz w:val="26"/>
+          <w:szCs w:val="24"/>
+          <w:lang w:val="en-US"/>
+        </w:rPr>
+      </w:pPr>
+      <w:r>
+        <w:rPr>
+          <w:sz w:val="26"/>
+          <w:szCs w:val="24"/>
+          <w:lang w:val="en-US"/>
+        </w:rPr>
+        <w:t xml:space="preserve">getPageSource() </w:t>
+      </w:r>
+      <w:r>
+        <w:rPr>
+          <w:sz w:val="26"/>
+          <w:szCs w:val="24"/>
+          <w:lang w:val="en-US"/>
+        </w:rPr>
+        <w:sym w:font="Wingdings" w:char="F0E0"/>
+      </w:r>
+      <w:r>
+        <w:rPr>
+          <w:sz w:val="26"/>
+          <w:szCs w:val="24"/>
+          <w:lang w:val="en-US"/>
+        </w:rPr>
+        <w:t xml:space="preserve"> Will return the HTML code of the web page. (</w:t>
+      </w:r>
+      <w:r>
+        <w:rPr>
+          <w:sz w:val="26"/>
+          <w:szCs w:val="24"/>
+          <w:lang w:val="en-US"/>
+        </w:rPr>
+        <w:t>String)</w:t>
+      </w:r>
+    </w:p>
+    <w:p>
+      <w:pPr>
+        <w:pStyle w:val="ListParagraph"/>
+        <w:numPr>
+          <w:ilvl w:val="0"/>
+          <w:numId w:val="12"/>
+        </w:numPr>
+        <w:rPr>
+          <w:sz w:val="26"/>
+          <w:szCs w:val="24"/>
+          <w:lang w:val="en-US"/>
+        </w:rPr>
+      </w:pPr>
+      <w:r>
+        <w:rPr>
+          <w:sz w:val="26"/>
+          <w:szCs w:val="24"/>
+          <w:lang w:val="en-US"/>
+        </w:rPr>
+        <w:t xml:space="preserve">findElement() </w:t>
+      </w:r>
+      <w:r>
+        <w:rPr>
+          <w:sz w:val="26"/>
+          <w:szCs w:val="24"/>
+          <w:lang w:val="en-US"/>
+        </w:rPr>
+        <w:sym w:font="Wingdings" w:char="F0E0"/>
+      </w:r>
+      <w:r>
+        <w:rPr>
+          <w:sz w:val="26"/>
+          <w:szCs w:val="24"/>
+          <w:lang w:val="en-US"/>
+        </w:rPr>
+        <w:t xml:space="preserve"> </w:t>
+      </w:r>
+      <w:r>
+        <w:rPr>
+          <w:sz w:val="26"/>
+          <w:szCs w:val="24"/>
+          <w:lang w:val="en-US"/>
+        </w:rPr>
+        <w:t xml:space="preserve">Will find and return the single control on the web page. </w:t>
       </w:r>
       <w:r>
         <w:rPr>
@@ -2732,89 +2740,8 @@
           <w:szCs w:val="24"/>
           <w:lang w:val="en-US"/>
         </w:rPr>
-        <w:t>occurrence</w:t>
-      </w:r>
-      <w:r>
-        <w:rPr>
-          <w:sz w:val="26"/>
-          <w:szCs w:val="24"/>
-          <w:lang w:val="en-US"/>
-        </w:rPr>
-        <w:t xml:space="preserve">. </w:t>
-      </w:r>
-      <w:r>
-        <w:rPr>
-          <w:sz w:val="26"/>
-          <w:szCs w:val="24"/>
-          <w:lang w:val="en-US"/>
-        </w:rPr>
-        <w:t>(WebElement)</w:t>
-      </w:r>
-    </w:p>
-    <w:p>
-      <w:pPr>
-        <w:pStyle w:val="ListParagraph"/>
-        <w:numPr>
-          <w:ilvl w:val="0"/>
-          <w:numId w:val="12"/>
-        </w:numPr>
-        <w:rPr>
-          <w:sz w:val="26"/>
-          <w:szCs w:val="24"/>
-          <w:lang w:val="en-US"/>
-        </w:rPr>
-      </w:pPr>
-      <w:r>
-        <w:rPr>
-          <w:sz w:val="26"/>
-          <w:szCs w:val="24"/>
-          <w:lang w:val="en-US"/>
-        </w:rPr>
-        <w:t xml:space="preserve">findElements() </w:t>
-      </w:r>
-      <w:r>
-        <w:rPr>
-          <w:sz w:val="26"/>
-          <w:szCs w:val="24"/>
-          <w:lang w:val="en-US"/>
-        </w:rPr>
-        <w:sym w:font="Wingdings" w:char="F0E0"/>
-      </w:r>
-      <w:r>
-        <w:rPr>
-          <w:sz w:val="26"/>
-          <w:szCs w:val="24"/>
-          <w:lang w:val="en-US"/>
-        </w:rPr>
-        <w:t xml:space="preserve"> Will find and return multiple controls on the web page. (List&lt;WebElement&gt;)</w:t>
-      </w:r>
-    </w:p>
-    <w:p>
-      <w:pPr>
-        <w:rPr>
-          <w:sz w:val="26"/>
-          <w:szCs w:val="24"/>
-          <w:lang w:val="en-US"/>
-        </w:rPr>
-      </w:pPr>
-    </w:p>
-    <w:p>
-      <w:pPr>
-        <w:rPr>
-          <w:sz w:val="26"/>
-          <w:szCs w:val="24"/>
-          <w:lang w:val="en-US"/>
-        </w:rPr>
-      </w:pPr>
-    </w:p>
-    <w:p>
-      <w:pPr>
-        <w:rPr>
-          <w:sz w:val="26"/>
-          <w:szCs w:val="24"/>
-          <w:lang w:val="en-US"/>
-        </w:rPr>
-      </w:pPr>
+        <w:t xml:space="preserve">It locates the first </w:t>
+      </w:r>
       <w:r>
         <w:rPr>
           <w:b/>
@@ -2823,6 +2750,175 @@
           <w:szCs w:val="24"/>
           <w:lang w:val="en-US"/>
         </w:rPr>
+        <w:t>occurrence</w:t>
+      </w:r>
+      <w:r>
+        <w:rPr>
+          <w:sz w:val="26"/>
+          <w:szCs w:val="24"/>
+          <w:lang w:val="en-US"/>
+        </w:rPr>
+        <w:t xml:space="preserve">. </w:t>
+      </w:r>
+      <w:r>
+        <w:rPr>
+          <w:sz w:val="26"/>
+          <w:szCs w:val="24"/>
+          <w:lang w:val="en-US"/>
+        </w:rPr>
+        <w:t>(WebElement)</w:t>
+      </w:r>
+    </w:p>
+    <w:p>
+      <w:pPr>
+        <w:pStyle w:val="ListParagraph"/>
+        <w:numPr>
+          <w:ilvl w:val="0"/>
+          <w:numId w:val="12"/>
+        </w:numPr>
+        <w:rPr>
+          <w:sz w:val="26"/>
+          <w:szCs w:val="24"/>
+          <w:lang w:val="en-US"/>
+        </w:rPr>
+      </w:pPr>
+      <w:r>
+        <w:rPr>
+          <w:sz w:val="26"/>
+          <w:szCs w:val="24"/>
+          <w:lang w:val="en-US"/>
+        </w:rPr>
+        <w:t xml:space="preserve">findElements() </w:t>
+      </w:r>
+      <w:r>
+        <w:rPr>
+          <w:sz w:val="26"/>
+          <w:szCs w:val="24"/>
+          <w:lang w:val="en-US"/>
+        </w:rPr>
+        <w:sym w:font="Wingdings" w:char="F0E0"/>
+      </w:r>
+      <w:r>
+        <w:rPr>
+          <w:sz w:val="26"/>
+          <w:szCs w:val="24"/>
+          <w:lang w:val="en-US"/>
+        </w:rPr>
+        <w:t xml:space="preserve"> Will find and return multiple controls on the web page. (List&lt;WebElement&gt;)</w:t>
+      </w:r>
+    </w:p>
+    <w:p>
+      <w:pPr>
+        <w:pStyle w:val="ListParagraph"/>
+        <w:numPr>
+          <w:ilvl w:val="0"/>
+          <w:numId w:val="12"/>
+        </w:numPr>
+        <w:rPr>
+          <w:sz w:val="26"/>
+          <w:szCs w:val="24"/>
+          <w:lang w:val="en-US"/>
+        </w:rPr>
+      </w:pPr>
+      <w:r>
+        <w:rPr>
+          <w:sz w:val="26"/>
+          <w:szCs w:val="24"/>
+          <w:lang w:val="en-US"/>
+        </w:rPr>
+        <w:t xml:space="preserve">getWindowHandles() </w:t>
+      </w:r>
+      <w:r>
+        <w:rPr>
+          <w:sz w:val="26"/>
+          <w:szCs w:val="24"/>
+          <w:lang w:val="en-US"/>
+        </w:rPr>
+        <w:sym w:font="Wingdings" w:char="F0E0"/>
+      </w:r>
+      <w:r>
+        <w:rPr>
+          <w:sz w:val="26"/>
+          <w:szCs w:val="24"/>
+          <w:lang w:val="en-US"/>
+        </w:rPr>
+        <w:t xml:space="preserve"> Will return id’s of all the windows / tabs those are opened by WebDriver object. (Set&lt;String&gt;)</w:t>
+      </w:r>
+    </w:p>
+    <w:p>
+      <w:pPr>
+        <w:pStyle w:val="ListParagraph"/>
+        <w:numPr>
+          <w:ilvl w:val="0"/>
+          <w:numId w:val="12"/>
+        </w:numPr>
+        <w:rPr>
+          <w:sz w:val="26"/>
+          <w:szCs w:val="24"/>
+          <w:lang w:val="en-US"/>
+        </w:rPr>
+      </w:pPr>
+      <w:r>
+        <w:rPr>
+          <w:sz w:val="26"/>
+          <w:szCs w:val="24"/>
+          <w:lang w:val="en-US"/>
+        </w:rPr>
+        <w:t xml:space="preserve">quit() </w:t>
+      </w:r>
+      <w:r>
+        <w:rPr>
+          <w:sz w:val="26"/>
+          <w:szCs w:val="24"/>
+          <w:lang w:val="en-US"/>
+        </w:rPr>
+        <w:sym w:font="Wingdings" w:char="F0E0"/>
+      </w:r>
+      <w:r>
+        <w:rPr>
+          <w:sz w:val="26"/>
+          <w:szCs w:val="24"/>
+          <w:lang w:val="en-US"/>
+        </w:rPr>
+        <w:t xml:space="preserve"> Will close all browser windows those are opened by WebDriver object.</w:t>
+      </w:r>
+      <w:bookmarkStart w:id="0" w:name="_GoBack"/>
+      <w:bookmarkEnd w:id="0"/>
+    </w:p>
+    <w:p>
+      <w:pPr>
+        <w:rPr>
+          <w:sz w:val="26"/>
+          <w:szCs w:val="24"/>
+          <w:lang w:val="en-US"/>
+        </w:rPr>
+      </w:pPr>
+    </w:p>
+    <w:p>
+      <w:pPr>
+        <w:rPr>
+          <w:sz w:val="26"/>
+          <w:szCs w:val="24"/>
+          <w:lang w:val="en-US"/>
+        </w:rPr>
+      </w:pPr>
+    </w:p>
+    <w:p>
+      <w:pPr>
+        <w:rPr>
+          <w:sz w:val="26"/>
+          <w:szCs w:val="24"/>
+          <w:lang w:val="en-US"/>
+        </w:rPr>
+      </w:pPr>
+      <w:r>
+        <w:rPr>
+          <w:b/>
+          <w:bCs/>
+          <w:sz w:val="26"/>
+          <w:szCs w:val="24"/>
+          <w:lang w:val="en-US"/>
+        </w:rPr>
         <w:t>Common Exceptions in Selenium</w:t>
       </w:r>
     </w:p>
@@ -3124,6 +3220,44 @@
     </w:p>
     <w:p>
       <w:pPr>
+        <w:pStyle w:val="ListParagraph"/>
+        <w:numPr>
+          <w:ilvl w:val="0"/>
+          <w:numId w:val="13"/>
+        </w:numPr>
+        <w:rPr>
+          <w:sz w:val="26"/>
+          <w:szCs w:val="24"/>
+          <w:lang w:val="en-US"/>
+        </w:rPr>
+      </w:pPr>
+      <w:r>
+        <w:rPr>
+          <w:sz w:val="26"/>
+          <w:szCs w:val="24"/>
+          <w:lang w:val="en-US"/>
+        </w:rPr>
+        <w:t xml:space="preserve">ElementClickInterceptedException </w:t>
+      </w:r>
+      <w:r>
+        <w:rPr>
+          <w:sz w:val="26"/>
+          <w:szCs w:val="24"/>
+          <w:lang w:val="en-US"/>
+        </w:rPr>
+        <w:sym w:font="Wingdings" w:char="F0E0"/>
+      </w:r>
+      <w:r>
+        <w:rPr>
+          <w:sz w:val="26"/>
+          <w:szCs w:val="24"/>
+          <w:lang w:val="en-US"/>
+        </w:rPr>
+        <w:t xml:space="preserve"> Selenium is unable to click on the control due to the said control is hidden by another control.</w:t>
+      </w:r>
+    </w:p>
+    <w:p>
+      <w:pPr>
         <w:rPr>
           <w:sz w:val="26"/>
           <w:szCs w:val="24"/>
@@ -3164,6 +3298,7 @@
           <w:szCs w:val="24"/>
           <w:lang w:val="en-US"/>
         </w:rPr>
+        <w:lastRenderedPageBreak/>
         <w:tab/>
         <w:t>Locators are the ways / strategies to find the WebElement on the page.</w:t>
       </w:r>
@@ -3275,7 +3410,6 @@
           <w:szCs w:val="24"/>
           <w:lang w:val="en-US"/>
         </w:rPr>
-        <w:lastRenderedPageBreak/>
         <w:t>XPath</w:t>
       </w:r>
     </w:p>
@@ -3792,6 +3926,7 @@
           <w:szCs w:val="24"/>
           <w:lang w:val="en-US"/>
         </w:rPr>
+        <w:lastRenderedPageBreak/>
         <w:t>ClassName Locator:</w:t>
       </w:r>
     </w:p>
@@ -3836,7 +3971,6 @@
           <w:szCs w:val="24"/>
           <w:lang w:val="en-US"/>
         </w:rPr>
-        <w:lastRenderedPageBreak/>
         <w:tab/>
         <w:t>While using className locator pick up any one class from all those multiple classes.</w:t>
       </w:r>
@@ -4358,6 +4492,7 @@
           <w:szCs w:val="24"/>
           <w:lang w:val="en-US"/>
         </w:rPr>
+        <w:lastRenderedPageBreak/>
         <w:t>Taking reference of parent tag</w:t>
       </w:r>
       <w:r>
@@ -4436,7 +4571,6 @@
           <w:szCs w:val="24"/>
           <w:lang w:val="en-US"/>
         </w:rPr>
-        <w:lastRenderedPageBreak/>
         <w:t>Handling Dropdown List / List Box</w:t>
       </w:r>
     </w:p>
@@ -5092,6 +5226,7 @@
           <w:szCs w:val="24"/>
           <w:lang w:val="en-US"/>
         </w:rPr>
+        <w:lastRenderedPageBreak/>
         <w:t>Synchronization (Waits in Selenium)</w:t>
       </w:r>
     </w:p>
@@ -5213,7 +5348,6 @@
           <w:szCs w:val="24"/>
           <w:lang w:val="en-US"/>
         </w:rPr>
-        <w:lastRenderedPageBreak/>
         <w:t>ImplicitWait()</w:t>
       </w:r>
     </w:p>
@@ -5716,8 +5850,103 @@
         </w:rPr>
         <w:t>Display any row randomly</w:t>
       </w:r>
-      <w:bookmarkStart w:id="0" w:name="_GoBack"/>
-      <w:bookmarkEnd w:id="0"/>
+    </w:p>
+    <w:p>
+      <w:pPr>
+        <w:rPr>
+          <w:sz w:val="26"/>
+          <w:szCs w:val="24"/>
+          <w:lang w:val="en-US"/>
+        </w:rPr>
+      </w:pPr>
+    </w:p>
+    <w:p>
+      <w:pPr>
+        <w:rPr>
+          <w:b/>
+          <w:bCs/>
+          <w:sz w:val="26"/>
+          <w:szCs w:val="24"/>
+          <w:lang w:val="en-US"/>
+        </w:rPr>
+      </w:pPr>
+      <w:r>
+        <w:rPr>
+          <w:b/>
+          <w:bCs/>
+          <w:sz w:val="26"/>
+          <w:szCs w:val="24"/>
+          <w:lang w:val="en-US"/>
+        </w:rPr>
+        <w:t>JavascriptExecutor Interface</w:t>
+      </w:r>
+    </w:p>
+    <w:p>
+      <w:pPr>
+        <w:pStyle w:val="ListParagraph"/>
+        <w:numPr>
+          <w:ilvl w:val="0"/>
+          <w:numId w:val="23"/>
+        </w:numPr>
+        <w:rPr>
+          <w:sz w:val="26"/>
+          <w:szCs w:val="24"/>
+          <w:lang w:val="en-US"/>
+        </w:rPr>
+      </w:pPr>
+      <w:r>
+        <w:rPr>
+          <w:sz w:val="26"/>
+          <w:szCs w:val="24"/>
+          <w:lang w:val="en-US"/>
+        </w:rPr>
+        <w:lastRenderedPageBreak/>
+        <w:t>Scroll the page vertically / horizontally</w:t>
+      </w:r>
+    </w:p>
+    <w:p>
+      <w:pPr>
+        <w:pStyle w:val="ListParagraph"/>
+        <w:numPr>
+          <w:ilvl w:val="0"/>
+          <w:numId w:val="23"/>
+        </w:numPr>
+        <w:rPr>
+          <w:sz w:val="26"/>
+          <w:szCs w:val="24"/>
+          <w:lang w:val="en-US"/>
+        </w:rPr>
+      </w:pPr>
+      <w:r>
+        <w:rPr>
+          <w:sz w:val="26"/>
+          <w:szCs w:val="24"/>
+          <w:lang w:val="en-US"/>
+        </w:rPr>
+        <w:t>Click on any control which is hidden by another control (To avoid ElementClickInterceptedException)</w:t>
+      </w:r>
+    </w:p>
+    <w:p>
+      <w:pPr>
+        <w:pStyle w:val="ListParagraph"/>
+        <w:numPr>
+          <w:ilvl w:val="0"/>
+          <w:numId w:val="23"/>
+        </w:numPr>
+        <w:rPr>
+          <w:sz w:val="26"/>
+          <w:szCs w:val="24"/>
+          <w:lang w:val="en-US"/>
+        </w:rPr>
+      </w:pPr>
+      <w:r>
+        <w:rPr>
+          <w:sz w:val="26"/>
+          <w:szCs w:val="24"/>
+          <w:lang w:val="en-US"/>
+        </w:rPr>
+        <w:t>Enter some text in the text.</w:t>
+      </w:r>
     </w:p>
     <w:sectPr>
       <w:pgSz w:w="11906" w:h="16838"/>
@@ -6670,6 +6899,119 @@
     </w:lvl>
   </w:abstractNum>
   <w:abstractNum w:abstractNumId="10">
+    <w:nsid w:val="360C28AB"/>
+    <w:multiLevelType w:val="hybridMultilevel"/>
+    <w:tmpl w:val="D910DDB6"/>
+    <w:lvl w:ilvl="0" w:tplc="40090001">
+      <w:start w:val="1"/>
+      <w:numFmt w:val="bullet"/>
+      <w:lvlText w:val=""/>
+      <w:lvlJc w:val="left"/>
+      <w:pPr>
+        <w:ind w:left="720" w:hanging="360"/>
+      </w:pPr>
+      <w:rPr>
+        <w:rFonts w:ascii="Symbol" w:hAnsi="Symbol" w:hint="default"/>
+      </w:rPr>
+    </w:lvl>
+    <w:lvl w:ilvl="1" w:tplc="40090003" w:tentative="1">
+      <w:start w:val="1"/>
+      <w:numFmt w:val="bullet"/>
+      <w:lvlText w:val="o"/>
+      <w:lvlJc w:val="left"/>
+      <w:pPr>
+        <w:ind w:left="1440" w:hanging="360"/>
+      </w:pPr>
+      <w:rPr>
+        <w:rFonts w:ascii="Courier New" w:hAnsi="Courier New" w:cs="Courier New" w:hint="default"/>
+      </w:rPr>
+    </w:lvl>
+    <w:lvl w:ilvl="2" w:tplc="40090005" w:tentative="1">
+      <w:start w:val="1"/>
+      <w:numFmt w:val="bullet"/>
+      <w:lvlText w:val=""/>
+      <w:lvlJc w:val="left"/>
+      <w:pPr>
+        <w:ind w:left="2160" w:hanging="360"/>
+      </w:pPr>
+      <w:rPr>
+        <w:rFonts w:ascii="Wingdings" w:hAnsi="Wingdings" w:hint="default"/>
+      </w:rPr>
+    </w:lvl>
+    <w:lvl w:ilvl="3" w:tplc="40090001" w:tentative="1">
+      <w:start w:val="1"/>
+      <w:numFmt w:val="bullet"/>
+      <w:lvlText w:val=""/>
+      <w:lvlJc w:val="left"/>
+      <w:pPr>
+        <w:ind w:left="2880" w:hanging="360"/>
+      </w:pPr>
+      <w:rPr>
+        <w:rFonts w:ascii="Symbol" w:hAnsi="Symbol" w:hint="default"/>
+      </w:rPr>
+    </w:lvl>
+    <w:lvl w:ilvl="4" w:tplc="40090003" w:tentative="1">
+      <w:start w:val="1"/>
+      <w:numFmt w:val="bullet"/>
+      <w:lvlText w:val="o"/>
+      <w:lvlJc w:val="left"/>
+      <w:pPr>
+        <w:ind w:left="3600" w:hanging="360"/>
+      </w:pPr>
+      <w:rPr>
+        <w:rFonts w:ascii="Courier New" w:hAnsi="Courier New" w:cs="Courier New" w:hint="default"/>
+      </w:rPr>
+    </w:lvl>
+    <w:lvl w:ilvl="5" w:tplc="40090005" w:tentative="1">
+      <w:start w:val="1"/>
+      <w:numFmt w:val="bullet"/>
+      <w:lvlText w:val=""/>
+      <w:lvlJc w:val="left"/>
+      <w:pPr>
+        <w:ind w:left="4320" w:hanging="360"/>
+      </w:pPr>
+      <w:rPr>
+        <w:rFonts w:ascii="Wingdings" w:hAnsi="Wingdings" w:hint="default"/>
+      </w:rPr>
+    </w:lvl>
+    <w:lvl w:ilvl="6" w:tplc="40090001" w:tentative="1">
+      <w:start w:val="1"/>
+      <w:numFmt w:val="bullet"/>
+      <w:lvlText w:val=""/>
+      <w:lvlJc w:val="left"/>
+      <w:pPr>
+        <w:ind w:left="5040" w:hanging="360"/>
+      </w:pPr>
+      <w:rPr>
+        <w:rFonts w:ascii="Symbol" w:hAnsi="Symbol" w:hint="default"/>
+      </w:rPr>
+    </w:lvl>
+    <w:lvl w:ilvl="7" w:tplc="40090003" w:tentative="1">
+      <w:start w:val="1"/>
+      <w:numFmt w:val="bullet"/>
+      <w:lvlText w:val="o"/>
+      <w:lvlJc w:val="left"/>
+      <w:pPr>
+        <w:ind w:left="5760" w:hanging="360"/>
+      </w:pPr>
+      <w:rPr>
+        <w:rFonts w:ascii="Courier New" w:hAnsi="Courier New" w:cs="Courier New" w:hint="default"/>
+      </w:rPr>
+    </w:lvl>
+    <w:lvl w:ilvl="8" w:tplc="40090005" w:tentative="1">
+      <w:start w:val="1"/>
+      <w:numFmt w:val="bullet"/>
+      <w:lvlText w:val=""/>
+      <w:lvlJc w:val="left"/>
+      <w:pPr>
+        <w:ind w:left="6480" w:hanging="360"/>
+      </w:pPr>
+      <w:rPr>
+        <w:rFonts w:ascii="Wingdings" w:hAnsi="Wingdings" w:hint="default"/>
+      </w:rPr>
+    </w:lvl>
+  </w:abstractNum>
+  <w:abstractNum w:abstractNumId="11">
     <w:nsid w:val="38846546"/>
     <w:multiLevelType w:val="hybridMultilevel"/>
     <w:tmpl w:val="86F02860"/>
@@ -6758,7 +7100,7 @@
       </w:pPr>
     </w:lvl>
   </w:abstractNum>
-  <w:abstractNum w:abstractNumId="11">
+  <w:abstractNum w:abstractNumId="12">
     <w:nsid w:val="39C45A17"/>
     <w:multiLevelType w:val="hybridMultilevel"/>
     <w:tmpl w:val="7BCE0EDE"/>
@@ -6847,7 +7189,7 @@
       </w:pPr>
     </w:lvl>
   </w:abstractNum>
-  <w:abstractNum w:abstractNumId="12">
+  <w:abstractNum w:abstractNumId="13">
     <w:nsid w:val="3C0D7148"/>
     <w:multiLevelType w:val="hybridMultilevel"/>
     <w:tmpl w:val="61EAC19E"/>
@@ -6936,7 +7278,7 @@
       </w:pPr>
     </w:lvl>
   </w:abstractNum>
-  <w:abstractNum w:abstractNumId="13">
+  <w:abstractNum w:abstractNumId="14">
     <w:nsid w:val="3EC7092E"/>
     <w:multiLevelType w:val="hybridMultilevel"/>
     <w:tmpl w:val="BEB82898"/>
@@ -7025,7 +7367,7 @@
       </w:pPr>
     </w:lvl>
   </w:abstractNum>
-  <w:abstractNum w:abstractNumId="14">
+  <w:abstractNum w:abstractNumId="15">
     <w:nsid w:val="3FEE48BD"/>
     <w:multiLevelType w:val="hybridMultilevel"/>
     <w:tmpl w:val="7D7C81C4"/>
@@ -7114,7 +7456,7 @@
       </w:pPr>
     </w:lvl>
   </w:abstractNum>
-  <w:abstractNum w:abstractNumId="15">
+  <w:abstractNum w:abstractNumId="16">
     <w:nsid w:val="403F7638"/>
     <w:multiLevelType w:val="hybridMultilevel"/>
     <w:tmpl w:val="49801E86"/>
@@ -7203,7 +7545,7 @@
       </w:pPr>
     </w:lvl>
   </w:abstractNum>
-  <w:abstractNum w:abstractNumId="16">
+  <w:abstractNum w:abstractNumId="17">
     <w:nsid w:val="529E3796"/>
     <w:multiLevelType w:val="hybridMultilevel"/>
     <w:tmpl w:val="AB520516"/>
@@ -7292,7 +7634,7 @@
       </w:pPr>
     </w:lvl>
   </w:abstractNum>
-  <w:abstractNum w:abstractNumId="17">
+  <w:abstractNum w:abstractNumId="18">
     <w:nsid w:val="55816A8D"/>
     <w:multiLevelType w:val="hybridMultilevel"/>
     <w:tmpl w:val="1200EDB6"/>
@@ -7381,7 +7723,7 @@
       </w:pPr>
     </w:lvl>
   </w:abstractNum>
-  <w:abstractNum w:abstractNumId="18">
+  <w:abstractNum w:abstractNumId="19">
     <w:nsid w:val="60166BF6"/>
     <w:multiLevelType w:val="hybridMultilevel"/>
     <w:tmpl w:val="1A2C61F4"/>
@@ -7494,7 +7836,7 @@
       </w:rPr>
     </w:lvl>
   </w:abstractNum>
-  <w:abstractNum w:abstractNumId="19">
+  <w:abstractNum w:abstractNumId="20">
     <w:nsid w:val="669D6C41"/>
     <w:multiLevelType w:val="hybridMultilevel"/>
     <w:tmpl w:val="9E22EC66"/>
@@ -7607,7 +7949,7 @@
       </w:rPr>
     </w:lvl>
   </w:abstractNum>
-  <w:abstractNum w:abstractNumId="20">
+  <w:abstractNum w:abstractNumId="21">
     <w:nsid w:val="6DE40AAE"/>
     <w:multiLevelType w:val="hybridMultilevel"/>
     <w:tmpl w:val="8A1CE40E"/>
@@ -7696,7 +8038,7 @@
       </w:pPr>
     </w:lvl>
   </w:abstractNum>
-  <w:abstractNum w:abstractNumId="21">
+  <w:abstractNum w:abstractNumId="22">
     <w:nsid w:val="771F358C"/>
     <w:multiLevelType w:val="hybridMultilevel"/>
     <w:tmpl w:val="08E0D094"/>
@@ -7786,10 +8128,10 @@
     </w:lvl>
   </w:abstractNum>
   <w:num w:numId="1">
-    <w:abstractNumId w:val="11"/>
+    <w:abstractNumId w:val="12"/>
   </w:num>
   <w:num w:numId="2">
-    <w:abstractNumId w:val="13"/>
+    <w:abstractNumId w:val="14"/>
   </w:num>
   <w:num w:numId="3">
     <w:abstractNumId w:val="0"/>
@@ -7798,7 +8140,7 @@
     <w:abstractNumId w:val="6"/>
   </w:num>
   <w:num w:numId="5">
-    <w:abstractNumId w:val="15"/>
+    <w:abstractNumId w:val="16"/>
   </w:num>
   <w:num w:numId="6">
     <w:abstractNumId w:val="7"/>
@@ -7807,19 +8149,19 @@
     <w:abstractNumId w:val="4"/>
   </w:num>
   <w:num w:numId="8">
-    <w:abstractNumId w:val="19"/>
+    <w:abstractNumId w:val="20"/>
   </w:num>
   <w:num w:numId="9">
-    <w:abstractNumId w:val="21"/>
+    <w:abstractNumId w:val="22"/>
   </w:num>
   <w:num w:numId="10">
     <w:abstractNumId w:val="9"/>
   </w:num>
   <w:num w:numId="11">
-    <w:abstractNumId w:val="14"/>
+    <w:abstractNumId w:val="15"/>
   </w:num>
   <w:num w:numId="12">
-    <w:abstractNumId w:val="12"/>
+    <w:abstractNumId w:val="13"/>
   </w:num>
   <w:num w:numId="13">
     <w:abstractNumId w:val="3"/>
@@ -7828,27 +8170,30 @@
     <w:abstractNumId w:val="5"/>
   </w:num>
   <w:num w:numId="15">
-    <w:abstractNumId w:val="20"/>
+    <w:abstractNumId w:val="21"/>
   </w:num>
   <w:num w:numId="16">
     <w:abstractNumId w:val="2"/>
   </w:num>
   <w:num w:numId="17">
-    <w:abstractNumId w:val="16"/>
+    <w:abstractNumId w:val="17"/>
   </w:num>
   <w:num w:numId="18">
-    <w:abstractNumId w:val="18"/>
+    <w:abstractNumId w:val="19"/>
   </w:num>
   <w:num w:numId="19">
     <w:abstractNumId w:val="8"/>
   </w:num>
   <w:num w:numId="20">
-    <w:abstractNumId w:val="17"/>
+    <w:abstractNumId w:val="18"/>
   </w:num>
   <w:num w:numId="21">
     <w:abstractNumId w:val="1"/>
   </w:num>
   <w:num w:numId="22">
+    <w:abstractNumId w:val="11"/>
+  </w:num>
+  <w:num w:numId="23">
     <w:abstractNumId w:val="10"/>
   </w:num>
 </w:numbering>

</xml_diff>

<commit_message>
Date: 09 Dec 2025
</commit_message>
<xml_diff>
--- a/Notes_Selenium_15.docx
+++ b/Notes_Selenium_15.docx
@@ -3915,8 +3915,6 @@
         </w:rPr>
         <w:t xml:space="preserve"> Will clear the text from text box.</w:t>
       </w:r>
-      <w:bookmarkStart w:id="0" w:name="_GoBack"/>
-      <w:bookmarkEnd w:id="0"/>
     </w:p>
     <w:p>
       <w:pPr>
@@ -6450,6 +6448,202 @@
         <w:t>To upload any file, you just need to call .sendKeys(“Path of the File”);</w:t>
       </w:r>
     </w:p>
+    <w:p>
+      <w:pPr>
+        <w:rPr>
+          <w:sz w:val="26"/>
+          <w:szCs w:val="24"/>
+          <w:lang w:val="en-US"/>
+        </w:rPr>
+      </w:pPr>
+    </w:p>
+    <w:p>
+      <w:pPr>
+        <w:rPr>
+          <w:b/>
+          <w:bCs/>
+          <w:sz w:val="26"/>
+          <w:szCs w:val="24"/>
+          <w:lang w:val="en-US"/>
+        </w:rPr>
+      </w:pPr>
+      <w:r>
+        <w:rPr>
+          <w:b/>
+          <w:bCs/>
+          <w:sz w:val="26"/>
+          <w:szCs w:val="24"/>
+          <w:lang w:val="en-US"/>
+        </w:rPr>
+        <w:t>Mouse Actions</w:t>
+      </w:r>
+    </w:p>
+    <w:p>
+      <w:pPr>
+        <w:pStyle w:val="ListParagraph"/>
+        <w:numPr>
+          <w:ilvl w:val="0"/>
+          <w:numId w:val="27"/>
+        </w:numPr>
+        <w:rPr>
+          <w:sz w:val="26"/>
+          <w:szCs w:val="24"/>
+          <w:lang w:val="en-US"/>
+        </w:rPr>
+      </w:pPr>
+      <w:r>
+        <w:rPr>
+          <w:sz w:val="26"/>
+          <w:szCs w:val="24"/>
+          <w:lang w:val="en-US"/>
+        </w:rPr>
+        <w:lastRenderedPageBreak/>
+        <w:t>Hover</w:t>
+      </w:r>
+    </w:p>
+    <w:p>
+      <w:pPr>
+        <w:pStyle w:val="ListParagraph"/>
+        <w:numPr>
+          <w:ilvl w:val="0"/>
+          <w:numId w:val="27"/>
+        </w:numPr>
+        <w:rPr>
+          <w:sz w:val="26"/>
+          <w:szCs w:val="24"/>
+          <w:lang w:val="en-US"/>
+        </w:rPr>
+      </w:pPr>
+      <w:r>
+        <w:rPr>
+          <w:sz w:val="26"/>
+          <w:szCs w:val="24"/>
+          <w:lang w:val="en-US"/>
+        </w:rPr>
+        <w:t>Click</w:t>
+      </w:r>
+    </w:p>
+    <w:p>
+      <w:pPr>
+        <w:pStyle w:val="ListParagraph"/>
+        <w:numPr>
+          <w:ilvl w:val="0"/>
+          <w:numId w:val="27"/>
+        </w:numPr>
+        <w:rPr>
+          <w:sz w:val="26"/>
+          <w:szCs w:val="24"/>
+          <w:lang w:val="en-US"/>
+        </w:rPr>
+      </w:pPr>
+      <w:r>
+        <w:rPr>
+          <w:sz w:val="26"/>
+          <w:szCs w:val="24"/>
+          <w:lang w:val="en-US"/>
+        </w:rPr>
+        <w:t>Right Click</w:t>
+      </w:r>
+    </w:p>
+    <w:p>
+      <w:pPr>
+        <w:pStyle w:val="ListParagraph"/>
+        <w:numPr>
+          <w:ilvl w:val="0"/>
+          <w:numId w:val="27"/>
+        </w:numPr>
+        <w:rPr>
+          <w:sz w:val="26"/>
+          <w:szCs w:val="24"/>
+          <w:lang w:val="en-US"/>
+        </w:rPr>
+      </w:pPr>
+      <w:r>
+        <w:rPr>
+          <w:sz w:val="26"/>
+          <w:szCs w:val="24"/>
+          <w:lang w:val="en-US"/>
+        </w:rPr>
+        <w:t>Drag and drop</w:t>
+      </w:r>
+    </w:p>
+    <w:p>
+      <w:pPr>
+        <w:pStyle w:val="ListParagraph"/>
+        <w:numPr>
+          <w:ilvl w:val="0"/>
+          <w:numId w:val="27"/>
+        </w:numPr>
+        <w:rPr>
+          <w:sz w:val="26"/>
+          <w:szCs w:val="24"/>
+          <w:lang w:val="en-US"/>
+        </w:rPr>
+      </w:pPr>
+      <w:r>
+        <w:rPr>
+          <w:sz w:val="26"/>
+          <w:szCs w:val="24"/>
+          <w:lang w:val="en-US"/>
+        </w:rPr>
+        <w:t>Double Click</w:t>
+      </w:r>
+    </w:p>
+    <w:p>
+      <w:pPr>
+        <w:rPr>
+          <w:sz w:val="26"/>
+          <w:szCs w:val="24"/>
+          <w:lang w:val="en-US"/>
+        </w:rPr>
+      </w:pPr>
+      <w:r>
+        <w:rPr>
+          <w:sz w:val="26"/>
+          <w:szCs w:val="24"/>
+          <w:lang w:val="en-US"/>
+        </w:rPr>
+        <w:t xml:space="preserve">To perform above action, Selenium has provided special class called as </w:t>
+      </w:r>
+      <w:r>
+        <w:rPr>
+          <w:b/>
+          <w:bCs/>
+          <w:sz w:val="26"/>
+          <w:szCs w:val="24"/>
+          <w:lang w:val="en-US"/>
+        </w:rPr>
+        <w:t xml:space="preserve">Actions </w:t>
+      </w:r>
+      <w:r>
+        <w:rPr>
+          <w:sz w:val="26"/>
+          <w:szCs w:val="24"/>
+          <w:lang w:val="en-US"/>
+        </w:rPr>
+        <w:t>class.</w:t>
+      </w:r>
+    </w:p>
+    <w:p>
+      <w:pPr>
+        <w:rPr>
+          <w:sz w:val="26"/>
+          <w:szCs w:val="24"/>
+          <w:lang w:val="en-US"/>
+        </w:rPr>
+      </w:pPr>
+    </w:p>
+    <w:p>
+      <w:pPr>
+        <w:rPr>
+          <w:sz w:val="26"/>
+          <w:szCs w:val="24"/>
+          <w:lang w:val="en-US"/>
+        </w:rPr>
+      </w:pPr>
+      <w:bookmarkStart w:id="0" w:name="_GoBack"/>
+      <w:bookmarkEnd w:id="0"/>
+    </w:p>
     <w:sectPr>
       <w:pgSz w:w="11906" w:h="16838"/>
       <w:pgMar w:top="1440" w:right="1440" w:bottom="1440" w:left="1440" w:header="708" w:footer="708" w:gutter="0"/>
@@ -7360,6 +7554,95 @@
     </w:lvl>
   </w:abstractNum>
   <w:abstractNum w:abstractNumId="9">
+    <w:nsid w:val="203C513C"/>
+    <w:multiLevelType w:val="hybridMultilevel"/>
+    <w:tmpl w:val="8AB4A5AE"/>
+    <w:lvl w:ilvl="0" w:tplc="4009000F">
+      <w:start w:val="1"/>
+      <w:numFmt w:val="decimal"/>
+      <w:lvlText w:val="%1."/>
+      <w:lvlJc w:val="left"/>
+      <w:pPr>
+        <w:ind w:left="720" w:hanging="360"/>
+      </w:pPr>
+      <w:rPr>
+        <w:rFonts w:hint="default"/>
+      </w:rPr>
+    </w:lvl>
+    <w:lvl w:ilvl="1" w:tplc="40090019" w:tentative="1">
+      <w:start w:val="1"/>
+      <w:numFmt w:val="lowerLetter"/>
+      <w:lvlText w:val="%2."/>
+      <w:lvlJc w:val="left"/>
+      <w:pPr>
+        <w:ind w:left="1440" w:hanging="360"/>
+      </w:pPr>
+    </w:lvl>
+    <w:lvl w:ilvl="2" w:tplc="4009001B" w:tentative="1">
+      <w:start w:val="1"/>
+      <w:numFmt w:val="lowerRoman"/>
+      <w:lvlText w:val="%3."/>
+      <w:lvlJc w:val="right"/>
+      <w:pPr>
+        <w:ind w:left="2160" w:hanging="180"/>
+      </w:pPr>
+    </w:lvl>
+    <w:lvl w:ilvl="3" w:tplc="4009000F" w:tentative="1">
+      <w:start w:val="1"/>
+      <w:numFmt w:val="decimal"/>
+      <w:lvlText w:val="%4."/>
+      <w:lvlJc w:val="left"/>
+      <w:pPr>
+        <w:ind w:left="2880" w:hanging="360"/>
+      </w:pPr>
+    </w:lvl>
+    <w:lvl w:ilvl="4" w:tplc="40090019" w:tentative="1">
+      <w:start w:val="1"/>
+      <w:numFmt w:val="lowerLetter"/>
+      <w:lvlText w:val="%5."/>
+      <w:lvlJc w:val="left"/>
+      <w:pPr>
+        <w:ind w:left="3600" w:hanging="360"/>
+      </w:pPr>
+    </w:lvl>
+    <w:lvl w:ilvl="5" w:tplc="4009001B" w:tentative="1">
+      <w:start w:val="1"/>
+      <w:numFmt w:val="lowerRoman"/>
+      <w:lvlText w:val="%6."/>
+      <w:lvlJc w:val="right"/>
+      <w:pPr>
+        <w:ind w:left="4320" w:hanging="180"/>
+      </w:pPr>
+    </w:lvl>
+    <w:lvl w:ilvl="6" w:tplc="4009000F" w:tentative="1">
+      <w:start w:val="1"/>
+      <w:numFmt w:val="decimal"/>
+      <w:lvlText w:val="%7."/>
+      <w:lvlJc w:val="left"/>
+      <w:pPr>
+        <w:ind w:left="5040" w:hanging="360"/>
+      </w:pPr>
+    </w:lvl>
+    <w:lvl w:ilvl="7" w:tplc="40090019" w:tentative="1">
+      <w:start w:val="1"/>
+      <w:numFmt w:val="lowerLetter"/>
+      <w:lvlText w:val="%8."/>
+      <w:lvlJc w:val="left"/>
+      <w:pPr>
+        <w:ind w:left="5760" w:hanging="360"/>
+      </w:pPr>
+    </w:lvl>
+    <w:lvl w:ilvl="8" w:tplc="4009001B" w:tentative="1">
+      <w:start w:val="1"/>
+      <w:numFmt w:val="lowerRoman"/>
+      <w:lvlText w:val="%9."/>
+      <w:lvlJc w:val="right"/>
+      <w:pPr>
+        <w:ind w:left="6480" w:hanging="180"/>
+      </w:pPr>
+    </w:lvl>
+  </w:abstractNum>
+  <w:abstractNum w:abstractNumId="10">
     <w:nsid w:val="20F05ACF"/>
     <w:multiLevelType w:val="hybridMultilevel"/>
     <w:tmpl w:val="4C5A6C62"/>
@@ -7448,7 +7731,7 @@
       </w:pPr>
     </w:lvl>
   </w:abstractNum>
-  <w:abstractNum w:abstractNumId="10">
+  <w:abstractNum w:abstractNumId="11">
     <w:nsid w:val="2479664E"/>
     <w:multiLevelType w:val="hybridMultilevel"/>
     <w:tmpl w:val="14A418A0"/>
@@ -7537,7 +7820,7 @@
       </w:pPr>
     </w:lvl>
   </w:abstractNum>
-  <w:abstractNum w:abstractNumId="11">
+  <w:abstractNum w:abstractNumId="12">
     <w:nsid w:val="2E0E1364"/>
     <w:multiLevelType w:val="hybridMultilevel"/>
     <w:tmpl w:val="40CC5AC4"/>
@@ -7626,7 +7909,7 @@
       </w:pPr>
     </w:lvl>
   </w:abstractNum>
-  <w:abstractNum w:abstractNumId="12">
+  <w:abstractNum w:abstractNumId="13">
     <w:nsid w:val="360C28AB"/>
     <w:multiLevelType w:val="hybridMultilevel"/>
     <w:tmpl w:val="D910DDB6"/>
@@ -7739,7 +8022,7 @@
       </w:rPr>
     </w:lvl>
   </w:abstractNum>
-  <w:abstractNum w:abstractNumId="13">
+  <w:abstractNum w:abstractNumId="14">
     <w:nsid w:val="38846546"/>
     <w:multiLevelType w:val="hybridMultilevel"/>
     <w:tmpl w:val="86F02860"/>
@@ -7828,7 +8111,7 @@
       </w:pPr>
     </w:lvl>
   </w:abstractNum>
-  <w:abstractNum w:abstractNumId="14">
+  <w:abstractNum w:abstractNumId="15">
     <w:nsid w:val="39C45A17"/>
     <w:multiLevelType w:val="hybridMultilevel"/>
     <w:tmpl w:val="7BCE0EDE"/>
@@ -7917,7 +8200,7 @@
       </w:pPr>
     </w:lvl>
   </w:abstractNum>
-  <w:abstractNum w:abstractNumId="15">
+  <w:abstractNum w:abstractNumId="16">
     <w:nsid w:val="3C0D7148"/>
     <w:multiLevelType w:val="hybridMultilevel"/>
     <w:tmpl w:val="61EAC19E"/>
@@ -8006,7 +8289,7 @@
       </w:pPr>
     </w:lvl>
   </w:abstractNum>
-  <w:abstractNum w:abstractNumId="16">
+  <w:abstractNum w:abstractNumId="17">
     <w:nsid w:val="3EC7092E"/>
     <w:multiLevelType w:val="hybridMultilevel"/>
     <w:tmpl w:val="BEB82898"/>
@@ -8095,7 +8378,7 @@
       </w:pPr>
     </w:lvl>
   </w:abstractNum>
-  <w:abstractNum w:abstractNumId="17">
+  <w:abstractNum w:abstractNumId="18">
     <w:nsid w:val="3FEE48BD"/>
     <w:multiLevelType w:val="hybridMultilevel"/>
     <w:tmpl w:val="7D7C81C4"/>
@@ -8184,7 +8467,7 @@
       </w:pPr>
     </w:lvl>
   </w:abstractNum>
-  <w:abstractNum w:abstractNumId="18">
+  <w:abstractNum w:abstractNumId="19">
     <w:nsid w:val="403F7638"/>
     <w:multiLevelType w:val="hybridMultilevel"/>
     <w:tmpl w:val="49801E86"/>
@@ -8273,7 +8556,7 @@
       </w:pPr>
     </w:lvl>
   </w:abstractNum>
-  <w:abstractNum w:abstractNumId="19">
+  <w:abstractNum w:abstractNumId="20">
     <w:nsid w:val="4EBA6DD1"/>
     <w:multiLevelType w:val="hybridMultilevel"/>
     <w:tmpl w:val="60C02E0C"/>
@@ -8362,7 +8645,7 @@
       </w:pPr>
     </w:lvl>
   </w:abstractNum>
-  <w:abstractNum w:abstractNumId="20">
+  <w:abstractNum w:abstractNumId="21">
     <w:nsid w:val="529E3796"/>
     <w:multiLevelType w:val="hybridMultilevel"/>
     <w:tmpl w:val="AB520516"/>
@@ -8451,7 +8734,7 @@
       </w:pPr>
     </w:lvl>
   </w:abstractNum>
-  <w:abstractNum w:abstractNumId="21">
+  <w:abstractNum w:abstractNumId="22">
     <w:nsid w:val="55816A8D"/>
     <w:multiLevelType w:val="hybridMultilevel"/>
     <w:tmpl w:val="1200EDB6"/>
@@ -8540,7 +8823,7 @@
       </w:pPr>
     </w:lvl>
   </w:abstractNum>
-  <w:abstractNum w:abstractNumId="22">
+  <w:abstractNum w:abstractNumId="23">
     <w:nsid w:val="60166BF6"/>
     <w:multiLevelType w:val="hybridMultilevel"/>
     <w:tmpl w:val="1A2C61F4"/>
@@ -8653,7 +8936,7 @@
       </w:rPr>
     </w:lvl>
   </w:abstractNum>
-  <w:abstractNum w:abstractNumId="23">
+  <w:abstractNum w:abstractNumId="24">
     <w:nsid w:val="669D6C41"/>
     <w:multiLevelType w:val="hybridMultilevel"/>
     <w:tmpl w:val="9E22EC66"/>
@@ -8766,7 +9049,7 @@
       </w:rPr>
     </w:lvl>
   </w:abstractNum>
-  <w:abstractNum w:abstractNumId="24">
+  <w:abstractNum w:abstractNumId="25">
     <w:nsid w:val="6DE40AAE"/>
     <w:multiLevelType w:val="hybridMultilevel"/>
     <w:tmpl w:val="8A1CE40E"/>
@@ -8855,7 +9138,7 @@
       </w:pPr>
     </w:lvl>
   </w:abstractNum>
-  <w:abstractNum w:abstractNumId="25">
+  <w:abstractNum w:abstractNumId="26">
     <w:nsid w:val="771F358C"/>
     <w:multiLevelType w:val="hybridMultilevel"/>
     <w:tmpl w:val="08E0D094"/>
@@ -8945,10 +9228,10 @@
     </w:lvl>
   </w:abstractNum>
   <w:num w:numId="1">
-    <w:abstractNumId w:val="14"/>
+    <w:abstractNumId w:val="15"/>
   </w:num>
   <w:num w:numId="2">
-    <w:abstractNumId w:val="16"/>
+    <w:abstractNumId w:val="17"/>
   </w:num>
   <w:num w:numId="3">
     <w:abstractNumId w:val="0"/>
@@ -8957,28 +9240,28 @@
     <w:abstractNumId w:val="7"/>
   </w:num>
   <w:num w:numId="5">
-    <w:abstractNumId w:val="18"/>
+    <w:abstractNumId w:val="19"/>
   </w:num>
   <w:num w:numId="6">
-    <w:abstractNumId w:val="9"/>
+    <w:abstractNumId w:val="10"/>
   </w:num>
   <w:num w:numId="7">
     <w:abstractNumId w:val="5"/>
   </w:num>
   <w:num w:numId="8">
-    <w:abstractNumId w:val="23"/>
+    <w:abstractNumId w:val="24"/>
   </w:num>
   <w:num w:numId="9">
-    <w:abstractNumId w:val="25"/>
+    <w:abstractNumId w:val="26"/>
   </w:num>
   <w:num w:numId="10">
-    <w:abstractNumId w:val="11"/>
+    <w:abstractNumId w:val="12"/>
   </w:num>
   <w:num w:numId="11">
-    <w:abstractNumId w:val="17"/>
+    <w:abstractNumId w:val="18"/>
   </w:num>
   <w:num w:numId="12">
-    <w:abstractNumId w:val="15"/>
+    <w:abstractNumId w:val="16"/>
   </w:num>
   <w:num w:numId="13">
     <w:abstractNumId w:val="4"/>
@@ -8987,40 +9270,43 @@
     <w:abstractNumId w:val="6"/>
   </w:num>
   <w:num w:numId="15">
-    <w:abstractNumId w:val="24"/>
+    <w:abstractNumId w:val="25"/>
   </w:num>
   <w:num w:numId="16">
     <w:abstractNumId w:val="2"/>
   </w:num>
   <w:num w:numId="17">
-    <w:abstractNumId w:val="20"/>
+    <w:abstractNumId w:val="21"/>
   </w:num>
   <w:num w:numId="18">
-    <w:abstractNumId w:val="22"/>
+    <w:abstractNumId w:val="23"/>
   </w:num>
   <w:num w:numId="19">
-    <w:abstractNumId w:val="10"/>
+    <w:abstractNumId w:val="11"/>
   </w:num>
   <w:num w:numId="20">
-    <w:abstractNumId w:val="21"/>
+    <w:abstractNumId w:val="22"/>
   </w:num>
   <w:num w:numId="21">
     <w:abstractNumId w:val="1"/>
   </w:num>
   <w:num w:numId="22">
-    <w:abstractNumId w:val="13"/>
+    <w:abstractNumId w:val="14"/>
   </w:num>
   <w:num w:numId="23">
-    <w:abstractNumId w:val="12"/>
+    <w:abstractNumId w:val="13"/>
   </w:num>
   <w:num w:numId="24">
     <w:abstractNumId w:val="8"/>
   </w:num>
   <w:num w:numId="25">
-    <w:abstractNumId w:val="19"/>
+    <w:abstractNumId w:val="20"/>
   </w:num>
   <w:num w:numId="26">
     <w:abstractNumId w:val="3"/>
+  </w:num>
+  <w:num w:numId="27">
+    <w:abstractNumId w:val="9"/>
   </w:num>
 </w:numbering>
 </file>

</xml_diff>

<commit_message>
Date: 10 Dec 2025
</commit_message>
<xml_diff>
--- a/Notes_Selenium_15.docx
+++ b/Notes_Selenium_15.docx
@@ -3098,6 +3098,30 @@
       <w:pPr>
         <w:pStyle w:val="ListParagraph"/>
         <w:numPr>
+          <w:ilvl w:val="1"/>
+          <w:numId w:val="13"/>
+        </w:numPr>
+        <w:rPr>
+          <w:sz w:val="26"/>
+          <w:szCs w:val="24"/>
+          <w:lang w:val="en-US"/>
+        </w:rPr>
+      </w:pPr>
+      <w:r>
+        <w:rPr>
+          <w:sz w:val="26"/>
+          <w:szCs w:val="24"/>
+          <w:lang w:val="en-US"/>
+        </w:rPr>
+        <w:t>Your control may be inside frame</w:t>
+      </w:r>
+      <w:bookmarkStart w:id="0" w:name="_GoBack"/>
+      <w:bookmarkEnd w:id="0"/>
+    </w:p>
+    <w:p>
+      <w:pPr>
+        <w:pStyle w:val="ListParagraph"/>
+        <w:numPr>
           <w:ilvl w:val="0"/>
           <w:numId w:val="13"/>
         </w:numPr>
@@ -3317,7 +3341,6 @@
           <w:szCs w:val="24"/>
           <w:lang w:val="en-US"/>
         </w:rPr>
-        <w:lastRenderedPageBreak/>
         <w:t xml:space="preserve">Locators in Selenium: </w:t>
       </w:r>
     </w:p>
@@ -6500,6 +6523,22 @@
         <w:lastRenderedPageBreak/>
         <w:t>Hover</w:t>
       </w:r>
+      <w:r>
+        <w:rPr>
+          <w:sz w:val="26"/>
+          <w:szCs w:val="24"/>
+          <w:lang w:val="en-US"/>
+        </w:rPr>
+        <w:t xml:space="preserve"> </w:t>
+      </w:r>
+      <w:r>
+        <w:rPr>
+          <w:sz w:val="26"/>
+          <w:szCs w:val="24"/>
+          <w:lang w:val="en-US"/>
+        </w:rPr>
+        <w:sym w:font="Wingdings" w:char="F0E0"/>
+      </w:r>
     </w:p>
     <w:p>
       <w:pPr>
@@ -6632,17 +6671,182 @@
           <w:lang w:val="en-US"/>
         </w:rPr>
       </w:pPr>
-    </w:p>
-    <w:p>
-      <w:pPr>
-        <w:rPr>
-          <w:sz w:val="26"/>
-          <w:szCs w:val="24"/>
-          <w:lang w:val="en-US"/>
-        </w:rPr>
-      </w:pPr>
-      <w:bookmarkStart w:id="0" w:name="_GoBack"/>
-      <w:bookmarkEnd w:id="0"/>
+      <w:r>
+        <w:rPr>
+          <w:sz w:val="26"/>
+          <w:szCs w:val="24"/>
+          <w:lang w:val="en-US"/>
+        </w:rPr>
+        <w:t>Methods</w:t>
+      </w:r>
+    </w:p>
+    <w:p>
+      <w:pPr>
+        <w:pStyle w:val="ListParagraph"/>
+        <w:numPr>
+          <w:ilvl w:val="0"/>
+          <w:numId w:val="28"/>
+        </w:numPr>
+        <w:rPr>
+          <w:sz w:val="26"/>
+          <w:szCs w:val="24"/>
+          <w:lang w:val="en-US"/>
+        </w:rPr>
+      </w:pPr>
+      <w:r>
+        <w:rPr>
+          <w:sz w:val="26"/>
+          <w:szCs w:val="24"/>
+          <w:lang w:val="en-US"/>
+        </w:rPr>
+        <w:t xml:space="preserve">moveToElement() </w:t>
+      </w:r>
+      <w:r>
+        <w:rPr>
+          <w:sz w:val="26"/>
+          <w:szCs w:val="24"/>
+          <w:lang w:val="en-US"/>
+        </w:rPr>
+        <w:sym w:font="Wingdings" w:char="F0E0"/>
+      </w:r>
+      <w:r>
+        <w:rPr>
+          <w:sz w:val="26"/>
+          <w:szCs w:val="24"/>
+          <w:lang w:val="en-US"/>
+        </w:rPr>
+        <w:t xml:space="preserve"> Hovers the mouse on any control.</w:t>
+      </w:r>
+    </w:p>
+    <w:p>
+      <w:pPr>
+        <w:pStyle w:val="ListParagraph"/>
+        <w:numPr>
+          <w:ilvl w:val="0"/>
+          <w:numId w:val="28"/>
+        </w:numPr>
+        <w:rPr>
+          <w:sz w:val="26"/>
+          <w:szCs w:val="24"/>
+          <w:lang w:val="en-US"/>
+        </w:rPr>
+      </w:pPr>
+      <w:r>
+        <w:rPr>
+          <w:sz w:val="26"/>
+          <w:szCs w:val="24"/>
+          <w:lang w:val="en-US"/>
+        </w:rPr>
+        <w:t xml:space="preserve">perform() </w:t>
+      </w:r>
+      <w:r>
+        <w:rPr>
+          <w:sz w:val="26"/>
+          <w:szCs w:val="24"/>
+          <w:lang w:val="en-US"/>
+        </w:rPr>
+        <w:sym w:font="Wingdings" w:char="F0E0"/>
+      </w:r>
+      <w:r>
+        <w:rPr>
+          <w:sz w:val="26"/>
+          <w:szCs w:val="24"/>
+          <w:lang w:val="en-US"/>
+        </w:rPr>
+        <w:t xml:space="preserve"> </w:t>
+      </w:r>
+      <w:r>
+        <w:rPr>
+          <w:sz w:val="26"/>
+          <w:szCs w:val="24"/>
+          <w:lang w:val="en-US"/>
+        </w:rPr>
+        <w:t>Used to perform any action. Unless you are not calling this method, the said action (like hover, click, right click, double click, drag and drop) will not perform.</w:t>
+      </w:r>
+    </w:p>
+    <w:p>
+      <w:pPr>
+        <w:pStyle w:val="ListParagraph"/>
+        <w:numPr>
+          <w:ilvl w:val="0"/>
+          <w:numId w:val="28"/>
+        </w:numPr>
+        <w:rPr>
+          <w:sz w:val="26"/>
+          <w:szCs w:val="24"/>
+          <w:lang w:val="en-US"/>
+        </w:rPr>
+      </w:pPr>
+      <w:r>
+        <w:rPr>
+          <w:sz w:val="26"/>
+          <w:szCs w:val="24"/>
+          <w:lang w:val="en-US"/>
+        </w:rPr>
+        <w:t xml:space="preserve">contextClick() </w:t>
+      </w:r>
+      <w:r>
+        <w:rPr>
+          <w:sz w:val="26"/>
+          <w:szCs w:val="24"/>
+          <w:lang w:val="en-US"/>
+        </w:rPr>
+        <w:sym w:font="Wingdings" w:char="F0E0"/>
+      </w:r>
+      <w:r>
+        <w:rPr>
+          <w:sz w:val="26"/>
+          <w:szCs w:val="24"/>
+          <w:lang w:val="en-US"/>
+        </w:rPr>
+        <w:t xml:space="preserve"> Will do the right click on any control</w:t>
+      </w:r>
+      <w:r>
+        <w:rPr>
+          <w:sz w:val="26"/>
+          <w:szCs w:val="24"/>
+          <w:lang w:val="en-US"/>
+        </w:rPr>
+        <w:t>.</w:t>
+      </w:r>
+    </w:p>
+    <w:p>
+      <w:pPr>
+        <w:pStyle w:val="ListParagraph"/>
+        <w:numPr>
+          <w:ilvl w:val="0"/>
+          <w:numId w:val="28"/>
+        </w:numPr>
+        <w:rPr>
+          <w:sz w:val="26"/>
+          <w:szCs w:val="24"/>
+          <w:lang w:val="en-US"/>
+        </w:rPr>
+      </w:pPr>
+      <w:r>
+        <w:rPr>
+          <w:sz w:val="26"/>
+          <w:szCs w:val="24"/>
+          <w:lang w:val="en-US"/>
+        </w:rPr>
+        <w:t xml:space="preserve">doubleClick() </w:t>
+      </w:r>
+      <w:r>
+        <w:rPr>
+          <w:sz w:val="26"/>
+          <w:szCs w:val="24"/>
+          <w:lang w:val="en-US"/>
+        </w:rPr>
+        <w:sym w:font="Wingdings" w:char="F0E0"/>
+      </w:r>
+      <w:r>
+        <w:rPr>
+          <w:sz w:val="26"/>
+          <w:szCs w:val="24"/>
+          <w:lang w:val="en-US"/>
+        </w:rPr>
+        <w:t xml:space="preserve"> </w:t>
+      </w:r>
     </w:p>
     <w:sectPr>
       <w:pgSz w:w="11906" w:h="16838"/>
@@ -7441,6 +7645,95 @@
     </w:lvl>
   </w:abstractNum>
   <w:abstractNum w:abstractNumId="8">
+    <w:nsid w:val="1A304E32"/>
+    <w:multiLevelType w:val="hybridMultilevel"/>
+    <w:tmpl w:val="C6181F12"/>
+    <w:lvl w:ilvl="0" w:tplc="4009000F">
+      <w:start w:val="1"/>
+      <w:numFmt w:val="decimal"/>
+      <w:lvlText w:val="%1."/>
+      <w:lvlJc w:val="left"/>
+      <w:pPr>
+        <w:ind w:left="720" w:hanging="360"/>
+      </w:pPr>
+      <w:rPr>
+        <w:rFonts w:hint="default"/>
+      </w:rPr>
+    </w:lvl>
+    <w:lvl w:ilvl="1" w:tplc="40090019" w:tentative="1">
+      <w:start w:val="1"/>
+      <w:numFmt w:val="lowerLetter"/>
+      <w:lvlText w:val="%2."/>
+      <w:lvlJc w:val="left"/>
+      <w:pPr>
+        <w:ind w:left="1440" w:hanging="360"/>
+      </w:pPr>
+    </w:lvl>
+    <w:lvl w:ilvl="2" w:tplc="4009001B" w:tentative="1">
+      <w:start w:val="1"/>
+      <w:numFmt w:val="lowerRoman"/>
+      <w:lvlText w:val="%3."/>
+      <w:lvlJc w:val="right"/>
+      <w:pPr>
+        <w:ind w:left="2160" w:hanging="180"/>
+      </w:pPr>
+    </w:lvl>
+    <w:lvl w:ilvl="3" w:tplc="4009000F" w:tentative="1">
+      <w:start w:val="1"/>
+      <w:numFmt w:val="decimal"/>
+      <w:lvlText w:val="%4."/>
+      <w:lvlJc w:val="left"/>
+      <w:pPr>
+        <w:ind w:left="2880" w:hanging="360"/>
+      </w:pPr>
+    </w:lvl>
+    <w:lvl w:ilvl="4" w:tplc="40090019" w:tentative="1">
+      <w:start w:val="1"/>
+      <w:numFmt w:val="lowerLetter"/>
+      <w:lvlText w:val="%5."/>
+      <w:lvlJc w:val="left"/>
+      <w:pPr>
+        <w:ind w:left="3600" w:hanging="360"/>
+      </w:pPr>
+    </w:lvl>
+    <w:lvl w:ilvl="5" w:tplc="4009001B" w:tentative="1">
+      <w:start w:val="1"/>
+      <w:numFmt w:val="lowerRoman"/>
+      <w:lvlText w:val="%6."/>
+      <w:lvlJc w:val="right"/>
+      <w:pPr>
+        <w:ind w:left="4320" w:hanging="180"/>
+      </w:pPr>
+    </w:lvl>
+    <w:lvl w:ilvl="6" w:tplc="4009000F" w:tentative="1">
+      <w:start w:val="1"/>
+      <w:numFmt w:val="decimal"/>
+      <w:lvlText w:val="%7."/>
+      <w:lvlJc w:val="left"/>
+      <w:pPr>
+        <w:ind w:left="5040" w:hanging="360"/>
+      </w:pPr>
+    </w:lvl>
+    <w:lvl w:ilvl="7" w:tplc="40090019" w:tentative="1">
+      <w:start w:val="1"/>
+      <w:numFmt w:val="lowerLetter"/>
+      <w:lvlText w:val="%8."/>
+      <w:lvlJc w:val="left"/>
+      <w:pPr>
+        <w:ind w:left="5760" w:hanging="360"/>
+      </w:pPr>
+    </w:lvl>
+    <w:lvl w:ilvl="8" w:tplc="4009001B" w:tentative="1">
+      <w:start w:val="1"/>
+      <w:numFmt w:val="lowerRoman"/>
+      <w:lvlText w:val="%9."/>
+      <w:lvlJc w:val="right"/>
+      <w:pPr>
+        <w:ind w:left="6480" w:hanging="180"/>
+      </w:pPr>
+    </w:lvl>
+  </w:abstractNum>
+  <w:abstractNum w:abstractNumId="9">
     <w:nsid w:val="1F9E1E48"/>
     <w:multiLevelType w:val="hybridMultilevel"/>
     <w:tmpl w:val="C7582CDC"/>
@@ -7553,7 +7846,7 @@
       </w:rPr>
     </w:lvl>
   </w:abstractNum>
-  <w:abstractNum w:abstractNumId="9">
+  <w:abstractNum w:abstractNumId="10">
     <w:nsid w:val="203C513C"/>
     <w:multiLevelType w:val="hybridMultilevel"/>
     <w:tmpl w:val="8AB4A5AE"/>
@@ -7642,7 +7935,7 @@
       </w:pPr>
     </w:lvl>
   </w:abstractNum>
-  <w:abstractNum w:abstractNumId="10">
+  <w:abstractNum w:abstractNumId="11">
     <w:nsid w:val="20F05ACF"/>
     <w:multiLevelType w:val="hybridMultilevel"/>
     <w:tmpl w:val="4C5A6C62"/>
@@ -7731,7 +8024,7 @@
       </w:pPr>
     </w:lvl>
   </w:abstractNum>
-  <w:abstractNum w:abstractNumId="11">
+  <w:abstractNum w:abstractNumId="12">
     <w:nsid w:val="2479664E"/>
     <w:multiLevelType w:val="hybridMultilevel"/>
     <w:tmpl w:val="14A418A0"/>
@@ -7820,7 +8113,7 @@
       </w:pPr>
     </w:lvl>
   </w:abstractNum>
-  <w:abstractNum w:abstractNumId="12">
+  <w:abstractNum w:abstractNumId="13">
     <w:nsid w:val="2E0E1364"/>
     <w:multiLevelType w:val="hybridMultilevel"/>
     <w:tmpl w:val="40CC5AC4"/>
@@ -7909,7 +8202,7 @@
       </w:pPr>
     </w:lvl>
   </w:abstractNum>
-  <w:abstractNum w:abstractNumId="13">
+  <w:abstractNum w:abstractNumId="14">
     <w:nsid w:val="360C28AB"/>
     <w:multiLevelType w:val="hybridMultilevel"/>
     <w:tmpl w:val="D910DDB6"/>
@@ -8022,7 +8315,7 @@
       </w:rPr>
     </w:lvl>
   </w:abstractNum>
-  <w:abstractNum w:abstractNumId="14">
+  <w:abstractNum w:abstractNumId="15">
     <w:nsid w:val="38846546"/>
     <w:multiLevelType w:val="hybridMultilevel"/>
     <w:tmpl w:val="86F02860"/>
@@ -8111,7 +8404,7 @@
       </w:pPr>
     </w:lvl>
   </w:abstractNum>
-  <w:abstractNum w:abstractNumId="15">
+  <w:abstractNum w:abstractNumId="16">
     <w:nsid w:val="39C45A17"/>
     <w:multiLevelType w:val="hybridMultilevel"/>
     <w:tmpl w:val="7BCE0EDE"/>
@@ -8200,7 +8493,7 @@
       </w:pPr>
     </w:lvl>
   </w:abstractNum>
-  <w:abstractNum w:abstractNumId="16">
+  <w:abstractNum w:abstractNumId="17">
     <w:nsid w:val="3C0D7148"/>
     <w:multiLevelType w:val="hybridMultilevel"/>
     <w:tmpl w:val="61EAC19E"/>
@@ -8289,7 +8582,7 @@
       </w:pPr>
     </w:lvl>
   </w:abstractNum>
-  <w:abstractNum w:abstractNumId="17">
+  <w:abstractNum w:abstractNumId="18">
     <w:nsid w:val="3EC7092E"/>
     <w:multiLevelType w:val="hybridMultilevel"/>
     <w:tmpl w:val="BEB82898"/>
@@ -8378,7 +8671,7 @@
       </w:pPr>
     </w:lvl>
   </w:abstractNum>
-  <w:abstractNum w:abstractNumId="18">
+  <w:abstractNum w:abstractNumId="19">
     <w:nsid w:val="3FEE48BD"/>
     <w:multiLevelType w:val="hybridMultilevel"/>
     <w:tmpl w:val="7D7C81C4"/>
@@ -8467,7 +8760,7 @@
       </w:pPr>
     </w:lvl>
   </w:abstractNum>
-  <w:abstractNum w:abstractNumId="19">
+  <w:abstractNum w:abstractNumId="20">
     <w:nsid w:val="403F7638"/>
     <w:multiLevelType w:val="hybridMultilevel"/>
     <w:tmpl w:val="49801E86"/>
@@ -8556,7 +8849,7 @@
       </w:pPr>
     </w:lvl>
   </w:abstractNum>
-  <w:abstractNum w:abstractNumId="20">
+  <w:abstractNum w:abstractNumId="21">
     <w:nsid w:val="4EBA6DD1"/>
     <w:multiLevelType w:val="hybridMultilevel"/>
     <w:tmpl w:val="60C02E0C"/>
@@ -8645,7 +8938,7 @@
       </w:pPr>
     </w:lvl>
   </w:abstractNum>
-  <w:abstractNum w:abstractNumId="21">
+  <w:abstractNum w:abstractNumId="22">
     <w:nsid w:val="529E3796"/>
     <w:multiLevelType w:val="hybridMultilevel"/>
     <w:tmpl w:val="AB520516"/>
@@ -8734,7 +9027,7 @@
       </w:pPr>
     </w:lvl>
   </w:abstractNum>
-  <w:abstractNum w:abstractNumId="22">
+  <w:abstractNum w:abstractNumId="23">
     <w:nsid w:val="55816A8D"/>
     <w:multiLevelType w:val="hybridMultilevel"/>
     <w:tmpl w:val="1200EDB6"/>
@@ -8823,7 +9116,7 @@
       </w:pPr>
     </w:lvl>
   </w:abstractNum>
-  <w:abstractNum w:abstractNumId="23">
+  <w:abstractNum w:abstractNumId="24">
     <w:nsid w:val="60166BF6"/>
     <w:multiLevelType w:val="hybridMultilevel"/>
     <w:tmpl w:val="1A2C61F4"/>
@@ -8936,7 +9229,7 @@
       </w:rPr>
     </w:lvl>
   </w:abstractNum>
-  <w:abstractNum w:abstractNumId="24">
+  <w:abstractNum w:abstractNumId="25">
     <w:nsid w:val="669D6C41"/>
     <w:multiLevelType w:val="hybridMultilevel"/>
     <w:tmpl w:val="9E22EC66"/>
@@ -9049,7 +9342,7 @@
       </w:rPr>
     </w:lvl>
   </w:abstractNum>
-  <w:abstractNum w:abstractNumId="25">
+  <w:abstractNum w:abstractNumId="26">
     <w:nsid w:val="6DE40AAE"/>
     <w:multiLevelType w:val="hybridMultilevel"/>
     <w:tmpl w:val="8A1CE40E"/>
@@ -9138,7 +9431,7 @@
       </w:pPr>
     </w:lvl>
   </w:abstractNum>
-  <w:abstractNum w:abstractNumId="26">
+  <w:abstractNum w:abstractNumId="27">
     <w:nsid w:val="771F358C"/>
     <w:multiLevelType w:val="hybridMultilevel"/>
     <w:tmpl w:val="08E0D094"/>
@@ -9228,10 +9521,10 @@
     </w:lvl>
   </w:abstractNum>
   <w:num w:numId="1">
-    <w:abstractNumId w:val="15"/>
+    <w:abstractNumId w:val="16"/>
   </w:num>
   <w:num w:numId="2">
-    <w:abstractNumId w:val="17"/>
+    <w:abstractNumId w:val="18"/>
   </w:num>
   <w:num w:numId="3">
     <w:abstractNumId w:val="0"/>
@@ -9240,28 +9533,28 @@
     <w:abstractNumId w:val="7"/>
   </w:num>
   <w:num w:numId="5">
-    <w:abstractNumId w:val="19"/>
+    <w:abstractNumId w:val="20"/>
   </w:num>
   <w:num w:numId="6">
-    <w:abstractNumId w:val="10"/>
+    <w:abstractNumId w:val="11"/>
   </w:num>
   <w:num w:numId="7">
     <w:abstractNumId w:val="5"/>
   </w:num>
   <w:num w:numId="8">
-    <w:abstractNumId w:val="24"/>
+    <w:abstractNumId w:val="25"/>
   </w:num>
   <w:num w:numId="9">
-    <w:abstractNumId w:val="26"/>
+    <w:abstractNumId w:val="27"/>
   </w:num>
   <w:num w:numId="10">
-    <w:abstractNumId w:val="12"/>
+    <w:abstractNumId w:val="13"/>
   </w:num>
   <w:num w:numId="11">
-    <w:abstractNumId w:val="18"/>
+    <w:abstractNumId w:val="19"/>
   </w:num>
   <w:num w:numId="12">
-    <w:abstractNumId w:val="16"/>
+    <w:abstractNumId w:val="17"/>
   </w:num>
   <w:num w:numId="13">
     <w:abstractNumId w:val="4"/>
@@ -9270,43 +9563,46 @@
     <w:abstractNumId w:val="6"/>
   </w:num>
   <w:num w:numId="15">
-    <w:abstractNumId w:val="25"/>
+    <w:abstractNumId w:val="26"/>
   </w:num>
   <w:num w:numId="16">
     <w:abstractNumId w:val="2"/>
   </w:num>
   <w:num w:numId="17">
-    <w:abstractNumId w:val="21"/>
+    <w:abstractNumId w:val="22"/>
   </w:num>
   <w:num w:numId="18">
-    <w:abstractNumId w:val="23"/>
+    <w:abstractNumId w:val="24"/>
   </w:num>
   <w:num w:numId="19">
-    <w:abstractNumId w:val="11"/>
+    <w:abstractNumId w:val="12"/>
   </w:num>
   <w:num w:numId="20">
-    <w:abstractNumId w:val="22"/>
+    <w:abstractNumId w:val="23"/>
   </w:num>
   <w:num w:numId="21">
     <w:abstractNumId w:val="1"/>
   </w:num>
   <w:num w:numId="22">
+    <w:abstractNumId w:val="15"/>
+  </w:num>
+  <w:num w:numId="23">
     <w:abstractNumId w:val="14"/>
   </w:num>
-  <w:num w:numId="23">
-    <w:abstractNumId w:val="13"/>
-  </w:num>
   <w:num w:numId="24">
-    <w:abstractNumId w:val="8"/>
+    <w:abstractNumId w:val="9"/>
   </w:num>
   <w:num w:numId="25">
-    <w:abstractNumId w:val="20"/>
+    <w:abstractNumId w:val="21"/>
   </w:num>
   <w:num w:numId="26">
     <w:abstractNumId w:val="3"/>
   </w:num>
   <w:num w:numId="27">
-    <w:abstractNumId w:val="9"/>
+    <w:abstractNumId w:val="10"/>
+  </w:num>
+  <w:num w:numId="28">
+    <w:abstractNumId w:val="8"/>
   </w:num>
 </w:numbering>
 </file>

</xml_diff>

<commit_message>
Date: 12 Dec 2025
</commit_message>
<xml_diff>
--- a/Notes_Selenium_15.docx
+++ b/Notes_Selenium_15.docx
@@ -3115,8 +3115,6 @@
         </w:rPr>
         <w:t>Your control may be inside frame</w:t>
       </w:r>
-      <w:bookmarkStart w:id="0" w:name="_GoBack"/>
-      <w:bookmarkEnd w:id="0"/>
     </w:p>
     <w:p>
       <w:pPr>
@@ -6848,6 +6846,723 @@
         <w:t xml:space="preserve"> </w:t>
       </w:r>
     </w:p>
+    <w:p>
+      <w:pPr>
+        <w:rPr>
+          <w:sz w:val="26"/>
+          <w:szCs w:val="24"/>
+          <w:lang w:val="en-US"/>
+        </w:rPr>
+      </w:pPr>
+      <w:r>
+        <w:rPr>
+          <w:sz w:val="26"/>
+          <w:szCs w:val="24"/>
+          <w:lang w:val="en-US"/>
+        </w:rPr>
+        <w:br w:type="page"/>
+      </w:r>
+    </w:p>
+    <w:p>
+      <w:pPr>
+        <w:rPr>
+          <w:b/>
+          <w:bCs/>
+          <w:sz w:val="26"/>
+          <w:szCs w:val="24"/>
+          <w:lang w:val="en-US"/>
+        </w:rPr>
+      </w:pPr>
+      <w:r>
+        <w:rPr>
+          <w:b/>
+          <w:bCs/>
+          <w:sz w:val="26"/>
+          <w:szCs w:val="24"/>
+          <w:lang w:val="en-US"/>
+        </w:rPr>
+        <w:lastRenderedPageBreak/>
+        <w:t>TestNG (Test Next Generation)</w:t>
+      </w:r>
+    </w:p>
+    <w:p>
+      <w:pPr>
+        <w:rPr>
+          <w:sz w:val="26"/>
+          <w:szCs w:val="24"/>
+          <w:lang w:val="en-US"/>
+        </w:rPr>
+      </w:pPr>
+      <w:r>
+        <w:rPr>
+          <w:sz w:val="26"/>
+          <w:szCs w:val="24"/>
+          <w:lang w:val="en-US"/>
+        </w:rPr>
+        <w:t>It is the framework which will make your automation testing easier.</w:t>
+      </w:r>
+    </w:p>
+    <w:p>
+      <w:pPr>
+        <w:rPr>
+          <w:sz w:val="26"/>
+          <w:szCs w:val="24"/>
+          <w:lang w:val="en-US"/>
+        </w:rPr>
+      </w:pPr>
+      <w:r>
+        <w:rPr>
+          <w:b/>
+          <w:bCs/>
+          <w:sz w:val="26"/>
+          <w:szCs w:val="24"/>
+          <w:lang w:val="en-US"/>
+        </w:rPr>
+        <w:t xml:space="preserve">Framework </w:t>
+      </w:r>
+      <w:r>
+        <w:rPr>
+          <w:b/>
+          <w:bCs/>
+          <w:sz w:val="26"/>
+          <w:szCs w:val="24"/>
+          <w:lang w:val="en-US"/>
+        </w:rPr>
+        <w:sym w:font="Wingdings" w:char="F0E0"/>
+      </w:r>
+      <w:r>
+        <w:rPr>
+          <w:b/>
+          <w:bCs/>
+          <w:sz w:val="26"/>
+          <w:szCs w:val="24"/>
+          <w:lang w:val="en-US"/>
+        </w:rPr>
+        <w:t xml:space="preserve"> </w:t>
+      </w:r>
+      <w:r>
+        <w:rPr>
+          <w:sz w:val="26"/>
+          <w:szCs w:val="24"/>
+          <w:lang w:val="en-US"/>
+        </w:rPr>
+        <w:t>Set of rules, guidelines, standard practices for automation testing.</w:t>
+      </w:r>
+    </w:p>
+    <w:p>
+      <w:pPr>
+        <w:rPr>
+          <w:sz w:val="26"/>
+          <w:szCs w:val="24"/>
+          <w:lang w:val="en-US"/>
+        </w:rPr>
+      </w:pPr>
+    </w:p>
+    <w:p>
+      <w:pPr>
+        <w:rPr>
+          <w:b/>
+          <w:bCs/>
+          <w:sz w:val="26"/>
+          <w:szCs w:val="24"/>
+          <w:lang w:val="en-US"/>
+        </w:rPr>
+      </w:pPr>
+      <w:r>
+        <w:rPr>
+          <w:b/>
+          <w:bCs/>
+          <w:sz w:val="26"/>
+          <w:szCs w:val="24"/>
+          <w:lang w:val="en-US"/>
+        </w:rPr>
+        <w:t>Advantages</w:t>
+      </w:r>
+    </w:p>
+    <w:p>
+      <w:pPr>
+        <w:pStyle w:val="ListParagraph"/>
+        <w:numPr>
+          <w:ilvl w:val="0"/>
+          <w:numId w:val="29"/>
+        </w:numPr>
+        <w:rPr>
+          <w:sz w:val="26"/>
+          <w:szCs w:val="24"/>
+          <w:lang w:val="en-US"/>
+        </w:rPr>
+      </w:pPr>
+      <w:r>
+        <w:rPr>
+          <w:sz w:val="26"/>
+          <w:szCs w:val="24"/>
+          <w:lang w:val="en-US"/>
+        </w:rPr>
+        <w:t>Collection of multiple tests</w:t>
+      </w:r>
+    </w:p>
+    <w:p>
+      <w:pPr>
+        <w:pStyle w:val="ListParagraph"/>
+        <w:numPr>
+          <w:ilvl w:val="0"/>
+          <w:numId w:val="29"/>
+        </w:numPr>
+        <w:rPr>
+          <w:sz w:val="26"/>
+          <w:szCs w:val="24"/>
+          <w:lang w:val="en-US"/>
+        </w:rPr>
+      </w:pPr>
+      <w:r>
+        <w:rPr>
+          <w:sz w:val="26"/>
+          <w:szCs w:val="24"/>
+          <w:lang w:val="en-US"/>
+        </w:rPr>
+        <w:t>Reduces the code</w:t>
+      </w:r>
+    </w:p>
+    <w:p>
+      <w:pPr>
+        <w:pStyle w:val="ListParagraph"/>
+        <w:numPr>
+          <w:ilvl w:val="0"/>
+          <w:numId w:val="29"/>
+        </w:numPr>
+        <w:rPr>
+          <w:sz w:val="26"/>
+          <w:szCs w:val="24"/>
+          <w:lang w:val="en-US"/>
+        </w:rPr>
+      </w:pPr>
+      <w:r>
+        <w:rPr>
+          <w:sz w:val="26"/>
+          <w:szCs w:val="24"/>
+          <w:lang w:val="en-US"/>
+        </w:rPr>
+        <w:t>Execute or skip single / multiple tests</w:t>
+      </w:r>
+    </w:p>
+    <w:p>
+      <w:pPr>
+        <w:pStyle w:val="ListParagraph"/>
+        <w:numPr>
+          <w:ilvl w:val="0"/>
+          <w:numId w:val="29"/>
+        </w:numPr>
+        <w:rPr>
+          <w:sz w:val="26"/>
+          <w:szCs w:val="24"/>
+          <w:lang w:val="en-US"/>
+        </w:rPr>
+      </w:pPr>
+      <w:r>
+        <w:rPr>
+          <w:sz w:val="26"/>
+          <w:szCs w:val="24"/>
+          <w:lang w:val="en-US"/>
+        </w:rPr>
+        <w:t xml:space="preserve"> </w:t>
+      </w:r>
+      <w:r>
+        <w:rPr>
+          <w:sz w:val="26"/>
+          <w:szCs w:val="24"/>
+          <w:lang w:val="en-US"/>
+        </w:rPr>
+        <w:t>Set the priority to tests</w:t>
+      </w:r>
+    </w:p>
+    <w:p>
+      <w:pPr>
+        <w:pStyle w:val="ListParagraph"/>
+        <w:numPr>
+          <w:ilvl w:val="0"/>
+          <w:numId w:val="29"/>
+        </w:numPr>
+        <w:rPr>
+          <w:sz w:val="26"/>
+          <w:szCs w:val="24"/>
+          <w:lang w:val="en-US"/>
+        </w:rPr>
+      </w:pPr>
+      <w:r>
+        <w:rPr>
+          <w:sz w:val="26"/>
+          <w:szCs w:val="24"/>
+          <w:lang w:val="en-US"/>
+        </w:rPr>
+        <w:t>Automated report</w:t>
+      </w:r>
+    </w:p>
+    <w:p>
+      <w:pPr>
+        <w:pStyle w:val="ListParagraph"/>
+        <w:numPr>
+          <w:ilvl w:val="1"/>
+          <w:numId w:val="29"/>
+        </w:numPr>
+        <w:rPr>
+          <w:sz w:val="26"/>
+          <w:szCs w:val="24"/>
+          <w:lang w:val="en-US"/>
+        </w:rPr>
+      </w:pPr>
+      <w:r>
+        <w:rPr>
+          <w:sz w:val="26"/>
+          <w:szCs w:val="24"/>
+          <w:lang w:val="en-US"/>
+        </w:rPr>
+        <w:t>Normal Report</w:t>
+      </w:r>
+    </w:p>
+    <w:p>
+      <w:pPr>
+        <w:pStyle w:val="ListParagraph"/>
+        <w:numPr>
+          <w:ilvl w:val="1"/>
+          <w:numId w:val="29"/>
+        </w:numPr>
+        <w:rPr>
+          <w:sz w:val="26"/>
+          <w:szCs w:val="24"/>
+          <w:lang w:val="en-US"/>
+        </w:rPr>
+      </w:pPr>
+      <w:r>
+        <w:rPr>
+          <w:sz w:val="26"/>
+          <w:szCs w:val="24"/>
+          <w:lang w:val="en-US"/>
+        </w:rPr>
+        <w:t>HTML Report</w:t>
+      </w:r>
+    </w:p>
+    <w:p>
+      <w:pPr>
+        <w:pStyle w:val="ListParagraph"/>
+        <w:numPr>
+          <w:ilvl w:val="0"/>
+          <w:numId w:val="29"/>
+        </w:numPr>
+        <w:rPr>
+          <w:sz w:val="26"/>
+          <w:szCs w:val="24"/>
+          <w:lang w:val="en-US"/>
+        </w:rPr>
+      </w:pPr>
+      <w:r>
+        <w:rPr>
+          <w:sz w:val="26"/>
+          <w:szCs w:val="24"/>
+          <w:lang w:val="en-US"/>
+        </w:rPr>
+        <w:t>Uses annotations</w:t>
+      </w:r>
+    </w:p>
+    <w:p>
+      <w:pPr>
+        <w:pStyle w:val="ListParagraph"/>
+        <w:numPr>
+          <w:ilvl w:val="1"/>
+          <w:numId w:val="29"/>
+        </w:numPr>
+        <w:rPr>
+          <w:sz w:val="26"/>
+          <w:szCs w:val="24"/>
+          <w:lang w:val="en-US"/>
+        </w:rPr>
+      </w:pPr>
+      <w:r>
+        <w:rPr>
+          <w:sz w:val="26"/>
+          <w:szCs w:val="24"/>
+          <w:lang w:val="en-US"/>
+        </w:rPr>
+        <w:t>@Test</w:t>
+      </w:r>
+    </w:p>
+    <w:p>
+      <w:pPr>
+        <w:pStyle w:val="ListParagraph"/>
+        <w:numPr>
+          <w:ilvl w:val="1"/>
+          <w:numId w:val="29"/>
+        </w:numPr>
+        <w:rPr>
+          <w:sz w:val="26"/>
+          <w:szCs w:val="24"/>
+          <w:lang w:val="en-US"/>
+        </w:rPr>
+      </w:pPr>
+      <w:r>
+        <w:rPr>
+          <w:sz w:val="26"/>
+          <w:szCs w:val="24"/>
+          <w:lang w:val="en-US"/>
+        </w:rPr>
+        <w:t>@BeforeTest</w:t>
+      </w:r>
+    </w:p>
+    <w:p>
+      <w:pPr>
+        <w:pStyle w:val="ListParagraph"/>
+        <w:numPr>
+          <w:ilvl w:val="1"/>
+          <w:numId w:val="29"/>
+        </w:numPr>
+        <w:rPr>
+          <w:sz w:val="26"/>
+          <w:szCs w:val="24"/>
+          <w:lang w:val="en-US"/>
+        </w:rPr>
+      </w:pPr>
+      <w:r>
+        <w:rPr>
+          <w:sz w:val="26"/>
+          <w:szCs w:val="24"/>
+          <w:lang w:val="en-US"/>
+        </w:rPr>
+        <w:t>@AfterTest</w:t>
+      </w:r>
+    </w:p>
+    <w:p>
+      <w:pPr>
+        <w:pStyle w:val="ListParagraph"/>
+        <w:numPr>
+          <w:ilvl w:val="1"/>
+          <w:numId w:val="29"/>
+        </w:numPr>
+        <w:rPr>
+          <w:sz w:val="26"/>
+          <w:szCs w:val="24"/>
+          <w:lang w:val="en-US"/>
+        </w:rPr>
+      </w:pPr>
+      <w:r>
+        <w:rPr>
+          <w:sz w:val="26"/>
+          <w:szCs w:val="24"/>
+          <w:lang w:val="en-US"/>
+        </w:rPr>
+        <w:t>@BeforeMethod</w:t>
+      </w:r>
+    </w:p>
+    <w:p>
+      <w:pPr>
+        <w:pStyle w:val="ListParagraph"/>
+        <w:numPr>
+          <w:ilvl w:val="1"/>
+          <w:numId w:val="29"/>
+        </w:numPr>
+        <w:rPr>
+          <w:sz w:val="26"/>
+          <w:szCs w:val="24"/>
+          <w:lang w:val="en-US"/>
+        </w:rPr>
+      </w:pPr>
+      <w:r>
+        <w:rPr>
+          <w:sz w:val="26"/>
+          <w:szCs w:val="24"/>
+          <w:lang w:val="en-US"/>
+        </w:rPr>
+        <w:t>@AfterMethod</w:t>
+      </w:r>
+    </w:p>
+    <w:p>
+      <w:pPr>
+        <w:pStyle w:val="ListParagraph"/>
+        <w:numPr>
+          <w:ilvl w:val="1"/>
+          <w:numId w:val="29"/>
+        </w:numPr>
+        <w:rPr>
+          <w:sz w:val="26"/>
+          <w:szCs w:val="24"/>
+          <w:lang w:val="en-US"/>
+        </w:rPr>
+      </w:pPr>
+      <w:r>
+        <w:rPr>
+          <w:sz w:val="26"/>
+          <w:szCs w:val="24"/>
+          <w:lang w:val="en-US"/>
+        </w:rPr>
+        <w:t>@DataProvider</w:t>
+      </w:r>
+    </w:p>
+    <w:p>
+      <w:pPr>
+        <w:pStyle w:val="ListParagraph"/>
+        <w:numPr>
+          <w:ilvl w:val="1"/>
+          <w:numId w:val="29"/>
+        </w:numPr>
+        <w:rPr>
+          <w:sz w:val="26"/>
+          <w:szCs w:val="24"/>
+          <w:lang w:val="en-US"/>
+        </w:rPr>
+      </w:pPr>
+      <w:r>
+        <w:rPr>
+          <w:sz w:val="26"/>
+          <w:szCs w:val="24"/>
+          <w:lang w:val="en-US"/>
+        </w:rPr>
+        <w:t>@Parameters</w:t>
+      </w:r>
+    </w:p>
+    <w:p>
+      <w:pPr>
+        <w:pStyle w:val="ListParagraph"/>
+        <w:numPr>
+          <w:ilvl w:val="0"/>
+          <w:numId w:val="29"/>
+        </w:numPr>
+        <w:rPr>
+          <w:sz w:val="26"/>
+          <w:szCs w:val="24"/>
+          <w:lang w:val="en-US"/>
+        </w:rPr>
+      </w:pPr>
+      <w:r>
+        <w:rPr>
+          <w:sz w:val="26"/>
+          <w:szCs w:val="24"/>
+          <w:lang w:val="en-US"/>
+        </w:rPr>
+        <w:t>Parameterization</w:t>
+      </w:r>
+    </w:p>
+    <w:p>
+      <w:pPr>
+        <w:pStyle w:val="ListParagraph"/>
+        <w:numPr>
+          <w:ilvl w:val="0"/>
+          <w:numId w:val="29"/>
+        </w:numPr>
+        <w:rPr>
+          <w:sz w:val="26"/>
+          <w:szCs w:val="24"/>
+          <w:lang w:val="en-US"/>
+        </w:rPr>
+      </w:pPr>
+      <w:r>
+        <w:rPr>
+          <w:sz w:val="26"/>
+          <w:szCs w:val="24"/>
+          <w:lang w:val="en-US"/>
+        </w:rPr>
+        <w:t>Execute tests in group</w:t>
+      </w:r>
+    </w:p>
+    <w:p>
+      <w:pPr>
+        <w:pStyle w:val="ListParagraph"/>
+        <w:numPr>
+          <w:ilvl w:val="0"/>
+          <w:numId w:val="29"/>
+        </w:numPr>
+        <w:rPr>
+          <w:sz w:val="26"/>
+          <w:szCs w:val="24"/>
+          <w:lang w:val="en-US"/>
+        </w:rPr>
+      </w:pPr>
+      <w:r>
+        <w:rPr>
+          <w:sz w:val="26"/>
+          <w:szCs w:val="24"/>
+          <w:lang w:val="en-US"/>
+        </w:rPr>
+        <w:t>Data Driven Testing</w:t>
+      </w:r>
+    </w:p>
+    <w:p>
+      <w:pPr>
+        <w:pStyle w:val="ListParagraph"/>
+        <w:numPr>
+          <w:ilvl w:val="0"/>
+          <w:numId w:val="29"/>
+        </w:numPr>
+        <w:rPr>
+          <w:sz w:val="26"/>
+          <w:szCs w:val="24"/>
+          <w:lang w:val="en-US"/>
+        </w:rPr>
+      </w:pPr>
+      <w:r>
+        <w:rPr>
+          <w:sz w:val="26"/>
+          <w:szCs w:val="24"/>
+          <w:lang w:val="en-US"/>
+        </w:rPr>
+        <w:t>Can implement different types of framework</w:t>
+      </w:r>
+    </w:p>
+    <w:p>
+      <w:pPr>
+        <w:pStyle w:val="ListParagraph"/>
+        <w:numPr>
+          <w:ilvl w:val="1"/>
+          <w:numId w:val="29"/>
+        </w:numPr>
+        <w:rPr>
+          <w:sz w:val="26"/>
+          <w:szCs w:val="24"/>
+          <w:lang w:val="en-US"/>
+        </w:rPr>
+      </w:pPr>
+      <w:r>
+        <w:rPr>
+          <w:sz w:val="26"/>
+          <w:szCs w:val="24"/>
+          <w:lang w:val="en-US"/>
+        </w:rPr>
+        <w:t>Keyword Driven Framework</w:t>
+      </w:r>
+    </w:p>
+    <w:p>
+      <w:pPr>
+        <w:pStyle w:val="ListParagraph"/>
+        <w:numPr>
+          <w:ilvl w:val="1"/>
+          <w:numId w:val="29"/>
+        </w:numPr>
+        <w:rPr>
+          <w:sz w:val="26"/>
+          <w:szCs w:val="24"/>
+          <w:lang w:val="en-US"/>
+        </w:rPr>
+      </w:pPr>
+      <w:r>
+        <w:rPr>
+          <w:sz w:val="26"/>
+          <w:szCs w:val="24"/>
+          <w:lang w:val="en-US"/>
+        </w:rPr>
+        <w:t>Data Driven Framework</w:t>
+      </w:r>
+    </w:p>
+    <w:p>
+      <w:pPr>
+        <w:pStyle w:val="ListParagraph"/>
+        <w:numPr>
+          <w:ilvl w:val="1"/>
+          <w:numId w:val="29"/>
+        </w:numPr>
+        <w:rPr>
+          <w:sz w:val="26"/>
+          <w:szCs w:val="24"/>
+          <w:lang w:val="en-US"/>
+        </w:rPr>
+      </w:pPr>
+      <w:r>
+        <w:rPr>
+          <w:sz w:val="26"/>
+          <w:szCs w:val="24"/>
+          <w:lang w:val="en-US"/>
+        </w:rPr>
+        <w:t>Page Object Model</w:t>
+      </w:r>
+    </w:p>
+    <w:p>
+      <w:pPr>
+        <w:pStyle w:val="ListParagraph"/>
+        <w:numPr>
+          <w:ilvl w:val="1"/>
+          <w:numId w:val="29"/>
+        </w:numPr>
+        <w:rPr>
+          <w:sz w:val="26"/>
+          <w:szCs w:val="24"/>
+          <w:lang w:val="en-US"/>
+        </w:rPr>
+      </w:pPr>
+      <w:r>
+        <w:rPr>
+          <w:sz w:val="26"/>
+          <w:szCs w:val="24"/>
+          <w:lang w:val="en-US"/>
+        </w:rPr>
+        <w:t>Hybrid Framework</w:t>
+      </w:r>
+    </w:p>
+    <w:p>
+      <w:pPr>
+        <w:rPr>
+          <w:sz w:val="26"/>
+          <w:szCs w:val="24"/>
+          <w:lang w:val="en-US"/>
+        </w:rPr>
+      </w:pPr>
+    </w:p>
+    <w:p>
+      <w:pPr>
+        <w:rPr>
+          <w:b/>
+          <w:bCs/>
+          <w:sz w:val="26"/>
+          <w:szCs w:val="24"/>
+          <w:lang w:val="en-US"/>
+        </w:rPr>
+      </w:pPr>
+      <w:r>
+        <w:rPr>
+          <w:b/>
+          <w:bCs/>
+          <w:sz w:val="26"/>
+          <w:szCs w:val="24"/>
+          <w:lang w:val="en-US"/>
+        </w:rPr>
+        <w:t>Annotations</w:t>
+      </w:r>
+    </w:p>
+    <w:p>
+      <w:pPr>
+        <w:pStyle w:val="ListParagraph"/>
+        <w:numPr>
+          <w:ilvl w:val="0"/>
+          <w:numId w:val="30"/>
+        </w:numPr>
+        <w:rPr>
+          <w:sz w:val="26"/>
+          <w:szCs w:val="24"/>
+          <w:lang w:val="en-US"/>
+        </w:rPr>
+      </w:pPr>
+      <w:r>
+        <w:rPr>
+          <w:sz w:val="26"/>
+          <w:szCs w:val="24"/>
+          <w:lang w:val="en-US"/>
+        </w:rPr>
+        <w:t xml:space="preserve">@Test </w:t>
+      </w:r>
+      <w:r>
+        <w:rPr>
+          <w:sz w:val="26"/>
+          <w:szCs w:val="24"/>
+          <w:lang w:val="en-US"/>
+        </w:rPr>
+        <w:sym w:font="Wingdings" w:char="F0E0"/>
+      </w:r>
+      <w:r>
+        <w:rPr>
+          <w:sz w:val="26"/>
+          <w:szCs w:val="24"/>
+          <w:lang w:val="en-US"/>
+        </w:rPr>
+        <w:t xml:space="preserve"> This method is treated as test case</w:t>
+      </w:r>
+      <w:bookmarkStart w:id="0" w:name="_GoBack"/>
+      <w:bookmarkEnd w:id="0"/>
+    </w:p>
     <w:sectPr>
       <w:pgSz w:w="11906" w:h="16838"/>
       <w:pgMar w:top="1440" w:right="1440" w:bottom="1440" w:left="1440" w:header="708" w:footer="708" w:gutter="0"/>
@@ -8850,6 +9565,95 @@
     </w:lvl>
   </w:abstractNum>
   <w:abstractNum w:abstractNumId="21">
+    <w:nsid w:val="46A73B9B"/>
+    <w:multiLevelType w:val="hybridMultilevel"/>
+    <w:tmpl w:val="EAA08C1C"/>
+    <w:lvl w:ilvl="0" w:tplc="4009000F">
+      <w:start w:val="1"/>
+      <w:numFmt w:val="decimal"/>
+      <w:lvlText w:val="%1."/>
+      <w:lvlJc w:val="left"/>
+      <w:pPr>
+        <w:ind w:left="720" w:hanging="360"/>
+      </w:pPr>
+      <w:rPr>
+        <w:rFonts w:hint="default"/>
+      </w:rPr>
+    </w:lvl>
+    <w:lvl w:ilvl="1" w:tplc="40090019" w:tentative="1">
+      <w:start w:val="1"/>
+      <w:numFmt w:val="lowerLetter"/>
+      <w:lvlText w:val="%2."/>
+      <w:lvlJc w:val="left"/>
+      <w:pPr>
+        <w:ind w:left="1440" w:hanging="360"/>
+      </w:pPr>
+    </w:lvl>
+    <w:lvl w:ilvl="2" w:tplc="4009001B" w:tentative="1">
+      <w:start w:val="1"/>
+      <w:numFmt w:val="lowerRoman"/>
+      <w:lvlText w:val="%3."/>
+      <w:lvlJc w:val="right"/>
+      <w:pPr>
+        <w:ind w:left="2160" w:hanging="180"/>
+      </w:pPr>
+    </w:lvl>
+    <w:lvl w:ilvl="3" w:tplc="4009000F" w:tentative="1">
+      <w:start w:val="1"/>
+      <w:numFmt w:val="decimal"/>
+      <w:lvlText w:val="%4."/>
+      <w:lvlJc w:val="left"/>
+      <w:pPr>
+        <w:ind w:left="2880" w:hanging="360"/>
+      </w:pPr>
+    </w:lvl>
+    <w:lvl w:ilvl="4" w:tplc="40090019" w:tentative="1">
+      <w:start w:val="1"/>
+      <w:numFmt w:val="lowerLetter"/>
+      <w:lvlText w:val="%5."/>
+      <w:lvlJc w:val="left"/>
+      <w:pPr>
+        <w:ind w:left="3600" w:hanging="360"/>
+      </w:pPr>
+    </w:lvl>
+    <w:lvl w:ilvl="5" w:tplc="4009001B" w:tentative="1">
+      <w:start w:val="1"/>
+      <w:numFmt w:val="lowerRoman"/>
+      <w:lvlText w:val="%6."/>
+      <w:lvlJc w:val="right"/>
+      <w:pPr>
+        <w:ind w:left="4320" w:hanging="180"/>
+      </w:pPr>
+    </w:lvl>
+    <w:lvl w:ilvl="6" w:tplc="4009000F" w:tentative="1">
+      <w:start w:val="1"/>
+      <w:numFmt w:val="decimal"/>
+      <w:lvlText w:val="%7."/>
+      <w:lvlJc w:val="left"/>
+      <w:pPr>
+        <w:ind w:left="5040" w:hanging="360"/>
+      </w:pPr>
+    </w:lvl>
+    <w:lvl w:ilvl="7" w:tplc="40090019" w:tentative="1">
+      <w:start w:val="1"/>
+      <w:numFmt w:val="lowerLetter"/>
+      <w:lvlText w:val="%8."/>
+      <w:lvlJc w:val="left"/>
+      <w:pPr>
+        <w:ind w:left="5760" w:hanging="360"/>
+      </w:pPr>
+    </w:lvl>
+    <w:lvl w:ilvl="8" w:tplc="4009001B" w:tentative="1">
+      <w:start w:val="1"/>
+      <w:numFmt w:val="lowerRoman"/>
+      <w:lvlText w:val="%9."/>
+      <w:lvlJc w:val="right"/>
+      <w:pPr>
+        <w:ind w:left="6480" w:hanging="180"/>
+      </w:pPr>
+    </w:lvl>
+  </w:abstractNum>
+  <w:abstractNum w:abstractNumId="22">
     <w:nsid w:val="4EBA6DD1"/>
     <w:multiLevelType w:val="hybridMultilevel"/>
     <w:tmpl w:val="60C02E0C"/>
@@ -8938,7 +9742,7 @@
       </w:pPr>
     </w:lvl>
   </w:abstractNum>
-  <w:abstractNum w:abstractNumId="22">
+  <w:abstractNum w:abstractNumId="23">
     <w:nsid w:val="529E3796"/>
     <w:multiLevelType w:val="hybridMultilevel"/>
     <w:tmpl w:val="AB520516"/>
@@ -9027,7 +9831,7 @@
       </w:pPr>
     </w:lvl>
   </w:abstractNum>
-  <w:abstractNum w:abstractNumId="23">
+  <w:abstractNum w:abstractNumId="24">
     <w:nsid w:val="55816A8D"/>
     <w:multiLevelType w:val="hybridMultilevel"/>
     <w:tmpl w:val="1200EDB6"/>
@@ -9116,7 +9920,7 @@
       </w:pPr>
     </w:lvl>
   </w:abstractNum>
-  <w:abstractNum w:abstractNumId="24">
+  <w:abstractNum w:abstractNumId="25">
     <w:nsid w:val="60166BF6"/>
     <w:multiLevelType w:val="hybridMultilevel"/>
     <w:tmpl w:val="1A2C61F4"/>
@@ -9229,7 +10033,97 @@
       </w:rPr>
     </w:lvl>
   </w:abstractNum>
-  <w:abstractNum w:abstractNumId="25">
+  <w:abstractNum w:abstractNumId="26">
+    <w:nsid w:val="61194B06"/>
+    <w:multiLevelType w:val="hybridMultilevel"/>
+    <w:tmpl w:val="348E9CA8"/>
+    <w:lvl w:ilvl="0" w:tplc="4009000F">
+      <w:start w:val="1"/>
+      <w:numFmt w:val="decimal"/>
+      <w:lvlText w:val="%1."/>
+      <w:lvlJc w:val="left"/>
+      <w:pPr>
+        <w:ind w:left="720" w:hanging="360"/>
+      </w:pPr>
+      <w:rPr>
+        <w:rFonts w:hint="default"/>
+        <w:b w:val="0"/>
+      </w:rPr>
+    </w:lvl>
+    <w:lvl w:ilvl="1" w:tplc="40090019">
+      <w:start w:val="1"/>
+      <w:numFmt w:val="lowerLetter"/>
+      <w:lvlText w:val="%2."/>
+      <w:lvlJc w:val="left"/>
+      <w:pPr>
+        <w:ind w:left="1440" w:hanging="360"/>
+      </w:pPr>
+    </w:lvl>
+    <w:lvl w:ilvl="2" w:tplc="4009001B" w:tentative="1">
+      <w:start w:val="1"/>
+      <w:numFmt w:val="lowerRoman"/>
+      <w:lvlText w:val="%3."/>
+      <w:lvlJc w:val="right"/>
+      <w:pPr>
+        <w:ind w:left="2160" w:hanging="180"/>
+      </w:pPr>
+    </w:lvl>
+    <w:lvl w:ilvl="3" w:tplc="4009000F" w:tentative="1">
+      <w:start w:val="1"/>
+      <w:numFmt w:val="decimal"/>
+      <w:lvlText w:val="%4."/>
+      <w:lvlJc w:val="left"/>
+      <w:pPr>
+        <w:ind w:left="2880" w:hanging="360"/>
+      </w:pPr>
+    </w:lvl>
+    <w:lvl w:ilvl="4" w:tplc="40090019" w:tentative="1">
+      <w:start w:val="1"/>
+      <w:numFmt w:val="lowerLetter"/>
+      <w:lvlText w:val="%5."/>
+      <w:lvlJc w:val="left"/>
+      <w:pPr>
+        <w:ind w:left="3600" w:hanging="360"/>
+      </w:pPr>
+    </w:lvl>
+    <w:lvl w:ilvl="5" w:tplc="4009001B" w:tentative="1">
+      <w:start w:val="1"/>
+      <w:numFmt w:val="lowerRoman"/>
+      <w:lvlText w:val="%6."/>
+      <w:lvlJc w:val="right"/>
+      <w:pPr>
+        <w:ind w:left="4320" w:hanging="180"/>
+      </w:pPr>
+    </w:lvl>
+    <w:lvl w:ilvl="6" w:tplc="4009000F" w:tentative="1">
+      <w:start w:val="1"/>
+      <w:numFmt w:val="decimal"/>
+      <w:lvlText w:val="%7."/>
+      <w:lvlJc w:val="left"/>
+      <w:pPr>
+        <w:ind w:left="5040" w:hanging="360"/>
+      </w:pPr>
+    </w:lvl>
+    <w:lvl w:ilvl="7" w:tplc="40090019" w:tentative="1">
+      <w:start w:val="1"/>
+      <w:numFmt w:val="lowerLetter"/>
+      <w:lvlText w:val="%8."/>
+      <w:lvlJc w:val="left"/>
+      <w:pPr>
+        <w:ind w:left="5760" w:hanging="360"/>
+      </w:pPr>
+    </w:lvl>
+    <w:lvl w:ilvl="8" w:tplc="4009001B" w:tentative="1">
+      <w:start w:val="1"/>
+      <w:numFmt w:val="lowerRoman"/>
+      <w:lvlText w:val="%9."/>
+      <w:lvlJc w:val="right"/>
+      <w:pPr>
+        <w:ind w:left="6480" w:hanging="180"/>
+      </w:pPr>
+    </w:lvl>
+  </w:abstractNum>
+  <w:abstractNum w:abstractNumId="27">
     <w:nsid w:val="669D6C41"/>
     <w:multiLevelType w:val="hybridMultilevel"/>
     <w:tmpl w:val="9E22EC66"/>
@@ -9342,7 +10236,7 @@
       </w:rPr>
     </w:lvl>
   </w:abstractNum>
-  <w:abstractNum w:abstractNumId="26">
+  <w:abstractNum w:abstractNumId="28">
     <w:nsid w:val="6DE40AAE"/>
     <w:multiLevelType w:val="hybridMultilevel"/>
     <w:tmpl w:val="8A1CE40E"/>
@@ -9431,7 +10325,7 @@
       </w:pPr>
     </w:lvl>
   </w:abstractNum>
-  <w:abstractNum w:abstractNumId="27">
+  <w:abstractNum w:abstractNumId="29">
     <w:nsid w:val="771F358C"/>
     <w:multiLevelType w:val="hybridMultilevel"/>
     <w:tmpl w:val="08E0D094"/>
@@ -9542,10 +10436,10 @@
     <w:abstractNumId w:val="5"/>
   </w:num>
   <w:num w:numId="8">
-    <w:abstractNumId w:val="25"/>
+    <w:abstractNumId w:val="27"/>
   </w:num>
   <w:num w:numId="9">
-    <w:abstractNumId w:val="27"/>
+    <w:abstractNumId w:val="29"/>
   </w:num>
   <w:num w:numId="10">
     <w:abstractNumId w:val="13"/>
@@ -9563,22 +10457,22 @@
     <w:abstractNumId w:val="6"/>
   </w:num>
   <w:num w:numId="15">
-    <w:abstractNumId w:val="26"/>
+    <w:abstractNumId w:val="28"/>
   </w:num>
   <w:num w:numId="16">
     <w:abstractNumId w:val="2"/>
   </w:num>
   <w:num w:numId="17">
-    <w:abstractNumId w:val="22"/>
+    <w:abstractNumId w:val="23"/>
   </w:num>
   <w:num w:numId="18">
-    <w:abstractNumId w:val="24"/>
+    <w:abstractNumId w:val="25"/>
   </w:num>
   <w:num w:numId="19">
     <w:abstractNumId w:val="12"/>
   </w:num>
   <w:num w:numId="20">
-    <w:abstractNumId w:val="23"/>
+    <w:abstractNumId w:val="24"/>
   </w:num>
   <w:num w:numId="21">
     <w:abstractNumId w:val="1"/>
@@ -9593,7 +10487,7 @@
     <w:abstractNumId w:val="9"/>
   </w:num>
   <w:num w:numId="25">
-    <w:abstractNumId w:val="21"/>
+    <w:abstractNumId w:val="22"/>
   </w:num>
   <w:num w:numId="26">
     <w:abstractNumId w:val="3"/>
@@ -9603,6 +10497,12 @@
   </w:num>
   <w:num w:numId="28">
     <w:abstractNumId w:val="8"/>
+  </w:num>
+  <w:num w:numId="29">
+    <w:abstractNumId w:val="26"/>
+  </w:num>
+  <w:num w:numId="30">
+    <w:abstractNumId w:val="21"/>
   </w:num>
 </w:numbering>
 </file>

</xml_diff>

<commit_message>
Date: 16 Dec 2025
</commit_message>
<xml_diff>
--- a/Notes_Selenium_15.docx
+++ b/Notes_Selenium_15.docx
@@ -8310,6 +8310,105 @@
         </w:rPr>
         <w:t>Done using @DataProvider</w:t>
       </w:r>
+    </w:p>
+    <w:p>
+      <w:pPr>
+        <w:rPr>
+          <w:b/>
+          <w:bCs/>
+          <w:sz w:val="26"/>
+          <w:szCs w:val="24"/>
+          <w:lang w:val="en-US"/>
+        </w:rPr>
+      </w:pPr>
+    </w:p>
+    <w:p>
+      <w:pPr>
+        <w:rPr>
+          <w:b/>
+          <w:bCs/>
+          <w:sz w:val="26"/>
+          <w:szCs w:val="24"/>
+          <w:lang w:val="en-US"/>
+        </w:rPr>
+      </w:pPr>
+      <w:r>
+        <w:rPr>
+          <w:b/>
+          <w:bCs/>
+          <w:sz w:val="26"/>
+          <w:szCs w:val="24"/>
+          <w:lang w:val="en-US"/>
+        </w:rPr>
+        <w:t>Assertion</w:t>
+      </w:r>
+    </w:p>
+    <w:p>
+      <w:pPr>
+        <w:pStyle w:val="ListParagraph"/>
+        <w:numPr>
+          <w:ilvl w:val="0"/>
+          <w:numId w:val="33"/>
+        </w:numPr>
+        <w:rPr>
+          <w:sz w:val="26"/>
+          <w:szCs w:val="24"/>
+          <w:lang w:val="en-US"/>
+        </w:rPr>
+      </w:pPr>
+      <w:r>
+        <w:rPr>
+          <w:sz w:val="26"/>
+          <w:szCs w:val="24"/>
+          <w:lang w:val="en-US"/>
+        </w:rPr>
+        <w:lastRenderedPageBreak/>
+        <w:t>It is technique via which you can mark any test case as a pass or fail.</w:t>
+      </w:r>
+    </w:p>
+    <w:p>
+      <w:pPr>
+        <w:pStyle w:val="ListParagraph"/>
+        <w:numPr>
+          <w:ilvl w:val="0"/>
+          <w:numId w:val="33"/>
+        </w:numPr>
+        <w:rPr>
+          <w:sz w:val="26"/>
+          <w:szCs w:val="24"/>
+          <w:lang w:val="en-US"/>
+        </w:rPr>
+      </w:pPr>
+      <w:r>
+        <w:rPr>
+          <w:sz w:val="26"/>
+          <w:szCs w:val="24"/>
+          <w:lang w:val="en-US"/>
+        </w:rPr>
+        <w:t>In short it is validation for the test.</w:t>
+      </w:r>
+    </w:p>
+    <w:p>
+      <w:pPr>
+        <w:pStyle w:val="ListParagraph"/>
+        <w:numPr>
+          <w:ilvl w:val="0"/>
+          <w:numId w:val="33"/>
+        </w:numPr>
+        <w:rPr>
+          <w:sz w:val="26"/>
+          <w:szCs w:val="24"/>
+          <w:lang w:val="en-US"/>
+        </w:rPr>
+      </w:pPr>
+      <w:r>
+        <w:rPr>
+          <w:sz w:val="26"/>
+          <w:szCs w:val="24"/>
+          <w:lang w:val="en-US"/>
+        </w:rPr>
+        <w:t>Types</w:t>
+      </w:r>
       <w:bookmarkStart w:id="0" w:name="_GoBack"/>
       <w:bookmarkEnd w:id="0"/>
     </w:p>
@@ -10404,6 +10503,119 @@
     </w:lvl>
   </w:abstractNum>
   <w:abstractNum w:abstractNumId="22">
+    <w:nsid w:val="430B4440"/>
+    <w:multiLevelType w:val="hybridMultilevel"/>
+    <w:tmpl w:val="2B70B9E6"/>
+    <w:lvl w:ilvl="0" w:tplc="40090001">
+      <w:start w:val="1"/>
+      <w:numFmt w:val="bullet"/>
+      <w:lvlText w:val=""/>
+      <w:lvlJc w:val="left"/>
+      <w:pPr>
+        <w:ind w:left="720" w:hanging="360"/>
+      </w:pPr>
+      <w:rPr>
+        <w:rFonts w:ascii="Symbol" w:hAnsi="Symbol" w:hint="default"/>
+      </w:rPr>
+    </w:lvl>
+    <w:lvl w:ilvl="1" w:tplc="40090003" w:tentative="1">
+      <w:start w:val="1"/>
+      <w:numFmt w:val="bullet"/>
+      <w:lvlText w:val="o"/>
+      <w:lvlJc w:val="left"/>
+      <w:pPr>
+        <w:ind w:left="1440" w:hanging="360"/>
+      </w:pPr>
+      <w:rPr>
+        <w:rFonts w:ascii="Courier New" w:hAnsi="Courier New" w:cs="Courier New" w:hint="default"/>
+      </w:rPr>
+    </w:lvl>
+    <w:lvl w:ilvl="2" w:tplc="40090005" w:tentative="1">
+      <w:start w:val="1"/>
+      <w:numFmt w:val="bullet"/>
+      <w:lvlText w:val=""/>
+      <w:lvlJc w:val="left"/>
+      <w:pPr>
+        <w:ind w:left="2160" w:hanging="360"/>
+      </w:pPr>
+      <w:rPr>
+        <w:rFonts w:ascii="Wingdings" w:hAnsi="Wingdings" w:hint="default"/>
+      </w:rPr>
+    </w:lvl>
+    <w:lvl w:ilvl="3" w:tplc="40090001" w:tentative="1">
+      <w:start w:val="1"/>
+      <w:numFmt w:val="bullet"/>
+      <w:lvlText w:val=""/>
+      <w:lvlJc w:val="left"/>
+      <w:pPr>
+        <w:ind w:left="2880" w:hanging="360"/>
+      </w:pPr>
+      <w:rPr>
+        <w:rFonts w:ascii="Symbol" w:hAnsi="Symbol" w:hint="default"/>
+      </w:rPr>
+    </w:lvl>
+    <w:lvl w:ilvl="4" w:tplc="40090003" w:tentative="1">
+      <w:start w:val="1"/>
+      <w:numFmt w:val="bullet"/>
+      <w:lvlText w:val="o"/>
+      <w:lvlJc w:val="left"/>
+      <w:pPr>
+        <w:ind w:left="3600" w:hanging="360"/>
+      </w:pPr>
+      <w:rPr>
+        <w:rFonts w:ascii="Courier New" w:hAnsi="Courier New" w:cs="Courier New" w:hint="default"/>
+      </w:rPr>
+    </w:lvl>
+    <w:lvl w:ilvl="5" w:tplc="40090005" w:tentative="1">
+      <w:start w:val="1"/>
+      <w:numFmt w:val="bullet"/>
+      <w:lvlText w:val=""/>
+      <w:lvlJc w:val="left"/>
+      <w:pPr>
+        <w:ind w:left="4320" w:hanging="360"/>
+      </w:pPr>
+      <w:rPr>
+        <w:rFonts w:ascii="Wingdings" w:hAnsi="Wingdings" w:hint="default"/>
+      </w:rPr>
+    </w:lvl>
+    <w:lvl w:ilvl="6" w:tplc="40090001" w:tentative="1">
+      <w:start w:val="1"/>
+      <w:numFmt w:val="bullet"/>
+      <w:lvlText w:val=""/>
+      <w:lvlJc w:val="left"/>
+      <w:pPr>
+        <w:ind w:left="5040" w:hanging="360"/>
+      </w:pPr>
+      <w:rPr>
+        <w:rFonts w:ascii="Symbol" w:hAnsi="Symbol" w:hint="default"/>
+      </w:rPr>
+    </w:lvl>
+    <w:lvl w:ilvl="7" w:tplc="40090003" w:tentative="1">
+      <w:start w:val="1"/>
+      <w:numFmt w:val="bullet"/>
+      <w:lvlText w:val="o"/>
+      <w:lvlJc w:val="left"/>
+      <w:pPr>
+        <w:ind w:left="5760" w:hanging="360"/>
+      </w:pPr>
+      <w:rPr>
+        <w:rFonts w:ascii="Courier New" w:hAnsi="Courier New" w:cs="Courier New" w:hint="default"/>
+      </w:rPr>
+    </w:lvl>
+    <w:lvl w:ilvl="8" w:tplc="40090005" w:tentative="1">
+      <w:start w:val="1"/>
+      <w:numFmt w:val="bullet"/>
+      <w:lvlText w:val=""/>
+      <w:lvlJc w:val="left"/>
+      <w:pPr>
+        <w:ind w:left="6480" w:hanging="360"/>
+      </w:pPr>
+      <w:rPr>
+        <w:rFonts w:ascii="Wingdings" w:hAnsi="Wingdings" w:hint="default"/>
+      </w:rPr>
+    </w:lvl>
+  </w:abstractNum>
+  <w:abstractNum w:abstractNumId="23">
     <w:nsid w:val="46A73B9B"/>
     <w:multiLevelType w:val="hybridMultilevel"/>
     <w:tmpl w:val="EAA08C1C"/>
@@ -10492,7 +10704,7 @@
       </w:pPr>
     </w:lvl>
   </w:abstractNum>
-  <w:abstractNum w:abstractNumId="23">
+  <w:abstractNum w:abstractNumId="24">
     <w:nsid w:val="4EBA6DD1"/>
     <w:multiLevelType w:val="hybridMultilevel"/>
     <w:tmpl w:val="60C02E0C"/>
@@ -10581,7 +10793,7 @@
       </w:pPr>
     </w:lvl>
   </w:abstractNum>
-  <w:abstractNum w:abstractNumId="24">
+  <w:abstractNum w:abstractNumId="25">
     <w:nsid w:val="515E3FEC"/>
     <w:multiLevelType w:val="hybridMultilevel"/>
     <w:tmpl w:val="E902866C"/>
@@ -10694,7 +10906,7 @@
       </w:rPr>
     </w:lvl>
   </w:abstractNum>
-  <w:abstractNum w:abstractNumId="25">
+  <w:abstractNum w:abstractNumId="26">
     <w:nsid w:val="529E3796"/>
     <w:multiLevelType w:val="hybridMultilevel"/>
     <w:tmpl w:val="AB520516"/>
@@ -10783,7 +10995,7 @@
       </w:pPr>
     </w:lvl>
   </w:abstractNum>
-  <w:abstractNum w:abstractNumId="26">
+  <w:abstractNum w:abstractNumId="27">
     <w:nsid w:val="55816A8D"/>
     <w:multiLevelType w:val="hybridMultilevel"/>
     <w:tmpl w:val="1200EDB6"/>
@@ -10872,7 +11084,7 @@
       </w:pPr>
     </w:lvl>
   </w:abstractNum>
-  <w:abstractNum w:abstractNumId="27">
+  <w:abstractNum w:abstractNumId="28">
     <w:nsid w:val="60166BF6"/>
     <w:multiLevelType w:val="hybridMultilevel"/>
     <w:tmpl w:val="1A2C61F4"/>
@@ -10985,7 +11197,7 @@
       </w:rPr>
     </w:lvl>
   </w:abstractNum>
-  <w:abstractNum w:abstractNumId="28">
+  <w:abstractNum w:abstractNumId="29">
     <w:nsid w:val="61194B06"/>
     <w:multiLevelType w:val="hybridMultilevel"/>
     <w:tmpl w:val="348E9CA8"/>
@@ -11075,7 +11287,7 @@
       </w:pPr>
     </w:lvl>
   </w:abstractNum>
-  <w:abstractNum w:abstractNumId="29">
+  <w:abstractNum w:abstractNumId="30">
     <w:nsid w:val="669D6C41"/>
     <w:multiLevelType w:val="hybridMultilevel"/>
     <w:tmpl w:val="9E22EC66"/>
@@ -11188,7 +11400,7 @@
       </w:rPr>
     </w:lvl>
   </w:abstractNum>
-  <w:abstractNum w:abstractNumId="30">
+  <w:abstractNum w:abstractNumId="31">
     <w:nsid w:val="6DE40AAE"/>
     <w:multiLevelType w:val="hybridMultilevel"/>
     <w:tmpl w:val="8A1CE40E"/>
@@ -11277,7 +11489,7 @@
       </w:pPr>
     </w:lvl>
   </w:abstractNum>
-  <w:abstractNum w:abstractNumId="31">
+  <w:abstractNum w:abstractNumId="32">
     <w:nsid w:val="771F358C"/>
     <w:multiLevelType w:val="hybridMultilevel"/>
     <w:tmpl w:val="08E0D094"/>
@@ -11388,10 +11600,10 @@
     <w:abstractNumId w:val="5"/>
   </w:num>
   <w:num w:numId="8">
-    <w:abstractNumId w:val="29"/>
+    <w:abstractNumId w:val="30"/>
   </w:num>
   <w:num w:numId="9">
-    <w:abstractNumId w:val="31"/>
+    <w:abstractNumId w:val="32"/>
   </w:num>
   <w:num w:numId="10">
     <w:abstractNumId w:val="14"/>
@@ -11409,22 +11621,22 @@
     <w:abstractNumId w:val="6"/>
   </w:num>
   <w:num w:numId="15">
-    <w:abstractNumId w:val="30"/>
+    <w:abstractNumId w:val="31"/>
   </w:num>
   <w:num w:numId="16">
     <w:abstractNumId w:val="2"/>
   </w:num>
   <w:num w:numId="17">
-    <w:abstractNumId w:val="25"/>
+    <w:abstractNumId w:val="26"/>
   </w:num>
   <w:num w:numId="18">
-    <w:abstractNumId w:val="27"/>
+    <w:abstractNumId w:val="28"/>
   </w:num>
   <w:num w:numId="19">
     <w:abstractNumId w:val="12"/>
   </w:num>
   <w:num w:numId="20">
-    <w:abstractNumId w:val="26"/>
+    <w:abstractNumId w:val="27"/>
   </w:num>
   <w:num w:numId="21">
     <w:abstractNumId w:val="1"/>
@@ -11439,7 +11651,7 @@
     <w:abstractNumId w:val="9"/>
   </w:num>
   <w:num w:numId="25">
-    <w:abstractNumId w:val="23"/>
+    <w:abstractNumId w:val="24"/>
   </w:num>
   <w:num w:numId="26">
     <w:abstractNumId w:val="3"/>
@@ -11451,16 +11663,19 @@
     <w:abstractNumId w:val="8"/>
   </w:num>
   <w:num w:numId="29">
-    <w:abstractNumId w:val="28"/>
+    <w:abstractNumId w:val="29"/>
   </w:num>
   <w:num w:numId="30">
-    <w:abstractNumId w:val="22"/>
+    <w:abstractNumId w:val="23"/>
   </w:num>
   <w:num w:numId="31">
     <w:abstractNumId w:val="13"/>
   </w:num>
   <w:num w:numId="32">
-    <w:abstractNumId w:val="24"/>
+    <w:abstractNumId w:val="25"/>
+  </w:num>
+  <w:num w:numId="33">
+    <w:abstractNumId w:val="22"/>
   </w:num>
 </w:numbering>
 </file>

</xml_diff>

<commit_message>
Date: 02 Jan 2026
</commit_message>
<xml_diff>
--- a/Notes_Selenium_15.docx
+++ b/Notes_Selenium_15.docx
@@ -1124,6 +1124,7 @@
           <w:lang w:val="en-US"/>
         </w:rPr>
       </w:pPr>
+      <w:proofErr w:type="spellStart"/>
       <w:r>
         <w:rPr>
           <w:sz w:val="26"/>
@@ -1132,6 +1133,7 @@
         </w:rPr>
         <w:t>JMeeter</w:t>
       </w:r>
+      <w:proofErr w:type="spellEnd"/>
     </w:p>
     <w:p>
       <w:pPr>
@@ -1262,8 +1264,18 @@
           <w:szCs w:val="24"/>
           <w:lang w:val="en-US"/>
         </w:rPr>
-        <w:t>Web Scrab</w:t>
-      </w:r>
+        <w:t xml:space="preserve">Web </w:t>
+      </w:r>
+      <w:proofErr w:type="spellStart"/>
+      <w:r>
+        <w:rPr>
+          <w:sz w:val="26"/>
+          <w:szCs w:val="24"/>
+          <w:lang w:val="en-US"/>
+        </w:rPr>
+        <w:t>Scrab</w:t>
+      </w:r>
+      <w:proofErr w:type="spellEnd"/>
     </w:p>
     <w:p>
       <w:pPr>
@@ -1594,6 +1606,7 @@
           <w:lang w:val="en-US"/>
         </w:rPr>
       </w:pPr>
+      <w:proofErr w:type="spellStart"/>
       <w:r>
         <w:rPr>
           <w:sz w:val="26"/>
@@ -1602,6 +1615,7 @@
         </w:rPr>
         <w:t>YourName_SeleniumDemos</w:t>
       </w:r>
+      <w:proofErr w:type="spellEnd"/>
     </w:p>
     <w:p>
       <w:pPr>
@@ -1762,8 +1776,18 @@
           <w:szCs w:val="24"/>
           <w:lang w:val="en-US"/>
         </w:rPr>
-        <w:t>Idea Itellij</w:t>
-      </w:r>
+        <w:t xml:space="preserve">Idea </w:t>
+      </w:r>
+      <w:proofErr w:type="spellStart"/>
+      <w:r>
+        <w:rPr>
+          <w:sz w:val="26"/>
+          <w:szCs w:val="24"/>
+          <w:lang w:val="en-US"/>
+        </w:rPr>
+        <w:t>Itellij</w:t>
+      </w:r>
+      <w:proofErr w:type="spellEnd"/>
     </w:p>
     <w:p>
       <w:pPr>
@@ -1880,7 +1904,25 @@
           <w:szCs w:val="24"/>
           <w:lang w:val="en-US"/>
         </w:rPr>
-        <w:t>Open selenium.dev site</w:t>
+        <w:t xml:space="preserve">Open </w:t>
+      </w:r>
+      <w:proofErr w:type="spellStart"/>
+      <w:r>
+        <w:rPr>
+          <w:sz w:val="26"/>
+          <w:szCs w:val="24"/>
+          <w:lang w:val="en-US"/>
+        </w:rPr>
+        <w:t>selenium.dev</w:t>
+      </w:r>
+      <w:proofErr w:type="spellEnd"/>
+      <w:r>
+        <w:rPr>
+          <w:sz w:val="26"/>
+          <w:szCs w:val="24"/>
+          <w:lang w:val="en-US"/>
+        </w:rPr>
+        <w:t xml:space="preserve"> site</w:t>
       </w:r>
     </w:p>
     <w:p>
@@ -2266,8 +2308,18 @@
           <w:szCs w:val="24"/>
           <w:lang w:val="en-US"/>
         </w:rPr>
-        <w:t>Click on classpath</w:t>
-      </w:r>
+        <w:t xml:space="preserve">Click on </w:t>
+      </w:r>
+      <w:proofErr w:type="spellStart"/>
+      <w:r>
+        <w:rPr>
+          <w:sz w:val="26"/>
+          <w:szCs w:val="24"/>
+          <w:lang w:val="en-US"/>
+        </w:rPr>
+        <w:t>classpath</w:t>
+      </w:r>
+      <w:proofErr w:type="spellEnd"/>
     </w:p>
     <w:p>
       <w:pPr>
@@ -2430,13 +2482,23 @@
           <w:lang w:val="en-US"/>
         </w:rPr>
       </w:pPr>
-      <w:r>
-        <w:rPr>
-          <w:sz w:val="26"/>
-          <w:szCs w:val="24"/>
-          <w:lang w:val="en-US"/>
-        </w:rPr>
-        <w:t xml:space="preserve">get() </w:t>
+      <w:proofErr w:type="gramStart"/>
+      <w:r>
+        <w:rPr>
+          <w:sz w:val="26"/>
+          <w:szCs w:val="24"/>
+          <w:lang w:val="en-US"/>
+        </w:rPr>
+        <w:t>get(</w:t>
+      </w:r>
+      <w:proofErr w:type="gramEnd"/>
+      <w:r>
+        <w:rPr>
+          <w:sz w:val="26"/>
+          <w:szCs w:val="24"/>
+          <w:lang w:val="en-US"/>
+        </w:rPr>
+        <w:t xml:space="preserve">) </w:t>
       </w:r>
       <w:r>
         <w:rPr>
@@ -2476,13 +2538,33 @@
           <w:lang w:val="en-US"/>
         </w:rPr>
       </w:pPr>
-      <w:r>
-        <w:rPr>
-          <w:sz w:val="26"/>
-          <w:szCs w:val="24"/>
-          <w:lang w:val="en-US"/>
-        </w:rPr>
-        <w:t xml:space="preserve">driver.manage().window().maximize() </w:t>
+      <w:proofErr w:type="spellStart"/>
+      <w:proofErr w:type="gramStart"/>
+      <w:r>
+        <w:rPr>
+          <w:sz w:val="26"/>
+          <w:szCs w:val="24"/>
+          <w:lang w:val="en-US"/>
+        </w:rPr>
+        <w:t>driver.manage</w:t>
+      </w:r>
+      <w:proofErr w:type="spellEnd"/>
+      <w:r>
+        <w:rPr>
+          <w:sz w:val="26"/>
+          <w:szCs w:val="24"/>
+          <w:lang w:val="en-US"/>
+        </w:rPr>
+        <w:t>(</w:t>
+      </w:r>
+      <w:proofErr w:type="gramEnd"/>
+      <w:r>
+        <w:rPr>
+          <w:sz w:val="26"/>
+          <w:szCs w:val="24"/>
+          <w:lang w:val="en-US"/>
+        </w:rPr>
+        <w:t xml:space="preserve">).window().maximize() </w:t>
       </w:r>
       <w:r>
         <w:rPr>
@@ -2514,13 +2596,23 @@
           <w:lang w:val="en-US"/>
         </w:rPr>
       </w:pPr>
-      <w:r>
-        <w:rPr>
-          <w:sz w:val="26"/>
-          <w:szCs w:val="24"/>
-          <w:lang w:val="en-US"/>
-        </w:rPr>
-        <w:t xml:space="preserve">close() </w:t>
+      <w:proofErr w:type="gramStart"/>
+      <w:r>
+        <w:rPr>
+          <w:sz w:val="26"/>
+          <w:szCs w:val="24"/>
+          <w:lang w:val="en-US"/>
+        </w:rPr>
+        <w:t>close(</w:t>
+      </w:r>
+      <w:proofErr w:type="gramEnd"/>
+      <w:r>
+        <w:rPr>
+          <w:sz w:val="26"/>
+          <w:szCs w:val="24"/>
+          <w:lang w:val="en-US"/>
+        </w:rPr>
+        <w:t xml:space="preserve">) </w:t>
       </w:r>
       <w:r>
         <w:rPr>
@@ -2570,13 +2662,23 @@
           <w:lang w:val="en-US"/>
         </w:rPr>
       </w:pPr>
-      <w:r>
-        <w:rPr>
-          <w:sz w:val="26"/>
-          <w:szCs w:val="24"/>
-          <w:lang w:val="en-US"/>
-        </w:rPr>
-        <w:t xml:space="preserve">getTitle() </w:t>
+      <w:proofErr w:type="gramStart"/>
+      <w:r>
+        <w:rPr>
+          <w:sz w:val="26"/>
+          <w:szCs w:val="24"/>
+          <w:lang w:val="en-US"/>
+        </w:rPr>
+        <w:t>getTitle(</w:t>
+      </w:r>
+      <w:proofErr w:type="gramEnd"/>
+      <w:r>
+        <w:rPr>
+          <w:sz w:val="26"/>
+          <w:szCs w:val="24"/>
+          <w:lang w:val="en-US"/>
+        </w:rPr>
+        <w:t xml:space="preserve">) </w:t>
       </w:r>
       <w:r>
         <w:rPr>
@@ -2616,13 +2718,23 @@
           <w:lang w:val="en-US"/>
         </w:rPr>
       </w:pPr>
-      <w:r>
-        <w:rPr>
-          <w:sz w:val="26"/>
-          <w:szCs w:val="24"/>
-          <w:lang w:val="en-US"/>
-        </w:rPr>
-        <w:t xml:space="preserve">getCurrentUrl() </w:t>
+      <w:proofErr w:type="gramStart"/>
+      <w:r>
+        <w:rPr>
+          <w:sz w:val="26"/>
+          <w:szCs w:val="24"/>
+          <w:lang w:val="en-US"/>
+        </w:rPr>
+        <w:t>getCurrentUrl(</w:t>
+      </w:r>
+      <w:proofErr w:type="gramEnd"/>
+      <w:r>
+        <w:rPr>
+          <w:sz w:val="26"/>
+          <w:szCs w:val="24"/>
+          <w:lang w:val="en-US"/>
+        </w:rPr>
+        <w:t xml:space="preserve">) </w:t>
       </w:r>
       <w:r>
         <w:rPr>
@@ -2654,13 +2766,23 @@
           <w:lang w:val="en-US"/>
         </w:rPr>
       </w:pPr>
-      <w:r>
-        <w:rPr>
-          <w:sz w:val="26"/>
-          <w:szCs w:val="24"/>
-          <w:lang w:val="en-US"/>
-        </w:rPr>
-        <w:t xml:space="preserve">getPageSource() </w:t>
+      <w:proofErr w:type="gramStart"/>
+      <w:r>
+        <w:rPr>
+          <w:sz w:val="26"/>
+          <w:szCs w:val="24"/>
+          <w:lang w:val="en-US"/>
+        </w:rPr>
+        <w:t>getPageSource(</w:t>
+      </w:r>
+      <w:proofErr w:type="gramEnd"/>
+      <w:r>
+        <w:rPr>
+          <w:sz w:val="26"/>
+          <w:szCs w:val="24"/>
+          <w:lang w:val="en-US"/>
+        </w:rPr>
+        <w:t xml:space="preserve">) </w:t>
       </w:r>
       <w:r>
         <w:rPr>
@@ -2700,13 +2822,23 @@
           <w:lang w:val="en-US"/>
         </w:rPr>
       </w:pPr>
-      <w:r>
-        <w:rPr>
-          <w:sz w:val="26"/>
-          <w:szCs w:val="24"/>
-          <w:lang w:val="en-US"/>
-        </w:rPr>
-        <w:t xml:space="preserve">findElement() </w:t>
+      <w:proofErr w:type="gramStart"/>
+      <w:r>
+        <w:rPr>
+          <w:sz w:val="26"/>
+          <w:szCs w:val="24"/>
+          <w:lang w:val="en-US"/>
+        </w:rPr>
+        <w:t>findElement(</w:t>
+      </w:r>
+      <w:proofErr w:type="gramEnd"/>
+      <w:r>
+        <w:rPr>
+          <w:sz w:val="26"/>
+          <w:szCs w:val="24"/>
+          <w:lang w:val="en-US"/>
+        </w:rPr>
+        <w:t xml:space="preserve">) </w:t>
       </w:r>
       <w:r>
         <w:rPr>
@@ -2782,13 +2914,23 @@
           <w:lang w:val="en-US"/>
         </w:rPr>
       </w:pPr>
-      <w:r>
-        <w:rPr>
-          <w:sz w:val="26"/>
-          <w:szCs w:val="24"/>
-          <w:lang w:val="en-US"/>
-        </w:rPr>
-        <w:t xml:space="preserve">findElements() </w:t>
+      <w:proofErr w:type="gramStart"/>
+      <w:r>
+        <w:rPr>
+          <w:sz w:val="26"/>
+          <w:szCs w:val="24"/>
+          <w:lang w:val="en-US"/>
+        </w:rPr>
+        <w:t>findElements(</w:t>
+      </w:r>
+      <w:proofErr w:type="gramEnd"/>
+      <w:r>
+        <w:rPr>
+          <w:sz w:val="26"/>
+          <w:szCs w:val="24"/>
+          <w:lang w:val="en-US"/>
+        </w:rPr>
+        <w:t xml:space="preserve">) </w:t>
       </w:r>
       <w:r>
         <w:rPr>
@@ -2820,13 +2962,23 @@
           <w:lang w:val="en-US"/>
         </w:rPr>
       </w:pPr>
-      <w:r>
-        <w:rPr>
-          <w:sz w:val="26"/>
-          <w:szCs w:val="24"/>
-          <w:lang w:val="en-US"/>
-        </w:rPr>
-        <w:t xml:space="preserve">getWindowHandles() </w:t>
+      <w:proofErr w:type="gramStart"/>
+      <w:r>
+        <w:rPr>
+          <w:sz w:val="26"/>
+          <w:szCs w:val="24"/>
+          <w:lang w:val="en-US"/>
+        </w:rPr>
+        <w:t>getWindowHandles(</w:t>
+      </w:r>
+      <w:proofErr w:type="gramEnd"/>
+      <w:r>
+        <w:rPr>
+          <w:sz w:val="26"/>
+          <w:szCs w:val="24"/>
+          <w:lang w:val="en-US"/>
+        </w:rPr>
+        <w:t xml:space="preserve">) </w:t>
       </w:r>
       <w:r>
         <w:rPr>
@@ -2858,13 +3010,23 @@
           <w:lang w:val="en-US"/>
         </w:rPr>
       </w:pPr>
-      <w:r>
-        <w:rPr>
-          <w:sz w:val="26"/>
-          <w:szCs w:val="24"/>
-          <w:lang w:val="en-US"/>
-        </w:rPr>
-        <w:t xml:space="preserve">quit() </w:t>
+      <w:proofErr w:type="gramStart"/>
+      <w:r>
+        <w:rPr>
+          <w:sz w:val="26"/>
+          <w:szCs w:val="24"/>
+          <w:lang w:val="en-US"/>
+        </w:rPr>
+        <w:t>quit(</w:t>
+      </w:r>
+      <w:proofErr w:type="gramEnd"/>
+      <w:r>
+        <w:rPr>
+          <w:sz w:val="26"/>
+          <w:szCs w:val="24"/>
+          <w:lang w:val="en-US"/>
+        </w:rPr>
+        <w:t xml:space="preserve">) </w:t>
       </w:r>
       <w:r>
         <w:rPr>
@@ -3592,7 +3754,25 @@
           <w:szCs w:val="24"/>
           <w:lang w:val="en-US"/>
         </w:rPr>
-        <w:t>Every control (like textbox, radio button, checkbox, label etc) is treated as WebElement in Selenium.</w:t>
+        <w:t xml:space="preserve">Every control (like textbox, radio button, checkbox, label </w:t>
+      </w:r>
+      <w:proofErr w:type="spellStart"/>
+      <w:r>
+        <w:rPr>
+          <w:sz w:val="26"/>
+          <w:szCs w:val="24"/>
+          <w:lang w:val="en-US"/>
+        </w:rPr>
+        <w:t>etc</w:t>
+      </w:r>
+      <w:proofErr w:type="spellEnd"/>
+      <w:r>
+        <w:rPr>
+          <w:sz w:val="26"/>
+          <w:szCs w:val="24"/>
+          <w:lang w:val="en-US"/>
+        </w:rPr>
+        <w:t>) is treated as WebElement in Selenium.</w:t>
       </w:r>
     </w:p>
     <w:p>
@@ -3652,13 +3832,23 @@
           <w:lang w:val="en-US"/>
         </w:rPr>
       </w:pPr>
-      <w:r>
-        <w:rPr>
-          <w:sz w:val="26"/>
-          <w:szCs w:val="24"/>
-          <w:lang w:val="en-US"/>
-        </w:rPr>
-        <w:t xml:space="preserve">sendKeys() </w:t>
+      <w:proofErr w:type="gramStart"/>
+      <w:r>
+        <w:rPr>
+          <w:sz w:val="26"/>
+          <w:szCs w:val="24"/>
+          <w:lang w:val="en-US"/>
+        </w:rPr>
+        <w:t>sendKeys(</w:t>
+      </w:r>
+      <w:proofErr w:type="gramEnd"/>
+      <w:r>
+        <w:rPr>
+          <w:sz w:val="26"/>
+          <w:szCs w:val="24"/>
+          <w:lang w:val="en-US"/>
+        </w:rPr>
+        <w:t xml:space="preserve">) </w:t>
       </w:r>
       <w:r>
         <w:rPr>
@@ -3714,13 +3904,23 @@
           <w:lang w:val="en-US"/>
         </w:rPr>
       </w:pPr>
-      <w:r>
-        <w:rPr>
-          <w:sz w:val="26"/>
-          <w:szCs w:val="24"/>
-          <w:lang w:val="en-US"/>
-        </w:rPr>
-        <w:t xml:space="preserve">click() </w:t>
+      <w:proofErr w:type="gramStart"/>
+      <w:r>
+        <w:rPr>
+          <w:sz w:val="26"/>
+          <w:szCs w:val="24"/>
+          <w:lang w:val="en-US"/>
+        </w:rPr>
+        <w:t>click(</w:t>
+      </w:r>
+      <w:proofErr w:type="gramEnd"/>
+      <w:r>
+        <w:rPr>
+          <w:sz w:val="26"/>
+          <w:szCs w:val="24"/>
+          <w:lang w:val="en-US"/>
+        </w:rPr>
+        <w:t xml:space="preserve">) </w:t>
       </w:r>
       <w:r>
         <w:rPr>
@@ -3752,13 +3952,23 @@
           <w:lang w:val="en-US"/>
         </w:rPr>
       </w:pPr>
-      <w:r>
-        <w:rPr>
-          <w:sz w:val="26"/>
-          <w:szCs w:val="24"/>
-          <w:lang w:val="en-US"/>
-        </w:rPr>
-        <w:t xml:space="preserve">getText() </w:t>
+      <w:proofErr w:type="gramStart"/>
+      <w:r>
+        <w:rPr>
+          <w:sz w:val="26"/>
+          <w:szCs w:val="24"/>
+          <w:lang w:val="en-US"/>
+        </w:rPr>
+        <w:t>getText(</w:t>
+      </w:r>
+      <w:proofErr w:type="gramEnd"/>
+      <w:r>
+        <w:rPr>
+          <w:sz w:val="26"/>
+          <w:szCs w:val="24"/>
+          <w:lang w:val="en-US"/>
+        </w:rPr>
+        <w:t xml:space="preserve">) </w:t>
       </w:r>
       <w:r>
         <w:rPr>
@@ -3798,13 +4008,23 @@
           <w:lang w:val="en-US"/>
         </w:rPr>
       </w:pPr>
-      <w:r>
-        <w:rPr>
-          <w:sz w:val="26"/>
-          <w:szCs w:val="24"/>
-          <w:lang w:val="en-US"/>
-        </w:rPr>
-        <w:t xml:space="preserve">isSelected() </w:t>
+      <w:proofErr w:type="gramStart"/>
+      <w:r>
+        <w:rPr>
+          <w:sz w:val="26"/>
+          <w:szCs w:val="24"/>
+          <w:lang w:val="en-US"/>
+        </w:rPr>
+        <w:t>isSelected(</w:t>
+      </w:r>
+      <w:proofErr w:type="gramEnd"/>
+      <w:r>
+        <w:rPr>
+          <w:sz w:val="26"/>
+          <w:szCs w:val="24"/>
+          <w:lang w:val="en-US"/>
+        </w:rPr>
+        <w:t xml:space="preserve">) </w:t>
       </w:r>
       <w:r>
         <w:rPr>
@@ -3836,13 +4056,23 @@
           <w:lang w:val="en-US"/>
         </w:rPr>
       </w:pPr>
-      <w:r>
-        <w:rPr>
-          <w:sz w:val="26"/>
-          <w:szCs w:val="24"/>
-          <w:lang w:val="en-US"/>
-        </w:rPr>
-        <w:t xml:space="preserve">isEnabled() </w:t>
+      <w:proofErr w:type="gramStart"/>
+      <w:r>
+        <w:rPr>
+          <w:sz w:val="26"/>
+          <w:szCs w:val="24"/>
+          <w:lang w:val="en-US"/>
+        </w:rPr>
+        <w:t>isEnabled(</w:t>
+      </w:r>
+      <w:proofErr w:type="gramEnd"/>
+      <w:r>
+        <w:rPr>
+          <w:sz w:val="26"/>
+          <w:szCs w:val="24"/>
+          <w:lang w:val="en-US"/>
+        </w:rPr>
+        <w:t xml:space="preserve">) </w:t>
       </w:r>
       <w:r>
         <w:rPr>
@@ -3874,13 +4104,23 @@
           <w:lang w:val="en-US"/>
         </w:rPr>
       </w:pPr>
-      <w:r>
-        <w:rPr>
-          <w:sz w:val="26"/>
-          <w:szCs w:val="24"/>
-          <w:lang w:val="en-US"/>
-        </w:rPr>
-        <w:t xml:space="preserve">isDisplayed() </w:t>
+      <w:proofErr w:type="gramStart"/>
+      <w:r>
+        <w:rPr>
+          <w:sz w:val="26"/>
+          <w:szCs w:val="24"/>
+          <w:lang w:val="en-US"/>
+        </w:rPr>
+        <w:t>isDisplayed(</w:t>
+      </w:r>
+      <w:proofErr w:type="gramEnd"/>
+      <w:r>
+        <w:rPr>
+          <w:sz w:val="26"/>
+          <w:szCs w:val="24"/>
+          <w:lang w:val="en-US"/>
+        </w:rPr>
+        <w:t xml:space="preserve">) </w:t>
       </w:r>
       <w:r>
         <w:rPr>
@@ -3912,13 +4152,23 @@
           <w:lang w:val="en-US"/>
         </w:rPr>
       </w:pPr>
-      <w:r>
-        <w:rPr>
-          <w:sz w:val="26"/>
-          <w:szCs w:val="24"/>
-          <w:lang w:val="en-US"/>
-        </w:rPr>
-        <w:t xml:space="preserve">clear() </w:t>
+      <w:proofErr w:type="gramStart"/>
+      <w:r>
+        <w:rPr>
+          <w:sz w:val="26"/>
+          <w:szCs w:val="24"/>
+          <w:lang w:val="en-US"/>
+        </w:rPr>
+        <w:t>clear(</w:t>
+      </w:r>
+      <w:proofErr w:type="gramEnd"/>
+      <w:r>
+        <w:rPr>
+          <w:sz w:val="26"/>
+          <w:szCs w:val="24"/>
+          <w:lang w:val="en-US"/>
+        </w:rPr>
+        <w:t xml:space="preserve">) </w:t>
       </w:r>
       <w:r>
         <w:rPr>
@@ -4088,15 +4338,7 @@
           <w:szCs w:val="24"/>
           <w:lang w:val="en-US"/>
         </w:rPr>
-        <w:t xml:space="preserve">Otherwise you will get </w:t>
-      </w:r>
-      <w:r>
-        <w:rPr>
-          <w:sz w:val="26"/>
-          <w:szCs w:val="24"/>
-          <w:lang w:val="en-US"/>
-        </w:rPr>
-        <w:t>InvalidSelectorException</w:t>
+        <w:t>Otherwise you will get InvalidSelectorException</w:t>
       </w:r>
       <w:r>
         <w:rPr>
@@ -4106,8 +4348,6 @@
         </w:rPr>
         <w:t xml:space="preserve"> </w:t>
       </w:r>
-      <w:bookmarkStart w:id="0" w:name="_GoBack"/>
-      <w:bookmarkEnd w:id="0"/>
     </w:p>
     <w:p>
       <w:pPr>
@@ -4228,7 +4468,25 @@
           <w:szCs w:val="24"/>
           <w:lang w:val="en-US"/>
         </w:rPr>
-        <w:t>data-testid="royal-email"]</w:t>
+        <w:t>data-</w:t>
+      </w:r>
+      <w:proofErr w:type="spellStart"/>
+      <w:r>
+        <w:rPr>
+          <w:sz w:val="26"/>
+          <w:szCs w:val="24"/>
+          <w:lang w:val="en-US"/>
+        </w:rPr>
+        <w:t>testid</w:t>
+      </w:r>
+      <w:proofErr w:type="spellEnd"/>
+      <w:r>
+        <w:rPr>
+          <w:sz w:val="26"/>
+          <w:szCs w:val="24"/>
+          <w:lang w:val="en-US"/>
+        </w:rPr>
+        <w:t>="royal-email"]</w:t>
       </w:r>
     </w:p>
     <w:p>
@@ -4749,7 +5007,25 @@
           <w:szCs w:val="24"/>
           <w:lang w:val="en-US"/>
         </w:rPr>
-        <w:t xml:space="preserve">Selenium has provided special class to handle drop down list ie. </w:t>
+        <w:t xml:space="preserve">Selenium has provided special class to handle drop down list </w:t>
+      </w:r>
+      <w:proofErr w:type="spellStart"/>
+      <w:r>
+        <w:rPr>
+          <w:sz w:val="26"/>
+          <w:szCs w:val="24"/>
+          <w:lang w:val="en-US"/>
+        </w:rPr>
+        <w:t>ie</w:t>
+      </w:r>
+      <w:proofErr w:type="spellEnd"/>
+      <w:r>
+        <w:rPr>
+          <w:sz w:val="26"/>
+          <w:szCs w:val="24"/>
+          <w:lang w:val="en-US"/>
+        </w:rPr>
+        <w:t xml:space="preserve">. </w:t>
       </w:r>
       <w:r>
         <w:rPr>
@@ -4972,13 +5248,23 @@
           <w:lang w:val="en-US"/>
         </w:rPr>
       </w:pPr>
-      <w:r>
-        <w:rPr>
-          <w:sz w:val="26"/>
-          <w:szCs w:val="24"/>
-          <w:lang w:val="en-US"/>
-        </w:rPr>
-        <w:t xml:space="preserve">getFirstSelectedOption() </w:t>
+      <w:proofErr w:type="gramStart"/>
+      <w:r>
+        <w:rPr>
+          <w:sz w:val="26"/>
+          <w:szCs w:val="24"/>
+          <w:lang w:val="en-US"/>
+        </w:rPr>
+        <w:t>getFirstSelectedOption(</w:t>
+      </w:r>
+      <w:proofErr w:type="gramEnd"/>
+      <w:r>
+        <w:rPr>
+          <w:sz w:val="26"/>
+          <w:szCs w:val="24"/>
+          <w:lang w:val="en-US"/>
+        </w:rPr>
+        <w:t xml:space="preserve">) </w:t>
       </w:r>
       <w:r>
         <w:rPr>
@@ -5174,6 +5460,7 @@
           <w:lang w:val="en-US"/>
         </w:rPr>
       </w:pPr>
+      <w:proofErr w:type="gramStart"/>
       <w:r>
         <w:rPr>
           <w:sz w:val="26"/>
@@ -5181,7 +5468,16 @@
           <w:lang w:val="en-US"/>
         </w:rPr>
         <w:lastRenderedPageBreak/>
-        <w:t xml:space="preserve">isMultiple() </w:t>
+        <w:t>isMultiple(</w:t>
+      </w:r>
+      <w:proofErr w:type="gramEnd"/>
+      <w:r>
+        <w:rPr>
+          <w:sz w:val="26"/>
+          <w:szCs w:val="24"/>
+          <w:lang w:val="en-US"/>
+        </w:rPr>
+        <w:t xml:space="preserve">) </w:t>
       </w:r>
       <w:r>
         <w:rPr>
@@ -5394,13 +5690,33 @@
           <w:lang w:val="en-US"/>
         </w:rPr>
       </w:pPr>
-      <w:r>
-        <w:rPr>
-          <w:sz w:val="26"/>
-          <w:szCs w:val="24"/>
-          <w:lang w:val="en-US"/>
-        </w:rPr>
-        <w:t xml:space="preserve">Thread.sleep() </w:t>
+      <w:proofErr w:type="spellStart"/>
+      <w:proofErr w:type="gramStart"/>
+      <w:r>
+        <w:rPr>
+          <w:sz w:val="26"/>
+          <w:szCs w:val="24"/>
+          <w:lang w:val="en-US"/>
+        </w:rPr>
+        <w:t>Thread.sleep</w:t>
+      </w:r>
+      <w:proofErr w:type="spellEnd"/>
+      <w:r>
+        <w:rPr>
+          <w:sz w:val="26"/>
+          <w:szCs w:val="24"/>
+          <w:lang w:val="en-US"/>
+        </w:rPr>
+        <w:t>(</w:t>
+      </w:r>
+      <w:proofErr w:type="gramEnd"/>
+      <w:r>
+        <w:rPr>
+          <w:sz w:val="26"/>
+          <w:szCs w:val="24"/>
+          <w:lang w:val="en-US"/>
+        </w:rPr>
+        <w:t xml:space="preserve">) </w:t>
       </w:r>
       <w:r>
         <w:rPr>
@@ -5678,13 +5994,23 @@
           <w:lang w:val="en-US"/>
         </w:rPr>
       </w:pPr>
-      <w:r>
-        <w:rPr>
-          <w:sz w:val="26"/>
-          <w:szCs w:val="24"/>
-          <w:lang w:val="en-US"/>
-        </w:rPr>
-        <w:t>FluentWait()</w:t>
+      <w:proofErr w:type="gramStart"/>
+      <w:r>
+        <w:rPr>
+          <w:sz w:val="26"/>
+          <w:szCs w:val="24"/>
+          <w:lang w:val="en-US"/>
+        </w:rPr>
+        <w:t>FluentWait(</w:t>
+      </w:r>
+      <w:proofErr w:type="gramEnd"/>
+      <w:r>
+        <w:rPr>
+          <w:sz w:val="26"/>
+          <w:szCs w:val="24"/>
+          <w:lang w:val="en-US"/>
+        </w:rPr>
+        <w:t>)</w:t>
       </w:r>
       <w:r>
         <w:rPr>
@@ -5822,7 +6148,24 @@
           <w:lang w:val="en-US"/>
         </w:rPr>
         <w:br/>
-        <w:t>i - ignoring</w:t>
+      </w:r>
+      <w:proofErr w:type="spellStart"/>
+      <w:r>
+        <w:rPr>
+          <w:sz w:val="26"/>
+          <w:szCs w:val="24"/>
+          <w:lang w:val="en-US"/>
+        </w:rPr>
+        <w:t>i</w:t>
+      </w:r>
+      <w:proofErr w:type="spellEnd"/>
+      <w:r>
+        <w:rPr>
+          <w:sz w:val="26"/>
+          <w:szCs w:val="24"/>
+          <w:lang w:val="en-US"/>
+        </w:rPr>
+        <w:t xml:space="preserve"> - ignoring</w:t>
       </w:r>
       <w:r>
         <w:rPr>
@@ -5856,13 +6199,23 @@
           <w:lang w:val="en-US"/>
         </w:rPr>
       </w:pPr>
-      <w:r>
-        <w:rPr>
-          <w:sz w:val="26"/>
-          <w:szCs w:val="24"/>
-          <w:lang w:val="en-US"/>
-        </w:rPr>
-        <w:t>PageLoadTimeout()</w:t>
+      <w:proofErr w:type="gramStart"/>
+      <w:r>
+        <w:rPr>
+          <w:sz w:val="26"/>
+          <w:szCs w:val="24"/>
+          <w:lang w:val="en-US"/>
+        </w:rPr>
+        <w:t>PageLoadTimeout(</w:t>
+      </w:r>
+      <w:proofErr w:type="gramEnd"/>
+      <w:r>
+        <w:rPr>
+          <w:sz w:val="26"/>
+          <w:szCs w:val="24"/>
+          <w:lang w:val="en-US"/>
+        </w:rPr>
+        <w:t>)</w:t>
       </w:r>
       <w:r>
         <w:rPr>
@@ -5886,7 +6239,25 @@
           <w:szCs w:val="24"/>
           <w:lang w:val="en-US"/>
         </w:rPr>
-        <w:t xml:space="preserve"> Normally the driver.get() is having implicit wait of 30 seconds till the page get loaded. But if the page didn’t get loaded in 30 seconds, selenium will throw SessionNotCreatedException. To avoid this exception you can add PageLoadTimeout which will wait for additional time till the page get loaded before throwing the exception.</w:t>
+        <w:t xml:space="preserve"> Normally the </w:t>
+      </w:r>
+      <w:proofErr w:type="spellStart"/>
+      <w:r>
+        <w:rPr>
+          <w:sz w:val="26"/>
+          <w:szCs w:val="24"/>
+          <w:lang w:val="en-US"/>
+        </w:rPr>
+        <w:t>driver.get</w:t>
+      </w:r>
+      <w:proofErr w:type="spellEnd"/>
+      <w:r>
+        <w:rPr>
+          <w:sz w:val="26"/>
+          <w:szCs w:val="24"/>
+          <w:lang w:val="en-US"/>
+        </w:rPr>
+        <w:t>() is having implicit wait of 30 seconds till the page get loaded. But if the page didn’t get loaded in 30 seconds, selenium will throw SessionNotCreatedException. To avoid this exception you can add PageLoadTimeout which will wait for additional time till the page get loaded before throwing the exception.</w:t>
       </w:r>
     </w:p>
     <w:p>
@@ -6234,7 +6605,25 @@
           <w:szCs w:val="24"/>
           <w:lang w:val="en-US"/>
         </w:rPr>
-        <w:t xml:space="preserve">Selenium has provided a special kind of interface to handle such alert ie. </w:t>
+        <w:t xml:space="preserve">Selenium has provided a special kind of interface to handle such alert </w:t>
+      </w:r>
+      <w:proofErr w:type="spellStart"/>
+      <w:r>
+        <w:rPr>
+          <w:sz w:val="26"/>
+          <w:szCs w:val="24"/>
+          <w:lang w:val="en-US"/>
+        </w:rPr>
+        <w:t>ie</w:t>
+      </w:r>
+      <w:proofErr w:type="spellEnd"/>
+      <w:r>
+        <w:rPr>
+          <w:sz w:val="26"/>
+          <w:szCs w:val="24"/>
+          <w:lang w:val="en-US"/>
+        </w:rPr>
+        <w:t xml:space="preserve">. </w:t>
       </w:r>
       <w:r>
         <w:rPr>
@@ -6265,6 +6654,7 @@
           <w:lang w:val="en-US"/>
         </w:rPr>
       </w:pPr>
+      <w:proofErr w:type="spellStart"/>
       <w:r>
         <w:rPr>
           <w:sz w:val="26"/>
@@ -6273,6 +6663,7 @@
         </w:rPr>
         <w:t>MEthods</w:t>
       </w:r>
+      <w:proofErr w:type="spellEnd"/>
     </w:p>
     <w:p>
       <w:pPr>
@@ -6287,13 +6678,23 @@
           <w:lang w:val="en-US"/>
         </w:rPr>
       </w:pPr>
-      <w:r>
-        <w:rPr>
-          <w:sz w:val="26"/>
-          <w:szCs w:val="24"/>
-          <w:lang w:val="en-US"/>
-        </w:rPr>
-        <w:t xml:space="preserve">driver.switchTo().alert() </w:t>
+      <w:proofErr w:type="spellStart"/>
+      <w:r>
+        <w:rPr>
+          <w:sz w:val="26"/>
+          <w:szCs w:val="24"/>
+          <w:lang w:val="en-US"/>
+        </w:rPr>
+        <w:t>driver.switchTo</w:t>
+      </w:r>
+      <w:proofErr w:type="spellEnd"/>
+      <w:r>
+        <w:rPr>
+          <w:sz w:val="26"/>
+          <w:szCs w:val="24"/>
+          <w:lang w:val="en-US"/>
+        </w:rPr>
+        <w:t xml:space="preserve">().alert() </w:t>
       </w:r>
       <w:r>
         <w:rPr>
@@ -6325,13 +6726,23 @@
           <w:lang w:val="en-US"/>
         </w:rPr>
       </w:pPr>
-      <w:r>
-        <w:rPr>
-          <w:sz w:val="26"/>
-          <w:szCs w:val="24"/>
-          <w:lang w:val="en-US"/>
-        </w:rPr>
-        <w:t xml:space="preserve">getText() </w:t>
+      <w:proofErr w:type="gramStart"/>
+      <w:r>
+        <w:rPr>
+          <w:sz w:val="26"/>
+          <w:szCs w:val="24"/>
+          <w:lang w:val="en-US"/>
+        </w:rPr>
+        <w:t>getText(</w:t>
+      </w:r>
+      <w:proofErr w:type="gramEnd"/>
+      <w:r>
+        <w:rPr>
+          <w:sz w:val="26"/>
+          <w:szCs w:val="24"/>
+          <w:lang w:val="en-US"/>
+        </w:rPr>
+        <w:t xml:space="preserve">) </w:t>
       </w:r>
       <w:r>
         <w:rPr>
@@ -6363,13 +6774,23 @@
           <w:lang w:val="en-US"/>
         </w:rPr>
       </w:pPr>
-      <w:r>
-        <w:rPr>
-          <w:sz w:val="26"/>
-          <w:szCs w:val="24"/>
-          <w:lang w:val="en-US"/>
-        </w:rPr>
-        <w:t xml:space="preserve">accept() </w:t>
+      <w:proofErr w:type="gramStart"/>
+      <w:r>
+        <w:rPr>
+          <w:sz w:val="26"/>
+          <w:szCs w:val="24"/>
+          <w:lang w:val="en-US"/>
+        </w:rPr>
+        <w:t>accept(</w:t>
+      </w:r>
+      <w:proofErr w:type="gramEnd"/>
+      <w:r>
+        <w:rPr>
+          <w:sz w:val="26"/>
+          <w:szCs w:val="24"/>
+          <w:lang w:val="en-US"/>
+        </w:rPr>
+        <w:t xml:space="preserve">) </w:t>
       </w:r>
       <w:r>
         <w:rPr>
@@ -6730,13 +7151,23 @@
           <w:lang w:val="en-US"/>
         </w:rPr>
       </w:pPr>
-      <w:r>
-        <w:rPr>
-          <w:sz w:val="26"/>
-          <w:szCs w:val="24"/>
-          <w:lang w:val="en-US"/>
-        </w:rPr>
-        <w:t xml:space="preserve">moveToElement() </w:t>
+      <w:proofErr w:type="gramStart"/>
+      <w:r>
+        <w:rPr>
+          <w:sz w:val="26"/>
+          <w:szCs w:val="24"/>
+          <w:lang w:val="en-US"/>
+        </w:rPr>
+        <w:t>moveToElement(</w:t>
+      </w:r>
+      <w:proofErr w:type="gramEnd"/>
+      <w:r>
+        <w:rPr>
+          <w:sz w:val="26"/>
+          <w:szCs w:val="24"/>
+          <w:lang w:val="en-US"/>
+        </w:rPr>
+        <w:t xml:space="preserve">) </w:t>
       </w:r>
       <w:r>
         <w:rPr>
@@ -6768,13 +7199,23 @@
           <w:lang w:val="en-US"/>
         </w:rPr>
       </w:pPr>
-      <w:r>
-        <w:rPr>
-          <w:sz w:val="26"/>
-          <w:szCs w:val="24"/>
-          <w:lang w:val="en-US"/>
-        </w:rPr>
-        <w:t xml:space="preserve">perform() </w:t>
+      <w:proofErr w:type="gramStart"/>
+      <w:r>
+        <w:rPr>
+          <w:sz w:val="26"/>
+          <w:szCs w:val="24"/>
+          <w:lang w:val="en-US"/>
+        </w:rPr>
+        <w:t>perform(</w:t>
+      </w:r>
+      <w:proofErr w:type="gramEnd"/>
+      <w:r>
+        <w:rPr>
+          <w:sz w:val="26"/>
+          <w:szCs w:val="24"/>
+          <w:lang w:val="en-US"/>
+        </w:rPr>
+        <w:t xml:space="preserve">) </w:t>
       </w:r>
       <w:r>
         <w:rPr>
@@ -6814,13 +7255,23 @@
           <w:lang w:val="en-US"/>
         </w:rPr>
       </w:pPr>
-      <w:r>
-        <w:rPr>
-          <w:sz w:val="26"/>
-          <w:szCs w:val="24"/>
-          <w:lang w:val="en-US"/>
-        </w:rPr>
-        <w:t xml:space="preserve">contextClick() </w:t>
+      <w:proofErr w:type="gramStart"/>
+      <w:r>
+        <w:rPr>
+          <w:sz w:val="26"/>
+          <w:szCs w:val="24"/>
+          <w:lang w:val="en-US"/>
+        </w:rPr>
+        <w:t>contextClick(</w:t>
+      </w:r>
+      <w:proofErr w:type="gramEnd"/>
+      <w:r>
+        <w:rPr>
+          <w:sz w:val="26"/>
+          <w:szCs w:val="24"/>
+          <w:lang w:val="en-US"/>
+        </w:rPr>
+        <w:t xml:space="preserve">) </w:t>
       </w:r>
       <w:r>
         <w:rPr>
@@ -8612,6 +9063,420 @@
           <w:lang w:val="en-US"/>
         </w:rPr>
       </w:pPr>
+      <w:r>
+        <w:rPr>
+          <w:sz w:val="26"/>
+          <w:szCs w:val="24"/>
+          <w:lang w:val="en-US"/>
+        </w:rPr>
+        <w:br w:type="page"/>
+      </w:r>
+    </w:p>
+    <w:p>
+      <w:pPr>
+        <w:rPr>
+          <w:b/>
+          <w:bCs/>
+          <w:sz w:val="26"/>
+          <w:szCs w:val="24"/>
+          <w:lang w:val="en-US"/>
+        </w:rPr>
+      </w:pPr>
+      <w:r>
+        <w:rPr>
+          <w:b/>
+          <w:bCs/>
+          <w:sz w:val="26"/>
+          <w:szCs w:val="24"/>
+          <w:lang w:val="en-US"/>
+        </w:rPr>
+        <w:lastRenderedPageBreak/>
+        <w:t>Maven</w:t>
+      </w:r>
+    </w:p>
+    <w:p>
+      <w:pPr>
+        <w:pStyle w:val="ListParagraph"/>
+        <w:numPr>
+          <w:ilvl w:val="0"/>
+          <w:numId w:val="35"/>
+        </w:numPr>
+        <w:rPr>
+          <w:sz w:val="26"/>
+          <w:szCs w:val="24"/>
+          <w:lang w:val="en-US"/>
+        </w:rPr>
+      </w:pPr>
+      <w:r>
+        <w:rPr>
+          <w:sz w:val="26"/>
+          <w:szCs w:val="24"/>
+          <w:lang w:val="en-US"/>
+        </w:rPr>
+        <w:t>Build management tool</w:t>
+      </w:r>
+    </w:p>
+    <w:p>
+      <w:pPr>
+        <w:pStyle w:val="ListParagraph"/>
+        <w:numPr>
+          <w:ilvl w:val="0"/>
+          <w:numId w:val="35"/>
+        </w:numPr>
+        <w:rPr>
+          <w:sz w:val="26"/>
+          <w:szCs w:val="24"/>
+          <w:lang w:val="en-US"/>
+        </w:rPr>
+      </w:pPr>
+      <w:r>
+        <w:rPr>
+          <w:sz w:val="26"/>
+          <w:szCs w:val="24"/>
+          <w:lang w:val="en-US"/>
+        </w:rPr>
+        <w:t>Apache product</w:t>
+      </w:r>
+    </w:p>
+    <w:p>
+      <w:pPr>
+        <w:pStyle w:val="ListParagraph"/>
+        <w:numPr>
+          <w:ilvl w:val="0"/>
+          <w:numId w:val="35"/>
+        </w:numPr>
+        <w:rPr>
+          <w:sz w:val="26"/>
+          <w:szCs w:val="24"/>
+          <w:lang w:val="en-US"/>
+        </w:rPr>
+      </w:pPr>
+      <w:r>
+        <w:rPr>
+          <w:sz w:val="26"/>
+          <w:szCs w:val="24"/>
+          <w:lang w:val="en-US"/>
+        </w:rPr>
+        <w:t>Can be used by both developer and tester</w:t>
+      </w:r>
+    </w:p>
+    <w:p>
+      <w:pPr>
+        <w:pStyle w:val="ListParagraph"/>
+        <w:numPr>
+          <w:ilvl w:val="0"/>
+          <w:numId w:val="35"/>
+        </w:numPr>
+        <w:rPr>
+          <w:sz w:val="26"/>
+          <w:szCs w:val="24"/>
+          <w:lang w:val="en-US"/>
+        </w:rPr>
+      </w:pPr>
+      <w:r>
+        <w:rPr>
+          <w:sz w:val="26"/>
+          <w:szCs w:val="24"/>
+          <w:lang w:val="en-US"/>
+        </w:rPr>
+        <w:t>Both developer and tester can use a single project</w:t>
+      </w:r>
+    </w:p>
+    <w:p>
+      <w:pPr>
+        <w:pStyle w:val="ListParagraph"/>
+        <w:numPr>
+          <w:ilvl w:val="0"/>
+          <w:numId w:val="35"/>
+        </w:numPr>
+        <w:rPr>
+          <w:sz w:val="26"/>
+          <w:szCs w:val="24"/>
+          <w:lang w:val="en-US"/>
+        </w:rPr>
+      </w:pPr>
+      <w:r>
+        <w:rPr>
+          <w:sz w:val="26"/>
+          <w:szCs w:val="24"/>
+          <w:lang w:val="en-US"/>
+        </w:rPr>
+        <w:t>Uses dependencies (6-7 lines of the code that will automatically add the required jar files.)</w:t>
+      </w:r>
+    </w:p>
+    <w:p>
+      <w:pPr>
+        <w:pStyle w:val="ListParagraph"/>
+        <w:numPr>
+          <w:ilvl w:val="0"/>
+          <w:numId w:val="35"/>
+        </w:numPr>
+        <w:rPr>
+          <w:sz w:val="26"/>
+          <w:szCs w:val="24"/>
+          <w:lang w:val="en-US"/>
+        </w:rPr>
+      </w:pPr>
+      <w:r>
+        <w:rPr>
+          <w:sz w:val="26"/>
+          <w:szCs w:val="24"/>
+          <w:lang w:val="en-US"/>
+        </w:rPr>
+        <w:t>Easy configuration via pom.xml file (Project Object Model)</w:t>
+      </w:r>
+    </w:p>
+    <w:p>
+      <w:pPr>
+        <w:rPr>
+          <w:sz w:val="26"/>
+          <w:szCs w:val="24"/>
+          <w:lang w:val="en-US"/>
+        </w:rPr>
+      </w:pPr>
+    </w:p>
+    <w:p>
+      <w:pPr>
+        <w:rPr>
+          <w:b/>
+          <w:bCs/>
+          <w:sz w:val="26"/>
+          <w:szCs w:val="24"/>
+          <w:lang w:val="en-US"/>
+        </w:rPr>
+      </w:pPr>
+      <w:r>
+        <w:rPr>
+          <w:b/>
+          <w:bCs/>
+          <w:sz w:val="26"/>
+          <w:szCs w:val="24"/>
+          <w:lang w:val="en-US"/>
+        </w:rPr>
+        <w:t>Maven Projects</w:t>
+      </w:r>
+    </w:p>
+    <w:p>
+      <w:pPr>
+        <w:pStyle w:val="ListParagraph"/>
+        <w:numPr>
+          <w:ilvl w:val="0"/>
+          <w:numId w:val="37"/>
+        </w:numPr>
+        <w:rPr>
+          <w:sz w:val="26"/>
+          <w:szCs w:val="24"/>
+          <w:lang w:val="en-US"/>
+        </w:rPr>
+      </w:pPr>
+      <w:r>
+        <w:rPr>
+          <w:sz w:val="26"/>
+          <w:szCs w:val="24"/>
+          <w:lang w:val="en-US"/>
+        </w:rPr>
+        <w:t>With Archetype</w:t>
+      </w:r>
+      <w:r>
+        <w:rPr>
+          <w:sz w:val="26"/>
+          <w:szCs w:val="24"/>
+          <w:lang w:val="en-US"/>
+        </w:rPr>
+        <w:t xml:space="preserve"> </w:t>
+      </w:r>
+      <w:r>
+        <w:rPr>
+          <w:sz w:val="26"/>
+          <w:szCs w:val="24"/>
+          <w:lang w:val="en-US"/>
+        </w:rPr>
+        <w:sym w:font="Wingdings" w:char="F0E0"/>
+      </w:r>
+      <w:r>
+        <w:rPr>
+          <w:sz w:val="26"/>
+          <w:szCs w:val="24"/>
+          <w:lang w:val="en-US"/>
+        </w:rPr>
+        <w:t xml:space="preserve"> Readymade project structure, ready configuration</w:t>
+      </w:r>
+      <w:r>
+        <w:rPr>
+          <w:sz w:val="26"/>
+          <w:szCs w:val="24"/>
+          <w:lang w:val="en-US"/>
+        </w:rPr>
+        <w:t xml:space="preserve"> </w:t>
+      </w:r>
+    </w:p>
+    <w:p>
+      <w:pPr>
+        <w:pStyle w:val="ListParagraph"/>
+        <w:numPr>
+          <w:ilvl w:val="0"/>
+          <w:numId w:val="37"/>
+        </w:numPr>
+        <w:rPr>
+          <w:sz w:val="26"/>
+          <w:szCs w:val="24"/>
+          <w:lang w:val="en-US"/>
+        </w:rPr>
+      </w:pPr>
+      <w:r>
+        <w:rPr>
+          <w:sz w:val="26"/>
+          <w:szCs w:val="24"/>
+          <w:lang w:val="en-US"/>
+        </w:rPr>
+        <w:t>Without Archetype</w:t>
+      </w:r>
+      <w:r>
+        <w:rPr>
+          <w:sz w:val="26"/>
+          <w:szCs w:val="24"/>
+          <w:lang w:val="en-US"/>
+        </w:rPr>
+        <w:t xml:space="preserve"> </w:t>
+      </w:r>
+      <w:r>
+        <w:rPr>
+          <w:sz w:val="26"/>
+          <w:szCs w:val="24"/>
+          <w:lang w:val="en-US"/>
+        </w:rPr>
+        <w:sym w:font="Wingdings" w:char="F0E0"/>
+      </w:r>
+      <w:r>
+        <w:rPr>
+          <w:sz w:val="26"/>
+          <w:szCs w:val="24"/>
+          <w:lang w:val="en-US"/>
+        </w:rPr>
+        <w:t xml:space="preserve"> </w:t>
+      </w:r>
+    </w:p>
+    <w:p>
+      <w:pPr>
+        <w:rPr>
+          <w:sz w:val="26"/>
+          <w:szCs w:val="24"/>
+          <w:lang w:val="en-US"/>
+        </w:rPr>
+      </w:pPr>
+    </w:p>
+    <w:p>
+      <w:pPr>
+        <w:rPr>
+          <w:b/>
+          <w:bCs/>
+          <w:sz w:val="26"/>
+          <w:szCs w:val="24"/>
+          <w:lang w:val="en-US"/>
+        </w:rPr>
+      </w:pPr>
+      <w:r>
+        <w:rPr>
+          <w:b/>
+          <w:bCs/>
+          <w:sz w:val="26"/>
+          <w:szCs w:val="24"/>
+          <w:lang w:val="en-US"/>
+        </w:rPr>
+        <w:t>Creating Maven Project</w:t>
+      </w:r>
+    </w:p>
+    <w:p>
+      <w:pPr>
+        <w:pStyle w:val="ListParagraph"/>
+        <w:numPr>
+          <w:ilvl w:val="0"/>
+          <w:numId w:val="36"/>
+        </w:numPr>
+        <w:rPr>
+          <w:sz w:val="26"/>
+          <w:szCs w:val="24"/>
+          <w:lang w:val="en-US"/>
+        </w:rPr>
+      </w:pPr>
+      <w:r>
+        <w:rPr>
+          <w:sz w:val="26"/>
+          <w:szCs w:val="24"/>
+          <w:lang w:val="en-US"/>
+        </w:rPr>
+        <w:t xml:space="preserve">File </w:t>
+      </w:r>
+      <w:r>
+        <w:rPr>
+          <w:sz w:val="26"/>
+          <w:szCs w:val="24"/>
+          <w:lang w:val="en-US"/>
+        </w:rPr>
+        <w:sym w:font="Wingdings" w:char="F0E0"/>
+      </w:r>
+      <w:r>
+        <w:rPr>
+          <w:sz w:val="26"/>
+          <w:szCs w:val="24"/>
+          <w:lang w:val="en-US"/>
+        </w:rPr>
+        <w:t xml:space="preserve"> New </w:t>
+      </w:r>
+      <w:r>
+        <w:rPr>
+          <w:sz w:val="26"/>
+          <w:szCs w:val="24"/>
+          <w:lang w:val="en-US"/>
+        </w:rPr>
+        <w:sym w:font="Wingdings" w:char="F0E0"/>
+      </w:r>
+      <w:r>
+        <w:rPr>
+          <w:sz w:val="26"/>
+          <w:szCs w:val="24"/>
+          <w:lang w:val="en-US"/>
+        </w:rPr>
+        <w:t xml:space="preserve"> Maven Project</w:t>
+      </w:r>
+    </w:p>
+    <w:p>
+      <w:pPr>
+        <w:pStyle w:val="ListParagraph"/>
+        <w:numPr>
+          <w:ilvl w:val="0"/>
+          <w:numId w:val="36"/>
+        </w:numPr>
+        <w:rPr>
+          <w:sz w:val="26"/>
+          <w:szCs w:val="24"/>
+          <w:lang w:val="en-US"/>
+        </w:rPr>
+      </w:pPr>
+      <w:r>
+        <w:rPr>
+          <w:sz w:val="26"/>
+          <w:szCs w:val="24"/>
+          <w:lang w:val="en-US"/>
+        </w:rPr>
+        <w:t>Select the third check box (Add project to working set)</w:t>
+      </w:r>
+    </w:p>
+    <w:p>
+      <w:pPr>
+        <w:pStyle w:val="ListParagraph"/>
+        <w:numPr>
+          <w:ilvl w:val="0"/>
+          <w:numId w:val="36"/>
+        </w:numPr>
+        <w:rPr>
+          <w:sz w:val="26"/>
+          <w:szCs w:val="24"/>
+          <w:lang w:val="en-US"/>
+        </w:rPr>
+      </w:pPr>
+      <w:bookmarkStart w:id="0" w:name="_GoBack"/>
+      <w:bookmarkEnd w:id="0"/>
     </w:p>
     <w:sectPr>
       <w:pgSz w:w="11906" w:h="16838"/>
@@ -10081,6 +10946,119 @@
     </w:lvl>
   </w:abstractNum>
   <w:abstractNum w:abstractNumId="15">
+    <w:nsid w:val="256A1A67"/>
+    <w:multiLevelType w:val="hybridMultilevel"/>
+    <w:tmpl w:val="2482F060"/>
+    <w:lvl w:ilvl="0" w:tplc="40090001">
+      <w:start w:val="1"/>
+      <w:numFmt w:val="bullet"/>
+      <w:lvlText w:val=""/>
+      <w:lvlJc w:val="left"/>
+      <w:pPr>
+        <w:ind w:left="720" w:hanging="360"/>
+      </w:pPr>
+      <w:rPr>
+        <w:rFonts w:ascii="Symbol" w:hAnsi="Symbol" w:hint="default"/>
+      </w:rPr>
+    </w:lvl>
+    <w:lvl w:ilvl="1" w:tplc="40090003" w:tentative="1">
+      <w:start w:val="1"/>
+      <w:numFmt w:val="bullet"/>
+      <w:lvlText w:val="o"/>
+      <w:lvlJc w:val="left"/>
+      <w:pPr>
+        <w:ind w:left="1440" w:hanging="360"/>
+      </w:pPr>
+      <w:rPr>
+        <w:rFonts w:ascii="Courier New" w:hAnsi="Courier New" w:cs="Courier New" w:hint="default"/>
+      </w:rPr>
+    </w:lvl>
+    <w:lvl w:ilvl="2" w:tplc="40090005" w:tentative="1">
+      <w:start w:val="1"/>
+      <w:numFmt w:val="bullet"/>
+      <w:lvlText w:val=""/>
+      <w:lvlJc w:val="left"/>
+      <w:pPr>
+        <w:ind w:left="2160" w:hanging="360"/>
+      </w:pPr>
+      <w:rPr>
+        <w:rFonts w:ascii="Wingdings" w:hAnsi="Wingdings" w:hint="default"/>
+      </w:rPr>
+    </w:lvl>
+    <w:lvl w:ilvl="3" w:tplc="40090001" w:tentative="1">
+      <w:start w:val="1"/>
+      <w:numFmt w:val="bullet"/>
+      <w:lvlText w:val=""/>
+      <w:lvlJc w:val="left"/>
+      <w:pPr>
+        <w:ind w:left="2880" w:hanging="360"/>
+      </w:pPr>
+      <w:rPr>
+        <w:rFonts w:ascii="Symbol" w:hAnsi="Symbol" w:hint="default"/>
+      </w:rPr>
+    </w:lvl>
+    <w:lvl w:ilvl="4" w:tplc="40090003" w:tentative="1">
+      <w:start w:val="1"/>
+      <w:numFmt w:val="bullet"/>
+      <w:lvlText w:val="o"/>
+      <w:lvlJc w:val="left"/>
+      <w:pPr>
+        <w:ind w:left="3600" w:hanging="360"/>
+      </w:pPr>
+      <w:rPr>
+        <w:rFonts w:ascii="Courier New" w:hAnsi="Courier New" w:cs="Courier New" w:hint="default"/>
+      </w:rPr>
+    </w:lvl>
+    <w:lvl w:ilvl="5" w:tplc="40090005" w:tentative="1">
+      <w:start w:val="1"/>
+      <w:numFmt w:val="bullet"/>
+      <w:lvlText w:val=""/>
+      <w:lvlJc w:val="left"/>
+      <w:pPr>
+        <w:ind w:left="4320" w:hanging="360"/>
+      </w:pPr>
+      <w:rPr>
+        <w:rFonts w:ascii="Wingdings" w:hAnsi="Wingdings" w:hint="default"/>
+      </w:rPr>
+    </w:lvl>
+    <w:lvl w:ilvl="6" w:tplc="40090001" w:tentative="1">
+      <w:start w:val="1"/>
+      <w:numFmt w:val="bullet"/>
+      <w:lvlText w:val=""/>
+      <w:lvlJc w:val="left"/>
+      <w:pPr>
+        <w:ind w:left="5040" w:hanging="360"/>
+      </w:pPr>
+      <w:rPr>
+        <w:rFonts w:ascii="Symbol" w:hAnsi="Symbol" w:hint="default"/>
+      </w:rPr>
+    </w:lvl>
+    <w:lvl w:ilvl="7" w:tplc="40090003" w:tentative="1">
+      <w:start w:val="1"/>
+      <w:numFmt w:val="bullet"/>
+      <w:lvlText w:val="o"/>
+      <w:lvlJc w:val="left"/>
+      <w:pPr>
+        <w:ind w:left="5760" w:hanging="360"/>
+      </w:pPr>
+      <w:rPr>
+        <w:rFonts w:ascii="Courier New" w:hAnsi="Courier New" w:cs="Courier New" w:hint="default"/>
+      </w:rPr>
+    </w:lvl>
+    <w:lvl w:ilvl="8" w:tplc="40090005" w:tentative="1">
+      <w:start w:val="1"/>
+      <w:numFmt w:val="bullet"/>
+      <w:lvlText w:val=""/>
+      <w:lvlJc w:val="left"/>
+      <w:pPr>
+        <w:ind w:left="6480" w:hanging="360"/>
+      </w:pPr>
+      <w:rPr>
+        <w:rFonts w:ascii="Wingdings" w:hAnsi="Wingdings" w:hint="default"/>
+      </w:rPr>
+    </w:lvl>
+  </w:abstractNum>
+  <w:abstractNum w:abstractNumId="16">
     <w:nsid w:val="2E0E1364"/>
     <w:multiLevelType w:val="hybridMultilevel"/>
     <w:tmpl w:val="40CC5AC4"/>
@@ -10169,7 +11147,7 @@
       </w:pPr>
     </w:lvl>
   </w:abstractNum>
-  <w:abstractNum w:abstractNumId="16">
+  <w:abstractNum w:abstractNumId="17">
     <w:nsid w:val="360C28AB"/>
     <w:multiLevelType w:val="hybridMultilevel"/>
     <w:tmpl w:val="D910DDB6"/>
@@ -10282,7 +11260,7 @@
       </w:rPr>
     </w:lvl>
   </w:abstractNum>
-  <w:abstractNum w:abstractNumId="17">
+  <w:abstractNum w:abstractNumId="18">
     <w:nsid w:val="38846546"/>
     <w:multiLevelType w:val="hybridMultilevel"/>
     <w:tmpl w:val="86F02860"/>
@@ -10371,7 +11349,7 @@
       </w:pPr>
     </w:lvl>
   </w:abstractNum>
-  <w:abstractNum w:abstractNumId="18">
+  <w:abstractNum w:abstractNumId="19">
     <w:nsid w:val="39C45A17"/>
     <w:multiLevelType w:val="hybridMultilevel"/>
     <w:tmpl w:val="7BCE0EDE"/>
@@ -10460,7 +11438,7 @@
       </w:pPr>
     </w:lvl>
   </w:abstractNum>
-  <w:abstractNum w:abstractNumId="19">
+  <w:abstractNum w:abstractNumId="20">
     <w:nsid w:val="3C0D7148"/>
     <w:multiLevelType w:val="hybridMultilevel"/>
     <w:tmpl w:val="61EAC19E"/>
@@ -10549,7 +11527,7 @@
       </w:pPr>
     </w:lvl>
   </w:abstractNum>
-  <w:abstractNum w:abstractNumId="20">
+  <w:abstractNum w:abstractNumId="21">
     <w:nsid w:val="3EC7092E"/>
     <w:multiLevelType w:val="hybridMultilevel"/>
     <w:tmpl w:val="BEB82898"/>
@@ -10638,7 +11616,7 @@
       </w:pPr>
     </w:lvl>
   </w:abstractNum>
-  <w:abstractNum w:abstractNumId="21">
+  <w:abstractNum w:abstractNumId="22">
     <w:nsid w:val="3FEE48BD"/>
     <w:multiLevelType w:val="hybridMultilevel"/>
     <w:tmpl w:val="7D7C81C4"/>
@@ -10727,7 +11705,7 @@
       </w:pPr>
     </w:lvl>
   </w:abstractNum>
-  <w:abstractNum w:abstractNumId="22">
+  <w:abstractNum w:abstractNumId="23">
     <w:nsid w:val="403F7638"/>
     <w:multiLevelType w:val="hybridMultilevel"/>
     <w:tmpl w:val="49801E86"/>
@@ -10816,7 +11794,7 @@
       </w:pPr>
     </w:lvl>
   </w:abstractNum>
-  <w:abstractNum w:abstractNumId="23">
+  <w:abstractNum w:abstractNumId="24">
     <w:nsid w:val="430B4440"/>
     <w:multiLevelType w:val="hybridMultilevel"/>
     <w:tmpl w:val="2B70B9E6"/>
@@ -10929,7 +11907,7 @@
       </w:rPr>
     </w:lvl>
   </w:abstractNum>
-  <w:abstractNum w:abstractNumId="24">
+  <w:abstractNum w:abstractNumId="25">
     <w:nsid w:val="46A73B9B"/>
     <w:multiLevelType w:val="hybridMultilevel"/>
     <w:tmpl w:val="EAA08C1C"/>
@@ -11018,7 +11996,7 @@
       </w:pPr>
     </w:lvl>
   </w:abstractNum>
-  <w:abstractNum w:abstractNumId="25">
+  <w:abstractNum w:abstractNumId="26">
     <w:nsid w:val="4EBA6DD1"/>
     <w:multiLevelType w:val="hybridMultilevel"/>
     <w:tmpl w:val="60C02E0C"/>
@@ -11107,7 +12085,96 @@
       </w:pPr>
     </w:lvl>
   </w:abstractNum>
-  <w:abstractNum w:abstractNumId="26">
+  <w:abstractNum w:abstractNumId="27">
+    <w:nsid w:val="511B2F49"/>
+    <w:multiLevelType w:val="hybridMultilevel"/>
+    <w:tmpl w:val="9A3C8644"/>
+    <w:lvl w:ilvl="0" w:tplc="4009000F">
+      <w:start w:val="1"/>
+      <w:numFmt w:val="decimal"/>
+      <w:lvlText w:val="%1."/>
+      <w:lvlJc w:val="left"/>
+      <w:pPr>
+        <w:ind w:left="720" w:hanging="360"/>
+      </w:pPr>
+      <w:rPr>
+        <w:rFonts w:hint="default"/>
+      </w:rPr>
+    </w:lvl>
+    <w:lvl w:ilvl="1" w:tplc="40090019" w:tentative="1">
+      <w:start w:val="1"/>
+      <w:numFmt w:val="lowerLetter"/>
+      <w:lvlText w:val="%2."/>
+      <w:lvlJc w:val="left"/>
+      <w:pPr>
+        <w:ind w:left="1440" w:hanging="360"/>
+      </w:pPr>
+    </w:lvl>
+    <w:lvl w:ilvl="2" w:tplc="4009001B" w:tentative="1">
+      <w:start w:val="1"/>
+      <w:numFmt w:val="lowerRoman"/>
+      <w:lvlText w:val="%3."/>
+      <w:lvlJc w:val="right"/>
+      <w:pPr>
+        <w:ind w:left="2160" w:hanging="180"/>
+      </w:pPr>
+    </w:lvl>
+    <w:lvl w:ilvl="3" w:tplc="4009000F" w:tentative="1">
+      <w:start w:val="1"/>
+      <w:numFmt w:val="decimal"/>
+      <w:lvlText w:val="%4."/>
+      <w:lvlJc w:val="left"/>
+      <w:pPr>
+        <w:ind w:left="2880" w:hanging="360"/>
+      </w:pPr>
+    </w:lvl>
+    <w:lvl w:ilvl="4" w:tplc="40090019" w:tentative="1">
+      <w:start w:val="1"/>
+      <w:numFmt w:val="lowerLetter"/>
+      <w:lvlText w:val="%5."/>
+      <w:lvlJc w:val="left"/>
+      <w:pPr>
+        <w:ind w:left="3600" w:hanging="360"/>
+      </w:pPr>
+    </w:lvl>
+    <w:lvl w:ilvl="5" w:tplc="4009001B" w:tentative="1">
+      <w:start w:val="1"/>
+      <w:numFmt w:val="lowerRoman"/>
+      <w:lvlText w:val="%6."/>
+      <w:lvlJc w:val="right"/>
+      <w:pPr>
+        <w:ind w:left="4320" w:hanging="180"/>
+      </w:pPr>
+    </w:lvl>
+    <w:lvl w:ilvl="6" w:tplc="4009000F" w:tentative="1">
+      <w:start w:val="1"/>
+      <w:numFmt w:val="decimal"/>
+      <w:lvlText w:val="%7."/>
+      <w:lvlJc w:val="left"/>
+      <w:pPr>
+        <w:ind w:left="5040" w:hanging="360"/>
+      </w:pPr>
+    </w:lvl>
+    <w:lvl w:ilvl="7" w:tplc="40090019" w:tentative="1">
+      <w:start w:val="1"/>
+      <w:numFmt w:val="lowerLetter"/>
+      <w:lvlText w:val="%8."/>
+      <w:lvlJc w:val="left"/>
+      <w:pPr>
+        <w:ind w:left="5760" w:hanging="360"/>
+      </w:pPr>
+    </w:lvl>
+    <w:lvl w:ilvl="8" w:tplc="4009001B" w:tentative="1">
+      <w:start w:val="1"/>
+      <w:numFmt w:val="lowerRoman"/>
+      <w:lvlText w:val="%9."/>
+      <w:lvlJc w:val="right"/>
+      <w:pPr>
+        <w:ind w:left="6480" w:hanging="180"/>
+      </w:pPr>
+    </w:lvl>
+  </w:abstractNum>
+  <w:abstractNum w:abstractNumId="28">
     <w:nsid w:val="515E3FEC"/>
     <w:multiLevelType w:val="hybridMultilevel"/>
     <w:tmpl w:val="E902866C"/>
@@ -11220,7 +12287,7 @@
       </w:rPr>
     </w:lvl>
   </w:abstractNum>
-  <w:abstractNum w:abstractNumId="27">
+  <w:abstractNum w:abstractNumId="29">
     <w:nsid w:val="529E3796"/>
     <w:multiLevelType w:val="hybridMultilevel"/>
     <w:tmpl w:val="AB520516"/>
@@ -11309,7 +12376,7 @@
       </w:pPr>
     </w:lvl>
   </w:abstractNum>
-  <w:abstractNum w:abstractNumId="28">
+  <w:abstractNum w:abstractNumId="30">
     <w:nsid w:val="55816A8D"/>
     <w:multiLevelType w:val="hybridMultilevel"/>
     <w:tmpl w:val="1200EDB6"/>
@@ -11398,7 +12465,7 @@
       </w:pPr>
     </w:lvl>
   </w:abstractNum>
-  <w:abstractNum w:abstractNumId="29">
+  <w:abstractNum w:abstractNumId="31">
     <w:nsid w:val="60166BF6"/>
     <w:multiLevelType w:val="hybridMultilevel"/>
     <w:tmpl w:val="1A2C61F4"/>
@@ -11511,7 +12578,7 @@
       </w:rPr>
     </w:lvl>
   </w:abstractNum>
-  <w:abstractNum w:abstractNumId="30">
+  <w:abstractNum w:abstractNumId="32">
     <w:nsid w:val="61194B06"/>
     <w:multiLevelType w:val="hybridMultilevel"/>
     <w:tmpl w:val="348E9CA8"/>
@@ -11601,7 +12668,7 @@
       </w:pPr>
     </w:lvl>
   </w:abstractNum>
-  <w:abstractNum w:abstractNumId="31">
+  <w:abstractNum w:abstractNumId="33">
     <w:nsid w:val="669D6C41"/>
     <w:multiLevelType w:val="hybridMultilevel"/>
     <w:tmpl w:val="9E22EC66"/>
@@ -11714,7 +12781,7 @@
       </w:rPr>
     </w:lvl>
   </w:abstractNum>
-  <w:abstractNum w:abstractNumId="32">
+  <w:abstractNum w:abstractNumId="34">
     <w:nsid w:val="6DE40AAE"/>
     <w:multiLevelType w:val="hybridMultilevel"/>
     <w:tmpl w:val="8A1CE40E"/>
@@ -11803,7 +12870,7 @@
       </w:pPr>
     </w:lvl>
   </w:abstractNum>
-  <w:abstractNum w:abstractNumId="33">
+  <w:abstractNum w:abstractNumId="35">
     <w:nsid w:val="771F358C"/>
     <w:multiLevelType w:val="hybridMultilevel"/>
     <w:tmpl w:val="08E0D094"/>
@@ -11892,11 +12959,100 @@
       </w:pPr>
     </w:lvl>
   </w:abstractNum>
+  <w:abstractNum w:abstractNumId="36">
+    <w:nsid w:val="7F7B6E0C"/>
+    <w:multiLevelType w:val="hybridMultilevel"/>
+    <w:tmpl w:val="1D06EEE4"/>
+    <w:lvl w:ilvl="0" w:tplc="4009000F">
+      <w:start w:val="1"/>
+      <w:numFmt w:val="decimal"/>
+      <w:lvlText w:val="%1."/>
+      <w:lvlJc w:val="left"/>
+      <w:pPr>
+        <w:ind w:left="720" w:hanging="360"/>
+      </w:pPr>
+      <w:rPr>
+        <w:rFonts w:hint="default"/>
+      </w:rPr>
+    </w:lvl>
+    <w:lvl w:ilvl="1" w:tplc="40090019" w:tentative="1">
+      <w:start w:val="1"/>
+      <w:numFmt w:val="lowerLetter"/>
+      <w:lvlText w:val="%2."/>
+      <w:lvlJc w:val="left"/>
+      <w:pPr>
+        <w:ind w:left="1440" w:hanging="360"/>
+      </w:pPr>
+    </w:lvl>
+    <w:lvl w:ilvl="2" w:tplc="4009001B" w:tentative="1">
+      <w:start w:val="1"/>
+      <w:numFmt w:val="lowerRoman"/>
+      <w:lvlText w:val="%3."/>
+      <w:lvlJc w:val="right"/>
+      <w:pPr>
+        <w:ind w:left="2160" w:hanging="180"/>
+      </w:pPr>
+    </w:lvl>
+    <w:lvl w:ilvl="3" w:tplc="4009000F" w:tentative="1">
+      <w:start w:val="1"/>
+      <w:numFmt w:val="decimal"/>
+      <w:lvlText w:val="%4."/>
+      <w:lvlJc w:val="left"/>
+      <w:pPr>
+        <w:ind w:left="2880" w:hanging="360"/>
+      </w:pPr>
+    </w:lvl>
+    <w:lvl w:ilvl="4" w:tplc="40090019" w:tentative="1">
+      <w:start w:val="1"/>
+      <w:numFmt w:val="lowerLetter"/>
+      <w:lvlText w:val="%5."/>
+      <w:lvlJc w:val="left"/>
+      <w:pPr>
+        <w:ind w:left="3600" w:hanging="360"/>
+      </w:pPr>
+    </w:lvl>
+    <w:lvl w:ilvl="5" w:tplc="4009001B" w:tentative="1">
+      <w:start w:val="1"/>
+      <w:numFmt w:val="lowerRoman"/>
+      <w:lvlText w:val="%6."/>
+      <w:lvlJc w:val="right"/>
+      <w:pPr>
+        <w:ind w:left="4320" w:hanging="180"/>
+      </w:pPr>
+    </w:lvl>
+    <w:lvl w:ilvl="6" w:tplc="4009000F" w:tentative="1">
+      <w:start w:val="1"/>
+      <w:numFmt w:val="decimal"/>
+      <w:lvlText w:val="%7."/>
+      <w:lvlJc w:val="left"/>
+      <w:pPr>
+        <w:ind w:left="5040" w:hanging="360"/>
+      </w:pPr>
+    </w:lvl>
+    <w:lvl w:ilvl="7" w:tplc="40090019" w:tentative="1">
+      <w:start w:val="1"/>
+      <w:numFmt w:val="lowerLetter"/>
+      <w:lvlText w:val="%8."/>
+      <w:lvlJc w:val="left"/>
+      <w:pPr>
+        <w:ind w:left="5760" w:hanging="360"/>
+      </w:pPr>
+    </w:lvl>
+    <w:lvl w:ilvl="8" w:tplc="4009001B" w:tentative="1">
+      <w:start w:val="1"/>
+      <w:numFmt w:val="lowerRoman"/>
+      <w:lvlText w:val="%9."/>
+      <w:lvlJc w:val="right"/>
+      <w:pPr>
+        <w:ind w:left="6480" w:hanging="180"/>
+      </w:pPr>
+    </w:lvl>
+  </w:abstractNum>
   <w:num w:numId="1">
-    <w:abstractNumId w:val="18"/>
+    <w:abstractNumId w:val="19"/>
   </w:num>
   <w:num w:numId="2">
-    <w:abstractNumId w:val="20"/>
+    <w:abstractNumId w:val="21"/>
   </w:num>
   <w:num w:numId="3">
     <w:abstractNumId w:val="0"/>
@@ -11905,7 +13061,7 @@
     <w:abstractNumId w:val="8"/>
   </w:num>
   <w:num w:numId="5">
-    <w:abstractNumId w:val="22"/>
+    <w:abstractNumId w:val="23"/>
   </w:num>
   <w:num w:numId="6">
     <w:abstractNumId w:val="12"/>
@@ -11914,19 +13070,19 @@
     <w:abstractNumId w:val="6"/>
   </w:num>
   <w:num w:numId="8">
-    <w:abstractNumId w:val="31"/>
+    <w:abstractNumId w:val="33"/>
   </w:num>
   <w:num w:numId="9">
-    <w:abstractNumId w:val="33"/>
+    <w:abstractNumId w:val="35"/>
   </w:num>
   <w:num w:numId="10">
-    <w:abstractNumId w:val="15"/>
+    <w:abstractNumId w:val="16"/>
   </w:num>
   <w:num w:numId="11">
-    <w:abstractNumId w:val="21"/>
+    <w:abstractNumId w:val="22"/>
   </w:num>
   <w:num w:numId="12">
-    <w:abstractNumId w:val="19"/>
+    <w:abstractNumId w:val="20"/>
   </w:num>
   <w:num w:numId="13">
     <w:abstractNumId w:val="5"/>
@@ -11935,37 +13091,37 @@
     <w:abstractNumId w:val="7"/>
   </w:num>
   <w:num w:numId="15">
-    <w:abstractNumId w:val="32"/>
+    <w:abstractNumId w:val="34"/>
   </w:num>
   <w:num w:numId="16">
     <w:abstractNumId w:val="3"/>
   </w:num>
   <w:num w:numId="17">
-    <w:abstractNumId w:val="27"/>
+    <w:abstractNumId w:val="29"/>
   </w:num>
   <w:num w:numId="18">
-    <w:abstractNumId w:val="29"/>
+    <w:abstractNumId w:val="31"/>
   </w:num>
   <w:num w:numId="19">
     <w:abstractNumId w:val="13"/>
   </w:num>
   <w:num w:numId="20">
-    <w:abstractNumId w:val="28"/>
+    <w:abstractNumId w:val="30"/>
   </w:num>
   <w:num w:numId="21">
     <w:abstractNumId w:val="1"/>
   </w:num>
   <w:num w:numId="22">
-    <w:abstractNumId w:val="17"/>
+    <w:abstractNumId w:val="18"/>
   </w:num>
   <w:num w:numId="23">
-    <w:abstractNumId w:val="16"/>
+    <w:abstractNumId w:val="17"/>
   </w:num>
   <w:num w:numId="24">
     <w:abstractNumId w:val="10"/>
   </w:num>
   <w:num w:numId="25">
-    <w:abstractNumId w:val="25"/>
+    <w:abstractNumId w:val="26"/>
   </w:num>
   <w:num w:numId="26">
     <w:abstractNumId w:val="4"/>
@@ -11977,22 +13133,31 @@
     <w:abstractNumId w:val="9"/>
   </w:num>
   <w:num w:numId="29">
-    <w:abstractNumId w:val="30"/>
+    <w:abstractNumId w:val="32"/>
   </w:num>
   <w:num w:numId="30">
-    <w:abstractNumId w:val="24"/>
+    <w:abstractNumId w:val="25"/>
   </w:num>
   <w:num w:numId="31">
     <w:abstractNumId w:val="14"/>
   </w:num>
   <w:num w:numId="32">
-    <w:abstractNumId w:val="26"/>
+    <w:abstractNumId w:val="28"/>
   </w:num>
   <w:num w:numId="33">
-    <w:abstractNumId w:val="23"/>
+    <w:abstractNumId w:val="24"/>
   </w:num>
   <w:num w:numId="34">
     <w:abstractNumId w:val="2"/>
+  </w:num>
+  <w:num w:numId="35">
+    <w:abstractNumId w:val="15"/>
+  </w:num>
+  <w:num w:numId="36">
+    <w:abstractNumId w:val="27"/>
+  </w:num>
+  <w:num w:numId="37">
+    <w:abstractNumId w:val="36"/>
   </w:num>
 </w:numbering>
 </file>

</xml_diff>

<commit_message>
Date: 09 Jan 2026
</commit_message>
<xml_diff>
--- a/Notes_Selenium_15.docx
+++ b/Notes_Selenium_15.docx
@@ -9642,6 +9642,920 @@
     </w:p>
     <w:p>
       <w:pPr>
+        <w:pBdr>
+          <w:bottom w:val="single" w:sz="6" w:space="1" w:color="auto"/>
+        </w:pBdr>
+        <w:rPr>
+          <w:sz w:val="26"/>
+          <w:szCs w:val="24"/>
+          <w:lang w:val="en-US"/>
+        </w:rPr>
+      </w:pPr>
+    </w:p>
+    <w:p>
+      <w:pPr>
+        <w:rPr>
+          <w:b/>
+          <w:bCs/>
+          <w:sz w:val="26"/>
+          <w:szCs w:val="24"/>
+          <w:lang w:val="en-US"/>
+        </w:rPr>
+      </w:pPr>
+      <w:r>
+        <w:rPr>
+          <w:b/>
+          <w:bCs/>
+          <w:sz w:val="26"/>
+          <w:szCs w:val="24"/>
+          <w:lang w:val="en-US"/>
+        </w:rPr>
+        <w:t>Feature File</w:t>
+      </w:r>
+    </w:p>
+    <w:p>
+      <w:pPr>
+        <w:pStyle w:val="ListParagraph"/>
+        <w:numPr>
+          <w:ilvl w:val="0"/>
+          <w:numId w:val="41"/>
+        </w:numPr>
+        <w:rPr>
+          <w:sz w:val="26"/>
+          <w:szCs w:val="24"/>
+          <w:lang w:val="en-US"/>
+        </w:rPr>
+      </w:pPr>
+      <w:r>
+        <w:rPr>
+          <w:sz w:val="26"/>
+          <w:szCs w:val="24"/>
+          <w:lang w:val="en-US"/>
+        </w:rPr>
+        <w:t>Collection of Test Scenarios</w:t>
+      </w:r>
+    </w:p>
+    <w:p>
+      <w:pPr>
+        <w:pStyle w:val="ListParagraph"/>
+        <w:numPr>
+          <w:ilvl w:val="0"/>
+          <w:numId w:val="41"/>
+        </w:numPr>
+        <w:rPr>
+          <w:sz w:val="26"/>
+          <w:szCs w:val="24"/>
+          <w:lang w:val="en-US"/>
+        </w:rPr>
+      </w:pPr>
+      <w:r>
+        <w:rPr>
+          <w:sz w:val="26"/>
+          <w:szCs w:val="24"/>
+          <w:lang w:val="en-US"/>
+        </w:rPr>
+        <w:t>Created using Gherkin Language</w:t>
+      </w:r>
+    </w:p>
+    <w:p>
+      <w:pPr>
+        <w:pStyle w:val="ListParagraph"/>
+        <w:numPr>
+          <w:ilvl w:val="0"/>
+          <w:numId w:val="41"/>
+        </w:numPr>
+        <w:rPr>
+          <w:sz w:val="26"/>
+          <w:szCs w:val="24"/>
+          <w:lang w:val="en-US"/>
+        </w:rPr>
+      </w:pPr>
+      <w:r>
+        <w:rPr>
+          <w:sz w:val="26"/>
+          <w:szCs w:val="24"/>
+          <w:lang w:val="en-US"/>
+        </w:rPr>
+        <w:t>Having extension .feature</w:t>
+      </w:r>
+    </w:p>
+    <w:p>
+      <w:pPr>
+        <w:pStyle w:val="ListParagraph"/>
+        <w:numPr>
+          <w:ilvl w:val="0"/>
+          <w:numId w:val="41"/>
+        </w:numPr>
+        <w:rPr>
+          <w:sz w:val="26"/>
+          <w:szCs w:val="24"/>
+          <w:lang w:val="en-US"/>
+        </w:rPr>
+      </w:pPr>
+      <w:r>
+        <w:rPr>
+          <w:sz w:val="26"/>
+          <w:szCs w:val="24"/>
+          <w:lang w:val="en-US"/>
+        </w:rPr>
+        <w:t>Created using keywords</w:t>
+      </w:r>
+    </w:p>
+    <w:p>
+      <w:pPr>
+        <w:pStyle w:val="ListParagraph"/>
+        <w:numPr>
+          <w:ilvl w:val="1"/>
+          <w:numId w:val="41"/>
+        </w:numPr>
+        <w:rPr>
+          <w:sz w:val="26"/>
+          <w:szCs w:val="24"/>
+          <w:lang w:val="en-US"/>
+        </w:rPr>
+      </w:pPr>
+      <w:r>
+        <w:rPr>
+          <w:sz w:val="26"/>
+          <w:szCs w:val="24"/>
+          <w:lang w:val="en-US"/>
+        </w:rPr>
+        <w:t xml:space="preserve">Feature: </w:t>
+      </w:r>
+      <w:r>
+        <w:rPr>
+          <w:sz w:val="26"/>
+          <w:szCs w:val="24"/>
+          <w:lang w:val="en-US"/>
+        </w:rPr>
+        <w:sym w:font="Wingdings" w:char="F0E0"/>
+      </w:r>
+      <w:r>
+        <w:rPr>
+          <w:sz w:val="26"/>
+          <w:szCs w:val="24"/>
+          <w:lang w:val="en-US"/>
+        </w:rPr>
+        <w:t xml:space="preserve"> Represents the requirement</w:t>
+      </w:r>
+    </w:p>
+    <w:p>
+      <w:pPr>
+        <w:pStyle w:val="ListParagraph"/>
+        <w:numPr>
+          <w:ilvl w:val="1"/>
+          <w:numId w:val="41"/>
+        </w:numPr>
+        <w:rPr>
+          <w:sz w:val="26"/>
+          <w:szCs w:val="24"/>
+          <w:lang w:val="en-US"/>
+        </w:rPr>
+      </w:pPr>
+      <w:r>
+        <w:rPr>
+          <w:sz w:val="26"/>
+          <w:szCs w:val="24"/>
+          <w:lang w:val="en-US"/>
+        </w:rPr>
+        <w:t xml:space="preserve">Scenario: </w:t>
+      </w:r>
+      <w:r>
+        <w:rPr>
+          <w:sz w:val="26"/>
+          <w:szCs w:val="24"/>
+          <w:lang w:val="en-US"/>
+        </w:rPr>
+        <w:sym w:font="Wingdings" w:char="F0E0"/>
+      </w:r>
+      <w:r>
+        <w:rPr>
+          <w:sz w:val="26"/>
+          <w:szCs w:val="24"/>
+          <w:lang w:val="en-US"/>
+        </w:rPr>
+        <w:t xml:space="preserve"> Represents test condition / objective</w:t>
+      </w:r>
+    </w:p>
+    <w:p>
+      <w:pPr>
+        <w:pStyle w:val="ListParagraph"/>
+        <w:numPr>
+          <w:ilvl w:val="1"/>
+          <w:numId w:val="41"/>
+        </w:numPr>
+        <w:rPr>
+          <w:sz w:val="26"/>
+          <w:szCs w:val="24"/>
+          <w:lang w:val="en-US"/>
+        </w:rPr>
+      </w:pPr>
+      <w:r>
+        <w:rPr>
+          <w:sz w:val="26"/>
+          <w:szCs w:val="24"/>
+          <w:lang w:val="en-US"/>
+        </w:rPr>
+        <w:t xml:space="preserve">Given </w:t>
+      </w:r>
+      <w:r>
+        <w:rPr>
+          <w:sz w:val="26"/>
+          <w:szCs w:val="24"/>
+          <w:lang w:val="en-US"/>
+        </w:rPr>
+        <w:sym w:font="Wingdings" w:char="F0E0"/>
+      </w:r>
+      <w:r>
+        <w:rPr>
+          <w:sz w:val="26"/>
+          <w:szCs w:val="24"/>
+          <w:lang w:val="en-US"/>
+        </w:rPr>
+        <w:t xml:space="preserve"> Represents pre-requisite</w:t>
+      </w:r>
+    </w:p>
+    <w:p>
+      <w:pPr>
+        <w:pStyle w:val="ListParagraph"/>
+        <w:numPr>
+          <w:ilvl w:val="1"/>
+          <w:numId w:val="41"/>
+        </w:numPr>
+        <w:rPr>
+          <w:sz w:val="26"/>
+          <w:szCs w:val="24"/>
+          <w:lang w:val="en-US"/>
+        </w:rPr>
+      </w:pPr>
+      <w:r>
+        <w:rPr>
+          <w:sz w:val="26"/>
+          <w:szCs w:val="24"/>
+          <w:lang w:val="en-US"/>
+        </w:rPr>
+        <w:t xml:space="preserve">When </w:t>
+      </w:r>
+      <w:r>
+        <w:rPr>
+          <w:sz w:val="26"/>
+          <w:szCs w:val="24"/>
+          <w:lang w:val="en-US"/>
+        </w:rPr>
+        <w:sym w:font="Wingdings" w:char="F0E0"/>
+      </w:r>
+      <w:r>
+        <w:rPr>
+          <w:sz w:val="26"/>
+          <w:szCs w:val="24"/>
+          <w:lang w:val="en-US"/>
+        </w:rPr>
+        <w:t xml:space="preserve"> Represents steps to be performed</w:t>
+      </w:r>
+    </w:p>
+    <w:p>
+      <w:pPr>
+        <w:pStyle w:val="ListParagraph"/>
+        <w:numPr>
+          <w:ilvl w:val="1"/>
+          <w:numId w:val="41"/>
+        </w:numPr>
+        <w:rPr>
+          <w:sz w:val="26"/>
+          <w:szCs w:val="24"/>
+          <w:lang w:val="en-US"/>
+        </w:rPr>
+      </w:pPr>
+      <w:r>
+        <w:rPr>
+          <w:sz w:val="26"/>
+          <w:szCs w:val="24"/>
+          <w:lang w:val="en-US"/>
+        </w:rPr>
+        <w:t xml:space="preserve">And </w:t>
+      </w:r>
+      <w:r>
+        <w:rPr>
+          <w:sz w:val="26"/>
+          <w:szCs w:val="24"/>
+          <w:lang w:val="en-US"/>
+        </w:rPr>
+        <w:sym w:font="Wingdings" w:char="F0E0"/>
+      </w:r>
+      <w:r>
+        <w:rPr>
+          <w:sz w:val="26"/>
+          <w:szCs w:val="24"/>
+          <w:lang w:val="en-US"/>
+        </w:rPr>
+        <w:t xml:space="preserve"> Combine multiple When statements</w:t>
+      </w:r>
+    </w:p>
+    <w:p>
+      <w:pPr>
+        <w:pStyle w:val="ListParagraph"/>
+        <w:numPr>
+          <w:ilvl w:val="1"/>
+          <w:numId w:val="41"/>
+        </w:numPr>
+        <w:rPr>
+          <w:sz w:val="26"/>
+          <w:szCs w:val="24"/>
+          <w:lang w:val="en-US"/>
+        </w:rPr>
+      </w:pPr>
+      <w:r>
+        <w:rPr>
+          <w:sz w:val="26"/>
+          <w:szCs w:val="24"/>
+          <w:lang w:val="en-US"/>
+        </w:rPr>
+        <w:t xml:space="preserve">Then </w:t>
+      </w:r>
+      <w:r>
+        <w:rPr>
+          <w:sz w:val="26"/>
+          <w:szCs w:val="24"/>
+          <w:lang w:val="en-US"/>
+        </w:rPr>
+        <w:sym w:font="Wingdings" w:char="F0E0"/>
+      </w:r>
+      <w:r>
+        <w:rPr>
+          <w:sz w:val="26"/>
+          <w:szCs w:val="24"/>
+          <w:lang w:val="en-US"/>
+        </w:rPr>
+        <w:t xml:space="preserve"> Represents Expected Result</w:t>
+      </w:r>
+    </w:p>
+    <w:p>
+      <w:pPr>
+        <w:pStyle w:val="ListParagraph"/>
+        <w:numPr>
+          <w:ilvl w:val="1"/>
+          <w:numId w:val="41"/>
+        </w:numPr>
+        <w:rPr>
+          <w:sz w:val="26"/>
+          <w:szCs w:val="24"/>
+          <w:lang w:val="en-US"/>
+        </w:rPr>
+      </w:pPr>
+      <w:r>
+        <w:rPr>
+          <w:sz w:val="26"/>
+          <w:szCs w:val="24"/>
+          <w:lang w:val="en-US"/>
+        </w:rPr>
+        <w:t xml:space="preserve">Background: </w:t>
+      </w:r>
+      <w:r>
+        <w:rPr>
+          <w:sz w:val="26"/>
+          <w:szCs w:val="24"/>
+          <w:lang w:val="en-US"/>
+        </w:rPr>
+        <w:sym w:font="Wingdings" w:char="F0E0"/>
+      </w:r>
+      <w:r>
+        <w:rPr>
+          <w:sz w:val="26"/>
+          <w:szCs w:val="24"/>
+          <w:lang w:val="en-US"/>
+        </w:rPr>
+        <w:t xml:space="preserve"> Used to avoid writing multiple Given statement</w:t>
+      </w:r>
+    </w:p>
+    <w:p>
+      <w:pPr>
+        <w:pStyle w:val="ListParagraph"/>
+        <w:numPr>
+          <w:ilvl w:val="1"/>
+          <w:numId w:val="41"/>
+        </w:numPr>
+        <w:rPr>
+          <w:sz w:val="26"/>
+          <w:szCs w:val="24"/>
+          <w:lang w:val="en-US"/>
+        </w:rPr>
+      </w:pPr>
+      <w:r>
+        <w:rPr>
+          <w:sz w:val="26"/>
+          <w:szCs w:val="24"/>
+          <w:lang w:val="en-US"/>
+        </w:rPr>
+        <w:t xml:space="preserve">Examples: </w:t>
+      </w:r>
+      <w:r>
+        <w:rPr>
+          <w:sz w:val="26"/>
+          <w:szCs w:val="24"/>
+          <w:lang w:val="en-US"/>
+        </w:rPr>
+        <w:sym w:font="Wingdings" w:char="F0E0"/>
+      </w:r>
+      <w:r>
+        <w:rPr>
+          <w:sz w:val="26"/>
+          <w:szCs w:val="24"/>
+          <w:lang w:val="en-US"/>
+        </w:rPr>
+        <w:t xml:space="preserve"> Used to implement Data Driven Testing</w:t>
+      </w:r>
+    </w:p>
+    <w:p>
+      <w:pPr>
+        <w:pStyle w:val="ListParagraph"/>
+        <w:numPr>
+          <w:ilvl w:val="1"/>
+          <w:numId w:val="41"/>
+        </w:numPr>
+        <w:rPr>
+          <w:sz w:val="26"/>
+          <w:szCs w:val="24"/>
+          <w:lang w:val="en-US"/>
+        </w:rPr>
+      </w:pPr>
+      <w:r>
+        <w:rPr>
+          <w:sz w:val="26"/>
+          <w:szCs w:val="24"/>
+          <w:lang w:val="en-US"/>
+        </w:rPr>
+        <w:t xml:space="preserve">Scenario Outline: </w:t>
+      </w:r>
+      <w:r>
+        <w:rPr>
+          <w:sz w:val="26"/>
+          <w:szCs w:val="24"/>
+          <w:lang w:val="en-US"/>
+        </w:rPr>
+        <w:sym w:font="Wingdings" w:char="F0E0"/>
+      </w:r>
+      <w:r>
+        <w:rPr>
+          <w:sz w:val="26"/>
+          <w:szCs w:val="24"/>
+          <w:lang w:val="en-US"/>
+        </w:rPr>
+        <w:t xml:space="preserve"> Used when we are passing the data to scenario via Examples (Data Driven Testing)</w:t>
+      </w:r>
+    </w:p>
+    <w:p>
+      <w:pPr>
+        <w:pBdr>
+          <w:bottom w:val="single" w:sz="6" w:space="1" w:color="auto"/>
+        </w:pBdr>
+        <w:rPr>
+          <w:sz w:val="26"/>
+          <w:szCs w:val="24"/>
+          <w:lang w:val="en-US"/>
+        </w:rPr>
+      </w:pPr>
+    </w:p>
+    <w:p>
+      <w:pPr>
+        <w:rPr>
+          <w:sz w:val="26"/>
+          <w:szCs w:val="24"/>
+          <w:lang w:val="en-US"/>
+        </w:rPr>
+      </w:pPr>
+      <w:r>
+        <w:rPr>
+          <w:sz w:val="26"/>
+          <w:szCs w:val="24"/>
+          <w:lang w:val="en-US"/>
+        </w:rPr>
+        <w:t>Requirement: Verify Google Title</w:t>
+      </w:r>
+    </w:p>
+    <w:p>
+      <w:pPr>
+        <w:pStyle w:val="ListParagraph"/>
+        <w:numPr>
+          <w:ilvl w:val="0"/>
+          <w:numId w:val="42"/>
+        </w:numPr>
+        <w:rPr>
+          <w:sz w:val="26"/>
+          <w:szCs w:val="24"/>
+          <w:lang w:val="en-US"/>
+        </w:rPr>
+      </w:pPr>
+      <w:r>
+        <w:rPr>
+          <w:sz w:val="26"/>
+          <w:szCs w:val="24"/>
+          <w:lang w:val="en-US"/>
+        </w:rPr>
+        <w:lastRenderedPageBreak/>
+        <w:t>Open Google</w:t>
+      </w:r>
+    </w:p>
+    <w:p>
+      <w:pPr>
+        <w:pStyle w:val="ListParagraph"/>
+        <w:numPr>
+          <w:ilvl w:val="0"/>
+          <w:numId w:val="42"/>
+        </w:numPr>
+        <w:rPr>
+          <w:sz w:val="26"/>
+          <w:szCs w:val="24"/>
+          <w:lang w:val="en-US"/>
+        </w:rPr>
+      </w:pPr>
+      <w:r>
+        <w:rPr>
+          <w:sz w:val="26"/>
+          <w:szCs w:val="24"/>
+          <w:lang w:val="en-US"/>
+        </w:rPr>
+        <w:t>Read the title</w:t>
+      </w:r>
+    </w:p>
+    <w:p>
+      <w:pPr>
+        <w:pStyle w:val="ListParagraph"/>
+        <w:numPr>
+          <w:ilvl w:val="0"/>
+          <w:numId w:val="42"/>
+        </w:numPr>
+        <w:rPr>
+          <w:sz w:val="26"/>
+          <w:szCs w:val="24"/>
+          <w:lang w:val="en-US"/>
+        </w:rPr>
+      </w:pPr>
+      <w:r>
+        <w:rPr>
+          <w:sz w:val="26"/>
+          <w:szCs w:val="24"/>
+          <w:lang w:val="en-US"/>
+        </w:rPr>
+        <w:t>Verify that title should be Google</w:t>
+      </w:r>
+    </w:p>
+    <w:p>
+      <w:pPr>
+        <w:rPr>
+          <w:b/>
+          <w:bCs/>
+          <w:sz w:val="26"/>
+          <w:szCs w:val="24"/>
+          <w:lang w:val="en-US"/>
+        </w:rPr>
+      </w:pPr>
+      <w:r>
+        <w:rPr>
+          <w:b/>
+          <w:bCs/>
+          <w:sz w:val="26"/>
+          <w:szCs w:val="24"/>
+          <w:lang w:val="en-US"/>
+        </w:rPr>
+        <w:t>Feature File</w:t>
+      </w:r>
+    </w:p>
+    <w:p>
+      <w:pPr>
+        <w:rPr>
+          <w:sz w:val="26"/>
+          <w:szCs w:val="24"/>
+          <w:lang w:val="en-US"/>
+        </w:rPr>
+      </w:pPr>
+      <w:r>
+        <w:rPr>
+          <w:sz w:val="26"/>
+          <w:szCs w:val="24"/>
+          <w:lang w:val="en-US"/>
+        </w:rPr>
+        <w:t>Feature: Google Title</w:t>
+      </w:r>
+    </w:p>
+    <w:p>
+      <w:pPr>
+        <w:rPr>
+          <w:sz w:val="26"/>
+          <w:szCs w:val="24"/>
+          <w:lang w:val="en-US"/>
+        </w:rPr>
+      </w:pPr>
+      <w:r>
+        <w:rPr>
+          <w:sz w:val="26"/>
+          <w:szCs w:val="24"/>
+          <w:lang w:val="en-US"/>
+        </w:rPr>
+        <w:t>Scenario: To validate title of Google page</w:t>
+      </w:r>
+    </w:p>
+    <w:p>
+      <w:pPr>
+        <w:rPr>
+          <w:sz w:val="26"/>
+          <w:szCs w:val="24"/>
+          <w:lang w:val="en-US"/>
+        </w:rPr>
+      </w:pPr>
+      <w:r>
+        <w:rPr>
+          <w:sz w:val="26"/>
+          <w:szCs w:val="24"/>
+          <w:lang w:val="en-US"/>
+        </w:rPr>
+        <w:t>Given Open Google</w:t>
+      </w:r>
+    </w:p>
+    <w:p>
+      <w:pPr>
+        <w:rPr>
+          <w:sz w:val="26"/>
+          <w:szCs w:val="24"/>
+          <w:lang w:val="en-US"/>
+        </w:rPr>
+      </w:pPr>
+      <w:r>
+        <w:rPr>
+          <w:sz w:val="26"/>
+          <w:szCs w:val="24"/>
+          <w:lang w:val="en-US"/>
+        </w:rPr>
+        <w:t>When Capture the title of page</w:t>
+      </w:r>
+    </w:p>
+    <w:p>
+      <w:pPr>
+        <w:rPr>
+          <w:sz w:val="26"/>
+          <w:szCs w:val="24"/>
+          <w:lang w:val="en-US"/>
+        </w:rPr>
+      </w:pPr>
+      <w:r>
+        <w:rPr>
+          <w:sz w:val="26"/>
+          <w:szCs w:val="24"/>
+          <w:lang w:val="en-US"/>
+        </w:rPr>
+        <w:t>Then Title should be Google</w:t>
+      </w:r>
+    </w:p>
+    <w:p>
+      <w:pPr>
+        <w:pBdr>
+          <w:bottom w:val="single" w:sz="6" w:space="1" w:color="auto"/>
+        </w:pBdr>
+        <w:rPr>
+          <w:sz w:val="26"/>
+          <w:szCs w:val="24"/>
+          <w:lang w:val="en-US"/>
+        </w:rPr>
+      </w:pPr>
+    </w:p>
+    <w:p>
+      <w:pPr>
+        <w:rPr>
+          <w:sz w:val="26"/>
+          <w:szCs w:val="24"/>
+          <w:lang w:val="en-US"/>
+        </w:rPr>
+      </w:pPr>
+      <w:r>
+        <w:rPr>
+          <w:sz w:val="26"/>
+          <w:szCs w:val="24"/>
+          <w:lang w:val="en-US"/>
+        </w:rPr>
+        <w:t>Requirement: Search functionality on Google</w:t>
+      </w:r>
+    </w:p>
+    <w:p>
+      <w:pPr>
+        <w:pStyle w:val="ListParagraph"/>
+        <w:numPr>
+          <w:ilvl w:val="0"/>
+          <w:numId w:val="43"/>
+        </w:numPr>
+        <w:rPr>
+          <w:sz w:val="26"/>
+          <w:szCs w:val="24"/>
+          <w:lang w:val="en-US"/>
+        </w:rPr>
+      </w:pPr>
+      <w:r>
+        <w:rPr>
+          <w:sz w:val="26"/>
+          <w:szCs w:val="24"/>
+          <w:lang w:val="en-US"/>
+        </w:rPr>
+        <w:t>Open Google</w:t>
+      </w:r>
+    </w:p>
+    <w:p>
+      <w:pPr>
+        <w:pStyle w:val="ListParagraph"/>
+        <w:numPr>
+          <w:ilvl w:val="0"/>
+          <w:numId w:val="43"/>
+        </w:numPr>
+        <w:rPr>
+          <w:sz w:val="26"/>
+          <w:szCs w:val="24"/>
+          <w:lang w:val="en-US"/>
+        </w:rPr>
+      </w:pPr>
+      <w:r>
+        <w:rPr>
+          <w:sz w:val="26"/>
+          <w:szCs w:val="24"/>
+          <w:lang w:val="en-US"/>
+        </w:rPr>
+        <w:t>Enter text to search in search box</w:t>
+      </w:r>
+    </w:p>
+    <w:p>
+      <w:pPr>
+        <w:pStyle w:val="ListParagraph"/>
+        <w:numPr>
+          <w:ilvl w:val="0"/>
+          <w:numId w:val="43"/>
+        </w:numPr>
+        <w:rPr>
+          <w:sz w:val="26"/>
+          <w:szCs w:val="24"/>
+          <w:lang w:val="en-US"/>
+        </w:rPr>
+      </w:pPr>
+      <w:r>
+        <w:rPr>
+          <w:sz w:val="26"/>
+          <w:szCs w:val="24"/>
+          <w:lang w:val="en-US"/>
+        </w:rPr>
+        <w:t>Hit Enter</w:t>
+      </w:r>
+    </w:p>
+    <w:p>
+      <w:pPr>
+        <w:pStyle w:val="ListParagraph"/>
+        <w:numPr>
+          <w:ilvl w:val="0"/>
+          <w:numId w:val="43"/>
+        </w:numPr>
+        <w:rPr>
+          <w:sz w:val="26"/>
+          <w:szCs w:val="24"/>
+          <w:lang w:val="en-US"/>
+        </w:rPr>
+      </w:pPr>
+      <w:r>
+        <w:rPr>
+          <w:sz w:val="26"/>
+          <w:szCs w:val="24"/>
+          <w:lang w:val="en-US"/>
+        </w:rPr>
+        <w:t>A valid search should display</w:t>
+      </w:r>
+    </w:p>
+    <w:p>
+      <w:pPr>
+        <w:rPr>
+          <w:b/>
+          <w:bCs/>
+          <w:sz w:val="26"/>
+          <w:szCs w:val="24"/>
+          <w:lang w:val="en-US"/>
+        </w:rPr>
+      </w:pPr>
+      <w:r>
+        <w:rPr>
+          <w:b/>
+          <w:bCs/>
+          <w:sz w:val="26"/>
+          <w:szCs w:val="24"/>
+          <w:lang w:val="en-US"/>
+        </w:rPr>
+        <w:t>Feature File</w:t>
+      </w:r>
+    </w:p>
+    <w:p>
+      <w:pPr>
+        <w:rPr>
+          <w:sz w:val="26"/>
+          <w:szCs w:val="24"/>
+          <w:lang w:val="en-US"/>
+        </w:rPr>
+      </w:pPr>
+      <w:r>
+        <w:rPr>
+          <w:sz w:val="26"/>
+          <w:szCs w:val="24"/>
+          <w:lang w:val="en-US"/>
+        </w:rPr>
+        <w:t>Feature: Search functionality on Google</w:t>
+      </w:r>
+    </w:p>
+    <w:p>
+      <w:pPr>
+        <w:rPr>
+          <w:sz w:val="26"/>
+          <w:szCs w:val="24"/>
+          <w:lang w:val="en-US"/>
+        </w:rPr>
+      </w:pPr>
+      <w:r>
+        <w:rPr>
+          <w:sz w:val="26"/>
+          <w:szCs w:val="24"/>
+          <w:lang w:val="en-US"/>
+        </w:rPr>
+        <w:t>Scenario: To validate search functionality on Google</w:t>
+      </w:r>
+    </w:p>
+    <w:p>
+      <w:pPr>
+        <w:rPr>
+          <w:sz w:val="26"/>
+          <w:szCs w:val="24"/>
+          <w:lang w:val="en-US"/>
+        </w:rPr>
+      </w:pPr>
+      <w:r>
+        <w:rPr>
+          <w:sz w:val="26"/>
+          <w:szCs w:val="24"/>
+          <w:lang w:val="en-US"/>
+        </w:rPr>
+        <w:t>Give Open Google</w:t>
+      </w:r>
+    </w:p>
+    <w:p>
+      <w:pPr>
+        <w:rPr>
+          <w:sz w:val="26"/>
+          <w:szCs w:val="24"/>
+          <w:lang w:val="en-US"/>
+        </w:rPr>
+      </w:pPr>
+      <w:r>
+        <w:rPr>
+          <w:sz w:val="26"/>
+          <w:szCs w:val="24"/>
+          <w:lang w:val="en-US"/>
+        </w:rPr>
+        <w:t>When Enter text in search box</w:t>
+      </w:r>
+    </w:p>
+    <w:p>
+      <w:pPr>
+        <w:rPr>
+          <w:sz w:val="26"/>
+          <w:szCs w:val="24"/>
+          <w:lang w:val="en-US"/>
+        </w:rPr>
+      </w:pPr>
+      <w:r>
+        <w:rPr>
+          <w:sz w:val="26"/>
+          <w:szCs w:val="24"/>
+          <w:lang w:val="en-US"/>
+        </w:rPr>
+        <w:t>And Hit Enter</w:t>
+      </w:r>
+    </w:p>
+    <w:p>
+      <w:pPr>
+        <w:rPr>
+          <w:sz w:val="26"/>
+          <w:szCs w:val="24"/>
+          <w:lang w:val="en-US"/>
+        </w:rPr>
+      </w:pPr>
+      <w:r>
+        <w:rPr>
+          <w:sz w:val="26"/>
+          <w:szCs w:val="24"/>
+          <w:lang w:val="en-US"/>
+        </w:rPr>
+        <w:t>Then A valid search result should display</w:t>
+      </w:r>
+    </w:p>
+    <w:p>
+      <w:pPr>
+        <w:rPr>
+          <w:sz w:val="26"/>
+          <w:szCs w:val="24"/>
+          <w:lang w:val="en-US"/>
+        </w:rPr>
+      </w:pPr>
+    </w:p>
+    <w:p>
+      <w:pPr>
         <w:rPr>
           <w:sz w:val="26"/>
           <w:szCs w:val="24"/>
@@ -9650,15 +10564,6 @@
       </w:pPr>
       <w:bookmarkStart w:id="0" w:name="_GoBack"/>
       <w:bookmarkEnd w:id="0"/>
-    </w:p>
-    <w:p>
-      <w:pPr>
-        <w:rPr>
-          <w:sz w:val="26"/>
-          <w:szCs w:val="24"/>
-          <w:lang w:val="en-US"/>
-        </w:rPr>
-      </w:pPr>
     </w:p>
     <w:sectPr>
       <w:pgSz w:w="11906" w:h="16838"/>
@@ -10279,6 +11184,119 @@
     </w:lvl>
   </w:abstractNum>
   <w:abstractNum w:abstractNumId="6">
+    <w:nsid w:val="0AD82B0C"/>
+    <w:multiLevelType w:val="hybridMultilevel"/>
+    <w:tmpl w:val="2C04EE6E"/>
+    <w:lvl w:ilvl="0" w:tplc="40090001">
+      <w:start w:val="1"/>
+      <w:numFmt w:val="bullet"/>
+      <w:lvlText w:val=""/>
+      <w:lvlJc w:val="left"/>
+      <w:pPr>
+        <w:ind w:left="720" w:hanging="360"/>
+      </w:pPr>
+      <w:rPr>
+        <w:rFonts w:ascii="Symbol" w:hAnsi="Symbol" w:hint="default"/>
+      </w:rPr>
+    </w:lvl>
+    <w:lvl w:ilvl="1" w:tplc="40090003">
+      <w:start w:val="1"/>
+      <w:numFmt w:val="bullet"/>
+      <w:lvlText w:val="o"/>
+      <w:lvlJc w:val="left"/>
+      <w:pPr>
+        <w:ind w:left="1440" w:hanging="360"/>
+      </w:pPr>
+      <w:rPr>
+        <w:rFonts w:ascii="Courier New" w:hAnsi="Courier New" w:cs="Courier New" w:hint="default"/>
+      </w:rPr>
+    </w:lvl>
+    <w:lvl w:ilvl="2" w:tplc="40090005" w:tentative="1">
+      <w:start w:val="1"/>
+      <w:numFmt w:val="bullet"/>
+      <w:lvlText w:val=""/>
+      <w:lvlJc w:val="left"/>
+      <w:pPr>
+        <w:ind w:left="2160" w:hanging="360"/>
+      </w:pPr>
+      <w:rPr>
+        <w:rFonts w:ascii="Wingdings" w:hAnsi="Wingdings" w:hint="default"/>
+      </w:rPr>
+    </w:lvl>
+    <w:lvl w:ilvl="3" w:tplc="40090001" w:tentative="1">
+      <w:start w:val="1"/>
+      <w:numFmt w:val="bullet"/>
+      <w:lvlText w:val=""/>
+      <w:lvlJc w:val="left"/>
+      <w:pPr>
+        <w:ind w:left="2880" w:hanging="360"/>
+      </w:pPr>
+      <w:rPr>
+        <w:rFonts w:ascii="Symbol" w:hAnsi="Symbol" w:hint="default"/>
+      </w:rPr>
+    </w:lvl>
+    <w:lvl w:ilvl="4" w:tplc="40090003" w:tentative="1">
+      <w:start w:val="1"/>
+      <w:numFmt w:val="bullet"/>
+      <w:lvlText w:val="o"/>
+      <w:lvlJc w:val="left"/>
+      <w:pPr>
+        <w:ind w:left="3600" w:hanging="360"/>
+      </w:pPr>
+      <w:rPr>
+        <w:rFonts w:ascii="Courier New" w:hAnsi="Courier New" w:cs="Courier New" w:hint="default"/>
+      </w:rPr>
+    </w:lvl>
+    <w:lvl w:ilvl="5" w:tplc="40090005" w:tentative="1">
+      <w:start w:val="1"/>
+      <w:numFmt w:val="bullet"/>
+      <w:lvlText w:val=""/>
+      <w:lvlJc w:val="left"/>
+      <w:pPr>
+        <w:ind w:left="4320" w:hanging="360"/>
+      </w:pPr>
+      <w:rPr>
+        <w:rFonts w:ascii="Wingdings" w:hAnsi="Wingdings" w:hint="default"/>
+      </w:rPr>
+    </w:lvl>
+    <w:lvl w:ilvl="6" w:tplc="40090001" w:tentative="1">
+      <w:start w:val="1"/>
+      <w:numFmt w:val="bullet"/>
+      <w:lvlText w:val=""/>
+      <w:lvlJc w:val="left"/>
+      <w:pPr>
+        <w:ind w:left="5040" w:hanging="360"/>
+      </w:pPr>
+      <w:rPr>
+        <w:rFonts w:ascii="Symbol" w:hAnsi="Symbol" w:hint="default"/>
+      </w:rPr>
+    </w:lvl>
+    <w:lvl w:ilvl="7" w:tplc="40090003" w:tentative="1">
+      <w:start w:val="1"/>
+      <w:numFmt w:val="bullet"/>
+      <w:lvlText w:val="o"/>
+      <w:lvlJc w:val="left"/>
+      <w:pPr>
+        <w:ind w:left="5760" w:hanging="360"/>
+      </w:pPr>
+      <w:rPr>
+        <w:rFonts w:ascii="Courier New" w:hAnsi="Courier New" w:cs="Courier New" w:hint="default"/>
+      </w:rPr>
+    </w:lvl>
+    <w:lvl w:ilvl="8" w:tplc="40090005" w:tentative="1">
+      <w:start w:val="1"/>
+      <w:numFmt w:val="bullet"/>
+      <w:lvlText w:val=""/>
+      <w:lvlJc w:val="left"/>
+      <w:pPr>
+        <w:ind w:left="6480" w:hanging="360"/>
+      </w:pPr>
+      <w:rPr>
+        <w:rFonts w:ascii="Wingdings" w:hAnsi="Wingdings" w:hint="default"/>
+      </w:rPr>
+    </w:lvl>
+  </w:abstractNum>
+  <w:abstractNum w:abstractNumId="7">
     <w:nsid w:val="0B656063"/>
     <w:multiLevelType w:val="hybridMultilevel"/>
     <w:tmpl w:val="18B07558"/>
@@ -10367,7 +11385,7 @@
       </w:pPr>
     </w:lvl>
   </w:abstractNum>
-  <w:abstractNum w:abstractNumId="7">
+  <w:abstractNum w:abstractNumId="8">
     <w:nsid w:val="190744F3"/>
     <w:multiLevelType w:val="hybridMultilevel"/>
     <w:tmpl w:val="D5220544"/>
@@ -10480,7 +11498,7 @@
       </w:rPr>
     </w:lvl>
   </w:abstractNum>
-  <w:abstractNum w:abstractNumId="8">
+  <w:abstractNum w:abstractNumId="9">
     <w:nsid w:val="192313AD"/>
     <w:multiLevelType w:val="hybridMultilevel"/>
     <w:tmpl w:val="609A4842"/>
@@ -10569,7 +11587,7 @@
       </w:pPr>
     </w:lvl>
   </w:abstractNum>
-  <w:abstractNum w:abstractNumId="9">
+  <w:abstractNum w:abstractNumId="10">
     <w:nsid w:val="1A304E32"/>
     <w:multiLevelType w:val="hybridMultilevel"/>
     <w:tmpl w:val="C6181F12"/>
@@ -10658,7 +11676,7 @@
       </w:pPr>
     </w:lvl>
   </w:abstractNum>
-  <w:abstractNum w:abstractNumId="10">
+  <w:abstractNum w:abstractNumId="11">
     <w:nsid w:val="1F9E1E48"/>
     <w:multiLevelType w:val="hybridMultilevel"/>
     <w:tmpl w:val="C7582CDC"/>
@@ -10771,7 +11789,7 @@
       </w:rPr>
     </w:lvl>
   </w:abstractNum>
-  <w:abstractNum w:abstractNumId="11">
+  <w:abstractNum w:abstractNumId="12">
     <w:nsid w:val="203C513C"/>
     <w:multiLevelType w:val="hybridMultilevel"/>
     <w:tmpl w:val="8AB4A5AE"/>
@@ -10860,7 +11878,7 @@
       </w:pPr>
     </w:lvl>
   </w:abstractNum>
-  <w:abstractNum w:abstractNumId="12">
+  <w:abstractNum w:abstractNumId="13">
     <w:nsid w:val="20F05ACF"/>
     <w:multiLevelType w:val="hybridMultilevel"/>
     <w:tmpl w:val="4C5A6C62"/>
@@ -10949,7 +11967,96 @@
       </w:pPr>
     </w:lvl>
   </w:abstractNum>
-  <w:abstractNum w:abstractNumId="13">
+  <w:abstractNum w:abstractNumId="14">
+    <w:nsid w:val="24313609"/>
+    <w:multiLevelType w:val="hybridMultilevel"/>
+    <w:tmpl w:val="BCEEA2D6"/>
+    <w:lvl w:ilvl="0" w:tplc="4009000F">
+      <w:start w:val="1"/>
+      <w:numFmt w:val="decimal"/>
+      <w:lvlText w:val="%1."/>
+      <w:lvlJc w:val="left"/>
+      <w:pPr>
+        <w:ind w:left="720" w:hanging="360"/>
+      </w:pPr>
+      <w:rPr>
+        <w:rFonts w:hint="default"/>
+      </w:rPr>
+    </w:lvl>
+    <w:lvl w:ilvl="1" w:tplc="40090019" w:tentative="1">
+      <w:start w:val="1"/>
+      <w:numFmt w:val="lowerLetter"/>
+      <w:lvlText w:val="%2."/>
+      <w:lvlJc w:val="left"/>
+      <w:pPr>
+        <w:ind w:left="1440" w:hanging="360"/>
+      </w:pPr>
+    </w:lvl>
+    <w:lvl w:ilvl="2" w:tplc="4009001B" w:tentative="1">
+      <w:start w:val="1"/>
+      <w:numFmt w:val="lowerRoman"/>
+      <w:lvlText w:val="%3."/>
+      <w:lvlJc w:val="right"/>
+      <w:pPr>
+        <w:ind w:left="2160" w:hanging="180"/>
+      </w:pPr>
+    </w:lvl>
+    <w:lvl w:ilvl="3" w:tplc="4009000F" w:tentative="1">
+      <w:start w:val="1"/>
+      <w:numFmt w:val="decimal"/>
+      <w:lvlText w:val="%4."/>
+      <w:lvlJc w:val="left"/>
+      <w:pPr>
+        <w:ind w:left="2880" w:hanging="360"/>
+      </w:pPr>
+    </w:lvl>
+    <w:lvl w:ilvl="4" w:tplc="40090019" w:tentative="1">
+      <w:start w:val="1"/>
+      <w:numFmt w:val="lowerLetter"/>
+      <w:lvlText w:val="%5."/>
+      <w:lvlJc w:val="left"/>
+      <w:pPr>
+        <w:ind w:left="3600" w:hanging="360"/>
+      </w:pPr>
+    </w:lvl>
+    <w:lvl w:ilvl="5" w:tplc="4009001B" w:tentative="1">
+      <w:start w:val="1"/>
+      <w:numFmt w:val="lowerRoman"/>
+      <w:lvlText w:val="%6."/>
+      <w:lvlJc w:val="right"/>
+      <w:pPr>
+        <w:ind w:left="4320" w:hanging="180"/>
+      </w:pPr>
+    </w:lvl>
+    <w:lvl w:ilvl="6" w:tplc="4009000F" w:tentative="1">
+      <w:start w:val="1"/>
+      <w:numFmt w:val="decimal"/>
+      <w:lvlText w:val="%7."/>
+      <w:lvlJc w:val="left"/>
+      <w:pPr>
+        <w:ind w:left="5040" w:hanging="360"/>
+      </w:pPr>
+    </w:lvl>
+    <w:lvl w:ilvl="7" w:tplc="40090019" w:tentative="1">
+      <w:start w:val="1"/>
+      <w:numFmt w:val="lowerLetter"/>
+      <w:lvlText w:val="%8."/>
+      <w:lvlJc w:val="left"/>
+      <w:pPr>
+        <w:ind w:left="5760" w:hanging="360"/>
+      </w:pPr>
+    </w:lvl>
+    <w:lvl w:ilvl="8" w:tplc="4009001B" w:tentative="1">
+      <w:start w:val="1"/>
+      <w:numFmt w:val="lowerRoman"/>
+      <w:lvlText w:val="%9."/>
+      <w:lvlJc w:val="right"/>
+      <w:pPr>
+        <w:ind w:left="6480" w:hanging="180"/>
+      </w:pPr>
+    </w:lvl>
+  </w:abstractNum>
+  <w:abstractNum w:abstractNumId="15">
     <w:nsid w:val="2479664E"/>
     <w:multiLevelType w:val="hybridMultilevel"/>
     <w:tmpl w:val="14A418A0"/>
@@ -11038,7 +12145,7 @@
       </w:pPr>
     </w:lvl>
   </w:abstractNum>
-  <w:abstractNum w:abstractNumId="14">
+  <w:abstractNum w:abstractNumId="16">
     <w:nsid w:val="24AA3700"/>
     <w:multiLevelType w:val="hybridMultilevel"/>
     <w:tmpl w:val="4AE473FA"/>
@@ -11127,7 +12234,7 @@
       </w:pPr>
     </w:lvl>
   </w:abstractNum>
-  <w:abstractNum w:abstractNumId="15">
+  <w:abstractNum w:abstractNumId="17">
     <w:nsid w:val="256A1A67"/>
     <w:multiLevelType w:val="hybridMultilevel"/>
     <w:tmpl w:val="2482F060"/>
@@ -11240,7 +12347,7 @@
       </w:rPr>
     </w:lvl>
   </w:abstractNum>
-  <w:abstractNum w:abstractNumId="16">
+  <w:abstractNum w:abstractNumId="18">
     <w:nsid w:val="2E0E1364"/>
     <w:multiLevelType w:val="hybridMultilevel"/>
     <w:tmpl w:val="40CC5AC4"/>
@@ -11329,7 +12436,7 @@
       </w:pPr>
     </w:lvl>
   </w:abstractNum>
-  <w:abstractNum w:abstractNumId="17">
+  <w:abstractNum w:abstractNumId="19">
     <w:nsid w:val="360C28AB"/>
     <w:multiLevelType w:val="hybridMultilevel"/>
     <w:tmpl w:val="D910DDB6"/>
@@ -11442,7 +12549,7 @@
       </w:rPr>
     </w:lvl>
   </w:abstractNum>
-  <w:abstractNum w:abstractNumId="18">
+  <w:abstractNum w:abstractNumId="20">
     <w:nsid w:val="38846546"/>
     <w:multiLevelType w:val="hybridMultilevel"/>
     <w:tmpl w:val="86F02860"/>
@@ -11531,7 +12638,7 @@
       </w:pPr>
     </w:lvl>
   </w:abstractNum>
-  <w:abstractNum w:abstractNumId="19">
+  <w:abstractNum w:abstractNumId="21">
     <w:nsid w:val="39C45A17"/>
     <w:multiLevelType w:val="hybridMultilevel"/>
     <w:tmpl w:val="7BCE0EDE"/>
@@ -11620,7 +12727,7 @@
       </w:pPr>
     </w:lvl>
   </w:abstractNum>
-  <w:abstractNum w:abstractNumId="20">
+  <w:abstractNum w:abstractNumId="22">
     <w:nsid w:val="3C0D7148"/>
     <w:multiLevelType w:val="hybridMultilevel"/>
     <w:tmpl w:val="61EAC19E"/>
@@ -11709,7 +12816,7 @@
       </w:pPr>
     </w:lvl>
   </w:abstractNum>
-  <w:abstractNum w:abstractNumId="21">
+  <w:abstractNum w:abstractNumId="23">
     <w:nsid w:val="3EC7092E"/>
     <w:multiLevelType w:val="hybridMultilevel"/>
     <w:tmpl w:val="BEB82898"/>
@@ -11798,7 +12905,7 @@
       </w:pPr>
     </w:lvl>
   </w:abstractNum>
-  <w:abstractNum w:abstractNumId="22">
+  <w:abstractNum w:abstractNumId="24">
     <w:nsid w:val="3FEE48BD"/>
     <w:multiLevelType w:val="hybridMultilevel"/>
     <w:tmpl w:val="7D7C81C4"/>
@@ -11887,7 +12994,7 @@
       </w:pPr>
     </w:lvl>
   </w:abstractNum>
-  <w:abstractNum w:abstractNumId="23">
+  <w:abstractNum w:abstractNumId="25">
     <w:nsid w:val="403F7638"/>
     <w:multiLevelType w:val="hybridMultilevel"/>
     <w:tmpl w:val="49801E86"/>
@@ -11976,7 +13083,7 @@
       </w:pPr>
     </w:lvl>
   </w:abstractNum>
-  <w:abstractNum w:abstractNumId="24">
+  <w:abstractNum w:abstractNumId="26">
     <w:nsid w:val="430B4440"/>
     <w:multiLevelType w:val="hybridMultilevel"/>
     <w:tmpl w:val="2B70B9E6"/>
@@ -12089,7 +13196,7 @@
       </w:rPr>
     </w:lvl>
   </w:abstractNum>
-  <w:abstractNum w:abstractNumId="25">
+  <w:abstractNum w:abstractNumId="27">
     <w:nsid w:val="46A73B9B"/>
     <w:multiLevelType w:val="hybridMultilevel"/>
     <w:tmpl w:val="EAA08C1C"/>
@@ -12178,7 +13285,7 @@
       </w:pPr>
     </w:lvl>
   </w:abstractNum>
-  <w:abstractNum w:abstractNumId="26">
+  <w:abstractNum w:abstractNumId="28">
     <w:nsid w:val="4EBA6DD1"/>
     <w:multiLevelType w:val="hybridMultilevel"/>
     <w:tmpl w:val="60C02E0C"/>
@@ -12267,7 +13374,7 @@
       </w:pPr>
     </w:lvl>
   </w:abstractNum>
-  <w:abstractNum w:abstractNumId="27">
+  <w:abstractNum w:abstractNumId="29">
     <w:nsid w:val="511B2F49"/>
     <w:multiLevelType w:val="hybridMultilevel"/>
     <w:tmpl w:val="9A3C8644"/>
@@ -12356,7 +13463,7 @@
       </w:pPr>
     </w:lvl>
   </w:abstractNum>
-  <w:abstractNum w:abstractNumId="28">
+  <w:abstractNum w:abstractNumId="30">
     <w:nsid w:val="515E3FEC"/>
     <w:multiLevelType w:val="hybridMultilevel"/>
     <w:tmpl w:val="E902866C"/>
@@ -12469,7 +13576,96 @@
       </w:rPr>
     </w:lvl>
   </w:abstractNum>
-  <w:abstractNum w:abstractNumId="29">
+  <w:abstractNum w:abstractNumId="31">
+    <w:nsid w:val="520A0D46"/>
+    <w:multiLevelType w:val="hybridMultilevel"/>
+    <w:tmpl w:val="5DEA5086"/>
+    <w:lvl w:ilvl="0" w:tplc="4009000F">
+      <w:start w:val="1"/>
+      <w:numFmt w:val="decimal"/>
+      <w:lvlText w:val="%1."/>
+      <w:lvlJc w:val="left"/>
+      <w:pPr>
+        <w:ind w:left="720" w:hanging="360"/>
+      </w:pPr>
+      <w:rPr>
+        <w:rFonts w:hint="default"/>
+      </w:rPr>
+    </w:lvl>
+    <w:lvl w:ilvl="1" w:tplc="40090019" w:tentative="1">
+      <w:start w:val="1"/>
+      <w:numFmt w:val="lowerLetter"/>
+      <w:lvlText w:val="%2."/>
+      <w:lvlJc w:val="left"/>
+      <w:pPr>
+        <w:ind w:left="1440" w:hanging="360"/>
+      </w:pPr>
+    </w:lvl>
+    <w:lvl w:ilvl="2" w:tplc="4009001B" w:tentative="1">
+      <w:start w:val="1"/>
+      <w:numFmt w:val="lowerRoman"/>
+      <w:lvlText w:val="%3."/>
+      <w:lvlJc w:val="right"/>
+      <w:pPr>
+        <w:ind w:left="2160" w:hanging="180"/>
+      </w:pPr>
+    </w:lvl>
+    <w:lvl w:ilvl="3" w:tplc="4009000F" w:tentative="1">
+      <w:start w:val="1"/>
+      <w:numFmt w:val="decimal"/>
+      <w:lvlText w:val="%4."/>
+      <w:lvlJc w:val="left"/>
+      <w:pPr>
+        <w:ind w:left="2880" w:hanging="360"/>
+      </w:pPr>
+    </w:lvl>
+    <w:lvl w:ilvl="4" w:tplc="40090019" w:tentative="1">
+      <w:start w:val="1"/>
+      <w:numFmt w:val="lowerLetter"/>
+      <w:lvlText w:val="%5."/>
+      <w:lvlJc w:val="left"/>
+      <w:pPr>
+        <w:ind w:left="3600" w:hanging="360"/>
+      </w:pPr>
+    </w:lvl>
+    <w:lvl w:ilvl="5" w:tplc="4009001B" w:tentative="1">
+      <w:start w:val="1"/>
+      <w:numFmt w:val="lowerRoman"/>
+      <w:lvlText w:val="%6."/>
+      <w:lvlJc w:val="right"/>
+      <w:pPr>
+        <w:ind w:left="4320" w:hanging="180"/>
+      </w:pPr>
+    </w:lvl>
+    <w:lvl w:ilvl="6" w:tplc="4009000F" w:tentative="1">
+      <w:start w:val="1"/>
+      <w:numFmt w:val="decimal"/>
+      <w:lvlText w:val="%7."/>
+      <w:lvlJc w:val="left"/>
+      <w:pPr>
+        <w:ind w:left="5040" w:hanging="360"/>
+      </w:pPr>
+    </w:lvl>
+    <w:lvl w:ilvl="7" w:tplc="40090019" w:tentative="1">
+      <w:start w:val="1"/>
+      <w:numFmt w:val="lowerLetter"/>
+      <w:lvlText w:val="%8."/>
+      <w:lvlJc w:val="left"/>
+      <w:pPr>
+        <w:ind w:left="5760" w:hanging="360"/>
+      </w:pPr>
+    </w:lvl>
+    <w:lvl w:ilvl="8" w:tplc="4009001B" w:tentative="1">
+      <w:start w:val="1"/>
+      <w:numFmt w:val="lowerRoman"/>
+      <w:lvlText w:val="%9."/>
+      <w:lvlJc w:val="right"/>
+      <w:pPr>
+        <w:ind w:left="6480" w:hanging="180"/>
+      </w:pPr>
+    </w:lvl>
+  </w:abstractNum>
+  <w:abstractNum w:abstractNumId="32">
     <w:nsid w:val="529E3796"/>
     <w:multiLevelType w:val="hybridMultilevel"/>
     <w:tmpl w:val="AB520516"/>
@@ -12558,7 +13754,7 @@
       </w:pPr>
     </w:lvl>
   </w:abstractNum>
-  <w:abstractNum w:abstractNumId="30">
+  <w:abstractNum w:abstractNumId="33">
     <w:nsid w:val="55816A8D"/>
     <w:multiLevelType w:val="hybridMultilevel"/>
     <w:tmpl w:val="1200EDB6"/>
@@ -12647,7 +13843,7 @@
       </w:pPr>
     </w:lvl>
   </w:abstractNum>
-  <w:abstractNum w:abstractNumId="31">
+  <w:abstractNum w:abstractNumId="34">
     <w:nsid w:val="600D19E9"/>
     <w:multiLevelType w:val="hybridMultilevel"/>
     <w:tmpl w:val="F9E8C07C"/>
@@ -12736,7 +13932,7 @@
       </w:pPr>
     </w:lvl>
   </w:abstractNum>
-  <w:abstractNum w:abstractNumId="32">
+  <w:abstractNum w:abstractNumId="35">
     <w:nsid w:val="60166BF6"/>
     <w:multiLevelType w:val="hybridMultilevel"/>
     <w:tmpl w:val="1A2C61F4"/>
@@ -12849,7 +14045,7 @@
       </w:rPr>
     </w:lvl>
   </w:abstractNum>
-  <w:abstractNum w:abstractNumId="33">
+  <w:abstractNum w:abstractNumId="36">
     <w:nsid w:val="61194B06"/>
     <w:multiLevelType w:val="hybridMultilevel"/>
     <w:tmpl w:val="348E9CA8"/>
@@ -12939,7 +14135,7 @@
       </w:pPr>
     </w:lvl>
   </w:abstractNum>
-  <w:abstractNum w:abstractNumId="34">
+  <w:abstractNum w:abstractNumId="37">
     <w:nsid w:val="669D6C41"/>
     <w:multiLevelType w:val="hybridMultilevel"/>
     <w:tmpl w:val="9E22EC66"/>
@@ -13052,7 +14248,7 @@
       </w:rPr>
     </w:lvl>
   </w:abstractNum>
-  <w:abstractNum w:abstractNumId="35">
+  <w:abstractNum w:abstractNumId="38">
     <w:nsid w:val="67740DB7"/>
     <w:multiLevelType w:val="hybridMultilevel"/>
     <w:tmpl w:val="98CEB9B2"/>
@@ -13138,7 +14334,7 @@
       </w:pPr>
     </w:lvl>
   </w:abstractNum>
-  <w:abstractNum w:abstractNumId="36">
+  <w:abstractNum w:abstractNumId="39">
     <w:nsid w:val="6DE40AAE"/>
     <w:multiLevelType w:val="hybridMultilevel"/>
     <w:tmpl w:val="8A1CE40E"/>
@@ -13227,7 +14423,7 @@
       </w:pPr>
     </w:lvl>
   </w:abstractNum>
-  <w:abstractNum w:abstractNumId="37">
+  <w:abstractNum w:abstractNumId="40">
     <w:nsid w:val="771E184F"/>
     <w:multiLevelType w:val="hybridMultilevel"/>
     <w:tmpl w:val="A18E7122"/>
@@ -13340,7 +14536,7 @@
       </w:rPr>
     </w:lvl>
   </w:abstractNum>
-  <w:abstractNum w:abstractNumId="38">
+  <w:abstractNum w:abstractNumId="41">
     <w:nsid w:val="771F358C"/>
     <w:multiLevelType w:val="hybridMultilevel"/>
     <w:tmpl w:val="08E0D094"/>
@@ -13429,7 +14625,7 @@
       </w:pPr>
     </w:lvl>
   </w:abstractNum>
-  <w:abstractNum w:abstractNumId="39">
+  <w:abstractNum w:abstractNumId="42">
     <w:nsid w:val="7F7B6E0C"/>
     <w:multiLevelType w:val="hybridMultilevel"/>
     <w:tmpl w:val="1D06EEE4"/>
@@ -13519,124 +14715,133 @@
     </w:lvl>
   </w:abstractNum>
   <w:num w:numId="1">
-    <w:abstractNumId w:val="19"/>
+    <w:abstractNumId w:val="21"/>
   </w:num>
   <w:num w:numId="2">
-    <w:abstractNumId w:val="21"/>
+    <w:abstractNumId w:val="23"/>
   </w:num>
   <w:num w:numId="3">
     <w:abstractNumId w:val="0"/>
   </w:num>
   <w:num w:numId="4">
-    <w:abstractNumId w:val="8"/>
+    <w:abstractNumId w:val="9"/>
   </w:num>
   <w:num w:numId="5">
-    <w:abstractNumId w:val="23"/>
+    <w:abstractNumId w:val="25"/>
   </w:num>
   <w:num w:numId="6">
-    <w:abstractNumId w:val="12"/>
+    <w:abstractNumId w:val="13"/>
   </w:num>
   <w:num w:numId="7">
-    <w:abstractNumId w:val="6"/>
+    <w:abstractNumId w:val="7"/>
   </w:num>
   <w:num w:numId="8">
-    <w:abstractNumId w:val="34"/>
+    <w:abstractNumId w:val="37"/>
   </w:num>
   <w:num w:numId="9">
-    <w:abstractNumId w:val="38"/>
+    <w:abstractNumId w:val="41"/>
   </w:num>
   <w:num w:numId="10">
-    <w:abstractNumId w:val="16"/>
+    <w:abstractNumId w:val="18"/>
   </w:num>
   <w:num w:numId="11">
-    <w:abstractNumId w:val="22"/>
+    <w:abstractNumId w:val="24"/>
   </w:num>
   <w:num w:numId="12">
-    <w:abstractNumId w:val="20"/>
+    <w:abstractNumId w:val="22"/>
   </w:num>
   <w:num w:numId="13">
     <w:abstractNumId w:val="5"/>
   </w:num>
   <w:num w:numId="14">
-    <w:abstractNumId w:val="7"/>
+    <w:abstractNumId w:val="8"/>
   </w:num>
   <w:num w:numId="15">
-    <w:abstractNumId w:val="36"/>
+    <w:abstractNumId w:val="39"/>
   </w:num>
   <w:num w:numId="16">
     <w:abstractNumId w:val="3"/>
   </w:num>
   <w:num w:numId="17">
-    <w:abstractNumId w:val="29"/>
+    <w:abstractNumId w:val="32"/>
   </w:num>
   <w:num w:numId="18">
-    <w:abstractNumId w:val="32"/>
+    <w:abstractNumId w:val="35"/>
   </w:num>
   <w:num w:numId="19">
-    <w:abstractNumId w:val="13"/>
+    <w:abstractNumId w:val="15"/>
   </w:num>
   <w:num w:numId="20">
-    <w:abstractNumId w:val="30"/>
+    <w:abstractNumId w:val="33"/>
   </w:num>
   <w:num w:numId="21">
     <w:abstractNumId w:val="1"/>
   </w:num>
   <w:num w:numId="22">
-    <w:abstractNumId w:val="18"/>
+    <w:abstractNumId w:val="20"/>
   </w:num>
   <w:num w:numId="23">
-    <w:abstractNumId w:val="17"/>
+    <w:abstractNumId w:val="19"/>
   </w:num>
   <w:num w:numId="24">
-    <w:abstractNumId w:val="10"/>
+    <w:abstractNumId w:val="11"/>
   </w:num>
   <w:num w:numId="25">
-    <w:abstractNumId w:val="26"/>
+    <w:abstractNumId w:val="28"/>
   </w:num>
   <w:num w:numId="26">
     <w:abstractNumId w:val="4"/>
   </w:num>
   <w:num w:numId="27">
-    <w:abstractNumId w:val="11"/>
+    <w:abstractNumId w:val="12"/>
   </w:num>
   <w:num w:numId="28">
-    <w:abstractNumId w:val="9"/>
+    <w:abstractNumId w:val="10"/>
   </w:num>
   <w:num w:numId="29">
-    <w:abstractNumId w:val="33"/>
+    <w:abstractNumId w:val="36"/>
   </w:num>
   <w:num w:numId="30">
-    <w:abstractNumId w:val="25"/>
+    <w:abstractNumId w:val="27"/>
   </w:num>
   <w:num w:numId="31">
-    <w:abstractNumId w:val="14"/>
+    <w:abstractNumId w:val="16"/>
   </w:num>
   <w:num w:numId="32">
-    <w:abstractNumId w:val="28"/>
+    <w:abstractNumId w:val="30"/>
   </w:num>
   <w:num w:numId="33">
-    <w:abstractNumId w:val="24"/>
+    <w:abstractNumId w:val="26"/>
   </w:num>
   <w:num w:numId="34">
     <w:abstractNumId w:val="2"/>
   </w:num>
   <w:num w:numId="35">
-    <w:abstractNumId w:val="15"/>
+    <w:abstractNumId w:val="17"/>
   </w:num>
   <w:num w:numId="36">
-    <w:abstractNumId w:val="27"/>
+    <w:abstractNumId w:val="29"/>
   </w:num>
   <w:num w:numId="37">
-    <w:abstractNumId w:val="39"/>
+    <w:abstractNumId w:val="42"/>
   </w:num>
   <w:num w:numId="38">
-    <w:abstractNumId w:val="31"/>
+    <w:abstractNumId w:val="34"/>
   </w:num>
   <w:num w:numId="39">
-    <w:abstractNumId w:val="35"/>
+    <w:abstractNumId w:val="38"/>
   </w:num>
   <w:num w:numId="40">
-    <w:abstractNumId w:val="37"/>
+    <w:abstractNumId w:val="40"/>
+  </w:num>
+  <w:num w:numId="41">
+    <w:abstractNumId w:val="6"/>
+  </w:num>
+  <w:num w:numId="42">
+    <w:abstractNumId w:val="14"/>
+  </w:num>
+  <w:num w:numId="43">
+    <w:abstractNumId w:val="31"/>
   </w:num>
 </w:numbering>
 </file>

</xml_diff>

<commit_message>
Date: 12 Jan 2026
</commit_message>
<xml_diff>
--- a/Notes_Selenium_15.docx
+++ b/Notes_Selenium_15.docx
@@ -9239,20 +9239,30 @@
     <w:p>
       <w:pPr>
         <w:rPr>
-          <w:sz w:val="26"/>
-          <w:szCs w:val="24"/>
-          <w:lang w:val="en-US"/>
-        </w:rPr>
-      </w:pPr>
-      <w:r>
-        <w:rPr>
           <w:b/>
           <w:bCs/>
           <w:sz w:val="26"/>
           <w:szCs w:val="24"/>
           <w:lang w:val="en-US"/>
         </w:rPr>
-        <w:lastRenderedPageBreak/>
+      </w:pPr>
+    </w:p>
+    <w:p>
+      <w:pPr>
+        <w:rPr>
+          <w:sz w:val="26"/>
+          <w:szCs w:val="24"/>
+          <w:lang w:val="en-US"/>
+        </w:rPr>
+      </w:pPr>
+      <w:r>
+        <w:rPr>
+          <w:b/>
+          <w:bCs/>
+          <w:sz w:val="26"/>
+          <w:szCs w:val="24"/>
+          <w:lang w:val="en-US"/>
+        </w:rPr>
         <w:t xml:space="preserve">TDD Approach </w:t>
       </w:r>
     </w:p>
@@ -10129,6 +10139,7 @@
           <w:szCs w:val="24"/>
           <w:lang w:val="en-US"/>
         </w:rPr>
+        <w:lastRenderedPageBreak/>
         <w:t>Requirement: Verify Google Title</w:t>
       </w:r>
     </w:p>
@@ -10151,7 +10162,6 @@
           <w:szCs w:val="24"/>
           <w:lang w:val="en-US"/>
         </w:rPr>
-        <w:lastRenderedPageBreak/>
         <w:t>Open Google</w:t>
       </w:r>
     </w:p>
@@ -10562,8 +10572,117 @@
           <w:lang w:val="en-US"/>
         </w:rPr>
       </w:pPr>
+    </w:p>
+    <w:p>
+      <w:pPr>
+        <w:rPr>
+          <w:b/>
+          <w:bCs/>
+          <w:sz w:val="26"/>
+          <w:szCs w:val="24"/>
+          <w:lang w:val="en-US"/>
+        </w:rPr>
+      </w:pPr>
+      <w:r>
+        <w:rPr>
+          <w:b/>
+          <w:bCs/>
+          <w:sz w:val="26"/>
+          <w:szCs w:val="24"/>
+          <w:lang w:val="en-US"/>
+        </w:rPr>
+        <w:t>Tags in Cucumber</w:t>
+      </w:r>
+    </w:p>
+    <w:p>
+      <w:pPr>
+        <w:pStyle w:val="ListParagraph"/>
+        <w:numPr>
+          <w:ilvl w:val="0"/>
+          <w:numId w:val="44"/>
+        </w:numPr>
+        <w:rPr>
+          <w:sz w:val="26"/>
+          <w:szCs w:val="24"/>
+          <w:lang w:val="en-US"/>
+        </w:rPr>
+      </w:pPr>
+      <w:r>
+        <w:rPr>
+          <w:sz w:val="26"/>
+          <w:szCs w:val="24"/>
+          <w:lang w:val="en-US"/>
+        </w:rPr>
+        <w:t>Tags allows to execute or skip single or multiple scenarios</w:t>
+      </w:r>
+    </w:p>
+    <w:p>
+      <w:pPr>
+        <w:pStyle w:val="ListParagraph"/>
+        <w:numPr>
+          <w:ilvl w:val="0"/>
+          <w:numId w:val="44"/>
+        </w:numPr>
+        <w:rPr>
+          <w:sz w:val="26"/>
+          <w:szCs w:val="24"/>
+          <w:lang w:val="en-US"/>
+        </w:rPr>
+      </w:pPr>
+      <w:r>
+        <w:rPr>
+          <w:sz w:val="26"/>
+          <w:szCs w:val="24"/>
+          <w:lang w:val="en-US"/>
+        </w:rPr>
+        <w:t>Every tag starts with @</w:t>
+      </w:r>
+    </w:p>
+    <w:p>
+      <w:pPr>
+        <w:pStyle w:val="ListParagraph"/>
+        <w:numPr>
+          <w:ilvl w:val="0"/>
+          <w:numId w:val="44"/>
+        </w:numPr>
+        <w:rPr>
+          <w:sz w:val="26"/>
+          <w:szCs w:val="24"/>
+          <w:lang w:val="en-US"/>
+        </w:rPr>
+      </w:pPr>
+      <w:r>
+        <w:rPr>
+          <w:sz w:val="26"/>
+          <w:szCs w:val="24"/>
+          <w:lang w:val="en-US"/>
+        </w:rPr>
+        <w:t>Tags needs to be specified in feature file</w:t>
+      </w:r>
       <w:bookmarkStart w:id="0" w:name="_GoBack"/>
       <w:bookmarkEnd w:id="0"/>
+    </w:p>
+    <w:p>
+      <w:pPr>
+        <w:pStyle w:val="ListParagraph"/>
+        <w:numPr>
+          <w:ilvl w:val="0"/>
+          <w:numId w:val="44"/>
+        </w:numPr>
+        <w:rPr>
+          <w:sz w:val="26"/>
+          <w:szCs w:val="24"/>
+          <w:lang w:val="en-US"/>
+        </w:rPr>
+      </w:pPr>
+      <w:r>
+        <w:rPr>
+          <w:sz w:val="26"/>
+          <w:szCs w:val="24"/>
+          <w:lang w:val="en-US"/>
+        </w:rPr>
+        <w:t>Execution criteria needs to be specified in Runner class</w:t>
+      </w:r>
     </w:p>
     <w:sectPr>
       <w:pgSz w:w="11906" w:h="16838"/>
@@ -11386,6 +11505,119 @@
     </w:lvl>
   </w:abstractNum>
   <w:abstractNum w:abstractNumId="8">
+    <w:nsid w:val="0CA724C5"/>
+    <w:multiLevelType w:val="hybridMultilevel"/>
+    <w:tmpl w:val="A6EAF12C"/>
+    <w:lvl w:ilvl="0" w:tplc="40090001">
+      <w:start w:val="1"/>
+      <w:numFmt w:val="bullet"/>
+      <w:lvlText w:val=""/>
+      <w:lvlJc w:val="left"/>
+      <w:pPr>
+        <w:ind w:left="720" w:hanging="360"/>
+      </w:pPr>
+      <w:rPr>
+        <w:rFonts w:ascii="Symbol" w:hAnsi="Symbol" w:hint="default"/>
+      </w:rPr>
+    </w:lvl>
+    <w:lvl w:ilvl="1" w:tplc="40090003" w:tentative="1">
+      <w:start w:val="1"/>
+      <w:numFmt w:val="bullet"/>
+      <w:lvlText w:val="o"/>
+      <w:lvlJc w:val="left"/>
+      <w:pPr>
+        <w:ind w:left="1440" w:hanging="360"/>
+      </w:pPr>
+      <w:rPr>
+        <w:rFonts w:ascii="Courier New" w:hAnsi="Courier New" w:cs="Courier New" w:hint="default"/>
+      </w:rPr>
+    </w:lvl>
+    <w:lvl w:ilvl="2" w:tplc="40090005" w:tentative="1">
+      <w:start w:val="1"/>
+      <w:numFmt w:val="bullet"/>
+      <w:lvlText w:val=""/>
+      <w:lvlJc w:val="left"/>
+      <w:pPr>
+        <w:ind w:left="2160" w:hanging="360"/>
+      </w:pPr>
+      <w:rPr>
+        <w:rFonts w:ascii="Wingdings" w:hAnsi="Wingdings" w:hint="default"/>
+      </w:rPr>
+    </w:lvl>
+    <w:lvl w:ilvl="3" w:tplc="40090001" w:tentative="1">
+      <w:start w:val="1"/>
+      <w:numFmt w:val="bullet"/>
+      <w:lvlText w:val=""/>
+      <w:lvlJc w:val="left"/>
+      <w:pPr>
+        <w:ind w:left="2880" w:hanging="360"/>
+      </w:pPr>
+      <w:rPr>
+        <w:rFonts w:ascii="Symbol" w:hAnsi="Symbol" w:hint="default"/>
+      </w:rPr>
+    </w:lvl>
+    <w:lvl w:ilvl="4" w:tplc="40090003" w:tentative="1">
+      <w:start w:val="1"/>
+      <w:numFmt w:val="bullet"/>
+      <w:lvlText w:val="o"/>
+      <w:lvlJc w:val="left"/>
+      <w:pPr>
+        <w:ind w:left="3600" w:hanging="360"/>
+      </w:pPr>
+      <w:rPr>
+        <w:rFonts w:ascii="Courier New" w:hAnsi="Courier New" w:cs="Courier New" w:hint="default"/>
+      </w:rPr>
+    </w:lvl>
+    <w:lvl w:ilvl="5" w:tplc="40090005" w:tentative="1">
+      <w:start w:val="1"/>
+      <w:numFmt w:val="bullet"/>
+      <w:lvlText w:val=""/>
+      <w:lvlJc w:val="left"/>
+      <w:pPr>
+        <w:ind w:left="4320" w:hanging="360"/>
+      </w:pPr>
+      <w:rPr>
+        <w:rFonts w:ascii="Wingdings" w:hAnsi="Wingdings" w:hint="default"/>
+      </w:rPr>
+    </w:lvl>
+    <w:lvl w:ilvl="6" w:tplc="40090001" w:tentative="1">
+      <w:start w:val="1"/>
+      <w:numFmt w:val="bullet"/>
+      <w:lvlText w:val=""/>
+      <w:lvlJc w:val="left"/>
+      <w:pPr>
+        <w:ind w:left="5040" w:hanging="360"/>
+      </w:pPr>
+      <w:rPr>
+        <w:rFonts w:ascii="Symbol" w:hAnsi="Symbol" w:hint="default"/>
+      </w:rPr>
+    </w:lvl>
+    <w:lvl w:ilvl="7" w:tplc="40090003" w:tentative="1">
+      <w:start w:val="1"/>
+      <w:numFmt w:val="bullet"/>
+      <w:lvlText w:val="o"/>
+      <w:lvlJc w:val="left"/>
+      <w:pPr>
+        <w:ind w:left="5760" w:hanging="360"/>
+      </w:pPr>
+      <w:rPr>
+        <w:rFonts w:ascii="Courier New" w:hAnsi="Courier New" w:cs="Courier New" w:hint="default"/>
+      </w:rPr>
+    </w:lvl>
+    <w:lvl w:ilvl="8" w:tplc="40090005" w:tentative="1">
+      <w:start w:val="1"/>
+      <w:numFmt w:val="bullet"/>
+      <w:lvlText w:val=""/>
+      <w:lvlJc w:val="left"/>
+      <w:pPr>
+        <w:ind w:left="6480" w:hanging="360"/>
+      </w:pPr>
+      <w:rPr>
+        <w:rFonts w:ascii="Wingdings" w:hAnsi="Wingdings" w:hint="default"/>
+      </w:rPr>
+    </w:lvl>
+  </w:abstractNum>
+  <w:abstractNum w:abstractNumId="9">
     <w:nsid w:val="190744F3"/>
     <w:multiLevelType w:val="hybridMultilevel"/>
     <w:tmpl w:val="D5220544"/>
@@ -11498,7 +11730,7 @@
       </w:rPr>
     </w:lvl>
   </w:abstractNum>
-  <w:abstractNum w:abstractNumId="9">
+  <w:abstractNum w:abstractNumId="10">
     <w:nsid w:val="192313AD"/>
     <w:multiLevelType w:val="hybridMultilevel"/>
     <w:tmpl w:val="609A4842"/>
@@ -11587,7 +11819,7 @@
       </w:pPr>
     </w:lvl>
   </w:abstractNum>
-  <w:abstractNum w:abstractNumId="10">
+  <w:abstractNum w:abstractNumId="11">
     <w:nsid w:val="1A304E32"/>
     <w:multiLevelType w:val="hybridMultilevel"/>
     <w:tmpl w:val="C6181F12"/>
@@ -11676,7 +11908,7 @@
       </w:pPr>
     </w:lvl>
   </w:abstractNum>
-  <w:abstractNum w:abstractNumId="11">
+  <w:abstractNum w:abstractNumId="12">
     <w:nsid w:val="1F9E1E48"/>
     <w:multiLevelType w:val="hybridMultilevel"/>
     <w:tmpl w:val="C7582CDC"/>
@@ -11789,7 +12021,7 @@
       </w:rPr>
     </w:lvl>
   </w:abstractNum>
-  <w:abstractNum w:abstractNumId="12">
+  <w:abstractNum w:abstractNumId="13">
     <w:nsid w:val="203C513C"/>
     <w:multiLevelType w:val="hybridMultilevel"/>
     <w:tmpl w:val="8AB4A5AE"/>
@@ -11878,7 +12110,7 @@
       </w:pPr>
     </w:lvl>
   </w:abstractNum>
-  <w:abstractNum w:abstractNumId="13">
+  <w:abstractNum w:abstractNumId="14">
     <w:nsid w:val="20F05ACF"/>
     <w:multiLevelType w:val="hybridMultilevel"/>
     <w:tmpl w:val="4C5A6C62"/>
@@ -11967,7 +12199,7 @@
       </w:pPr>
     </w:lvl>
   </w:abstractNum>
-  <w:abstractNum w:abstractNumId="14">
+  <w:abstractNum w:abstractNumId="15">
     <w:nsid w:val="24313609"/>
     <w:multiLevelType w:val="hybridMultilevel"/>
     <w:tmpl w:val="BCEEA2D6"/>
@@ -12056,7 +12288,7 @@
       </w:pPr>
     </w:lvl>
   </w:abstractNum>
-  <w:abstractNum w:abstractNumId="15">
+  <w:abstractNum w:abstractNumId="16">
     <w:nsid w:val="2479664E"/>
     <w:multiLevelType w:val="hybridMultilevel"/>
     <w:tmpl w:val="14A418A0"/>
@@ -12145,7 +12377,7 @@
       </w:pPr>
     </w:lvl>
   </w:abstractNum>
-  <w:abstractNum w:abstractNumId="16">
+  <w:abstractNum w:abstractNumId="17">
     <w:nsid w:val="24AA3700"/>
     <w:multiLevelType w:val="hybridMultilevel"/>
     <w:tmpl w:val="4AE473FA"/>
@@ -12234,7 +12466,7 @@
       </w:pPr>
     </w:lvl>
   </w:abstractNum>
-  <w:abstractNum w:abstractNumId="17">
+  <w:abstractNum w:abstractNumId="18">
     <w:nsid w:val="256A1A67"/>
     <w:multiLevelType w:val="hybridMultilevel"/>
     <w:tmpl w:val="2482F060"/>
@@ -12347,7 +12579,7 @@
       </w:rPr>
     </w:lvl>
   </w:abstractNum>
-  <w:abstractNum w:abstractNumId="18">
+  <w:abstractNum w:abstractNumId="19">
     <w:nsid w:val="2E0E1364"/>
     <w:multiLevelType w:val="hybridMultilevel"/>
     <w:tmpl w:val="40CC5AC4"/>
@@ -12436,7 +12668,7 @@
       </w:pPr>
     </w:lvl>
   </w:abstractNum>
-  <w:abstractNum w:abstractNumId="19">
+  <w:abstractNum w:abstractNumId="20">
     <w:nsid w:val="360C28AB"/>
     <w:multiLevelType w:val="hybridMultilevel"/>
     <w:tmpl w:val="D910DDB6"/>
@@ -12549,7 +12781,7 @@
       </w:rPr>
     </w:lvl>
   </w:abstractNum>
-  <w:abstractNum w:abstractNumId="20">
+  <w:abstractNum w:abstractNumId="21">
     <w:nsid w:val="38846546"/>
     <w:multiLevelType w:val="hybridMultilevel"/>
     <w:tmpl w:val="86F02860"/>
@@ -12638,7 +12870,7 @@
       </w:pPr>
     </w:lvl>
   </w:abstractNum>
-  <w:abstractNum w:abstractNumId="21">
+  <w:abstractNum w:abstractNumId="22">
     <w:nsid w:val="39C45A17"/>
     <w:multiLevelType w:val="hybridMultilevel"/>
     <w:tmpl w:val="7BCE0EDE"/>
@@ -12727,7 +12959,7 @@
       </w:pPr>
     </w:lvl>
   </w:abstractNum>
-  <w:abstractNum w:abstractNumId="22">
+  <w:abstractNum w:abstractNumId="23">
     <w:nsid w:val="3C0D7148"/>
     <w:multiLevelType w:val="hybridMultilevel"/>
     <w:tmpl w:val="61EAC19E"/>
@@ -12816,7 +13048,7 @@
       </w:pPr>
     </w:lvl>
   </w:abstractNum>
-  <w:abstractNum w:abstractNumId="23">
+  <w:abstractNum w:abstractNumId="24">
     <w:nsid w:val="3EC7092E"/>
     <w:multiLevelType w:val="hybridMultilevel"/>
     <w:tmpl w:val="BEB82898"/>
@@ -12905,7 +13137,7 @@
       </w:pPr>
     </w:lvl>
   </w:abstractNum>
-  <w:abstractNum w:abstractNumId="24">
+  <w:abstractNum w:abstractNumId="25">
     <w:nsid w:val="3FEE48BD"/>
     <w:multiLevelType w:val="hybridMultilevel"/>
     <w:tmpl w:val="7D7C81C4"/>
@@ -12994,7 +13226,7 @@
       </w:pPr>
     </w:lvl>
   </w:abstractNum>
-  <w:abstractNum w:abstractNumId="25">
+  <w:abstractNum w:abstractNumId="26">
     <w:nsid w:val="403F7638"/>
     <w:multiLevelType w:val="hybridMultilevel"/>
     <w:tmpl w:val="49801E86"/>
@@ -13083,7 +13315,7 @@
       </w:pPr>
     </w:lvl>
   </w:abstractNum>
-  <w:abstractNum w:abstractNumId="26">
+  <w:abstractNum w:abstractNumId="27">
     <w:nsid w:val="430B4440"/>
     <w:multiLevelType w:val="hybridMultilevel"/>
     <w:tmpl w:val="2B70B9E6"/>
@@ -13196,7 +13428,7 @@
       </w:rPr>
     </w:lvl>
   </w:abstractNum>
-  <w:abstractNum w:abstractNumId="27">
+  <w:abstractNum w:abstractNumId="28">
     <w:nsid w:val="46A73B9B"/>
     <w:multiLevelType w:val="hybridMultilevel"/>
     <w:tmpl w:val="EAA08C1C"/>
@@ -13285,7 +13517,7 @@
       </w:pPr>
     </w:lvl>
   </w:abstractNum>
-  <w:abstractNum w:abstractNumId="28">
+  <w:abstractNum w:abstractNumId="29">
     <w:nsid w:val="4EBA6DD1"/>
     <w:multiLevelType w:val="hybridMultilevel"/>
     <w:tmpl w:val="60C02E0C"/>
@@ -13374,7 +13606,7 @@
       </w:pPr>
     </w:lvl>
   </w:abstractNum>
-  <w:abstractNum w:abstractNumId="29">
+  <w:abstractNum w:abstractNumId="30">
     <w:nsid w:val="511B2F49"/>
     <w:multiLevelType w:val="hybridMultilevel"/>
     <w:tmpl w:val="9A3C8644"/>
@@ -13463,7 +13695,7 @@
       </w:pPr>
     </w:lvl>
   </w:abstractNum>
-  <w:abstractNum w:abstractNumId="30">
+  <w:abstractNum w:abstractNumId="31">
     <w:nsid w:val="515E3FEC"/>
     <w:multiLevelType w:val="hybridMultilevel"/>
     <w:tmpl w:val="E902866C"/>
@@ -13576,7 +13808,7 @@
       </w:rPr>
     </w:lvl>
   </w:abstractNum>
-  <w:abstractNum w:abstractNumId="31">
+  <w:abstractNum w:abstractNumId="32">
     <w:nsid w:val="520A0D46"/>
     <w:multiLevelType w:val="hybridMultilevel"/>
     <w:tmpl w:val="5DEA5086"/>
@@ -13665,7 +13897,7 @@
       </w:pPr>
     </w:lvl>
   </w:abstractNum>
-  <w:abstractNum w:abstractNumId="32">
+  <w:abstractNum w:abstractNumId="33">
     <w:nsid w:val="529E3796"/>
     <w:multiLevelType w:val="hybridMultilevel"/>
     <w:tmpl w:val="AB520516"/>
@@ -13754,7 +13986,7 @@
       </w:pPr>
     </w:lvl>
   </w:abstractNum>
-  <w:abstractNum w:abstractNumId="33">
+  <w:abstractNum w:abstractNumId="34">
     <w:nsid w:val="55816A8D"/>
     <w:multiLevelType w:val="hybridMultilevel"/>
     <w:tmpl w:val="1200EDB6"/>
@@ -13843,7 +14075,7 @@
       </w:pPr>
     </w:lvl>
   </w:abstractNum>
-  <w:abstractNum w:abstractNumId="34">
+  <w:abstractNum w:abstractNumId="35">
     <w:nsid w:val="600D19E9"/>
     <w:multiLevelType w:val="hybridMultilevel"/>
     <w:tmpl w:val="F9E8C07C"/>
@@ -13932,7 +14164,7 @@
       </w:pPr>
     </w:lvl>
   </w:abstractNum>
-  <w:abstractNum w:abstractNumId="35">
+  <w:abstractNum w:abstractNumId="36">
     <w:nsid w:val="60166BF6"/>
     <w:multiLevelType w:val="hybridMultilevel"/>
     <w:tmpl w:val="1A2C61F4"/>
@@ -14045,7 +14277,7 @@
       </w:rPr>
     </w:lvl>
   </w:abstractNum>
-  <w:abstractNum w:abstractNumId="36">
+  <w:abstractNum w:abstractNumId="37">
     <w:nsid w:val="61194B06"/>
     <w:multiLevelType w:val="hybridMultilevel"/>
     <w:tmpl w:val="348E9CA8"/>
@@ -14135,7 +14367,7 @@
       </w:pPr>
     </w:lvl>
   </w:abstractNum>
-  <w:abstractNum w:abstractNumId="37">
+  <w:abstractNum w:abstractNumId="38">
     <w:nsid w:val="669D6C41"/>
     <w:multiLevelType w:val="hybridMultilevel"/>
     <w:tmpl w:val="9E22EC66"/>
@@ -14248,7 +14480,7 @@
       </w:rPr>
     </w:lvl>
   </w:abstractNum>
-  <w:abstractNum w:abstractNumId="38">
+  <w:abstractNum w:abstractNumId="39">
     <w:nsid w:val="67740DB7"/>
     <w:multiLevelType w:val="hybridMultilevel"/>
     <w:tmpl w:val="98CEB9B2"/>
@@ -14334,7 +14566,7 @@
       </w:pPr>
     </w:lvl>
   </w:abstractNum>
-  <w:abstractNum w:abstractNumId="39">
+  <w:abstractNum w:abstractNumId="40">
     <w:nsid w:val="6DE40AAE"/>
     <w:multiLevelType w:val="hybridMultilevel"/>
     <w:tmpl w:val="8A1CE40E"/>
@@ -14423,7 +14655,7 @@
       </w:pPr>
     </w:lvl>
   </w:abstractNum>
-  <w:abstractNum w:abstractNumId="40">
+  <w:abstractNum w:abstractNumId="41">
     <w:nsid w:val="771E184F"/>
     <w:multiLevelType w:val="hybridMultilevel"/>
     <w:tmpl w:val="A18E7122"/>
@@ -14536,7 +14768,7 @@
       </w:rPr>
     </w:lvl>
   </w:abstractNum>
-  <w:abstractNum w:abstractNumId="41">
+  <w:abstractNum w:abstractNumId="42">
     <w:nsid w:val="771F358C"/>
     <w:multiLevelType w:val="hybridMultilevel"/>
     <w:tmpl w:val="08E0D094"/>
@@ -14625,7 +14857,7 @@
       </w:pPr>
     </w:lvl>
   </w:abstractNum>
-  <w:abstractNum w:abstractNumId="42">
+  <w:abstractNum w:abstractNumId="43">
     <w:nsid w:val="7F7B6E0C"/>
     <w:multiLevelType w:val="hybridMultilevel"/>
     <w:tmpl w:val="1D06EEE4"/>
@@ -14715,133 +14947,136 @@
     </w:lvl>
   </w:abstractNum>
   <w:num w:numId="1">
-    <w:abstractNumId w:val="21"/>
+    <w:abstractNumId w:val="22"/>
   </w:num>
   <w:num w:numId="2">
-    <w:abstractNumId w:val="23"/>
+    <w:abstractNumId w:val="24"/>
   </w:num>
   <w:num w:numId="3">
     <w:abstractNumId w:val="0"/>
   </w:num>
   <w:num w:numId="4">
-    <w:abstractNumId w:val="9"/>
+    <w:abstractNumId w:val="10"/>
   </w:num>
   <w:num w:numId="5">
-    <w:abstractNumId w:val="25"/>
+    <w:abstractNumId w:val="26"/>
   </w:num>
   <w:num w:numId="6">
-    <w:abstractNumId w:val="13"/>
+    <w:abstractNumId w:val="14"/>
   </w:num>
   <w:num w:numId="7">
     <w:abstractNumId w:val="7"/>
   </w:num>
   <w:num w:numId="8">
-    <w:abstractNumId w:val="37"/>
+    <w:abstractNumId w:val="38"/>
   </w:num>
   <w:num w:numId="9">
-    <w:abstractNumId w:val="41"/>
+    <w:abstractNumId w:val="42"/>
   </w:num>
   <w:num w:numId="10">
-    <w:abstractNumId w:val="18"/>
+    <w:abstractNumId w:val="19"/>
   </w:num>
   <w:num w:numId="11">
-    <w:abstractNumId w:val="24"/>
+    <w:abstractNumId w:val="25"/>
   </w:num>
   <w:num w:numId="12">
-    <w:abstractNumId w:val="22"/>
+    <w:abstractNumId w:val="23"/>
   </w:num>
   <w:num w:numId="13">
     <w:abstractNumId w:val="5"/>
   </w:num>
   <w:num w:numId="14">
-    <w:abstractNumId w:val="8"/>
+    <w:abstractNumId w:val="9"/>
   </w:num>
   <w:num w:numId="15">
-    <w:abstractNumId w:val="39"/>
+    <w:abstractNumId w:val="40"/>
   </w:num>
   <w:num w:numId="16">
     <w:abstractNumId w:val="3"/>
   </w:num>
   <w:num w:numId="17">
-    <w:abstractNumId w:val="32"/>
+    <w:abstractNumId w:val="33"/>
   </w:num>
   <w:num w:numId="18">
-    <w:abstractNumId w:val="35"/>
+    <w:abstractNumId w:val="36"/>
   </w:num>
   <w:num w:numId="19">
-    <w:abstractNumId w:val="15"/>
+    <w:abstractNumId w:val="16"/>
   </w:num>
   <w:num w:numId="20">
-    <w:abstractNumId w:val="33"/>
+    <w:abstractNumId w:val="34"/>
   </w:num>
   <w:num w:numId="21">
     <w:abstractNumId w:val="1"/>
   </w:num>
   <w:num w:numId="22">
+    <w:abstractNumId w:val="21"/>
+  </w:num>
+  <w:num w:numId="23">
     <w:abstractNumId w:val="20"/>
   </w:num>
-  <w:num w:numId="23">
-    <w:abstractNumId w:val="19"/>
-  </w:num>
   <w:num w:numId="24">
-    <w:abstractNumId w:val="11"/>
+    <w:abstractNumId w:val="12"/>
   </w:num>
   <w:num w:numId="25">
-    <w:abstractNumId w:val="28"/>
+    <w:abstractNumId w:val="29"/>
   </w:num>
   <w:num w:numId="26">
     <w:abstractNumId w:val="4"/>
   </w:num>
   <w:num w:numId="27">
-    <w:abstractNumId w:val="12"/>
+    <w:abstractNumId w:val="13"/>
   </w:num>
   <w:num w:numId="28">
-    <w:abstractNumId w:val="10"/>
+    <w:abstractNumId w:val="11"/>
   </w:num>
   <w:num w:numId="29">
-    <w:abstractNumId w:val="36"/>
+    <w:abstractNumId w:val="37"/>
   </w:num>
   <w:num w:numId="30">
-    <w:abstractNumId w:val="27"/>
+    <w:abstractNumId w:val="28"/>
   </w:num>
   <w:num w:numId="31">
-    <w:abstractNumId w:val="16"/>
+    <w:abstractNumId w:val="17"/>
   </w:num>
   <w:num w:numId="32">
-    <w:abstractNumId w:val="30"/>
+    <w:abstractNumId w:val="31"/>
   </w:num>
   <w:num w:numId="33">
-    <w:abstractNumId w:val="26"/>
+    <w:abstractNumId w:val="27"/>
   </w:num>
   <w:num w:numId="34">
     <w:abstractNumId w:val="2"/>
   </w:num>
   <w:num w:numId="35">
-    <w:abstractNumId w:val="17"/>
+    <w:abstractNumId w:val="18"/>
   </w:num>
   <w:num w:numId="36">
-    <w:abstractNumId w:val="29"/>
+    <w:abstractNumId w:val="30"/>
   </w:num>
   <w:num w:numId="37">
-    <w:abstractNumId w:val="42"/>
+    <w:abstractNumId w:val="43"/>
   </w:num>
   <w:num w:numId="38">
-    <w:abstractNumId w:val="34"/>
+    <w:abstractNumId w:val="35"/>
   </w:num>
   <w:num w:numId="39">
-    <w:abstractNumId w:val="38"/>
+    <w:abstractNumId w:val="39"/>
   </w:num>
   <w:num w:numId="40">
-    <w:abstractNumId w:val="40"/>
+    <w:abstractNumId w:val="41"/>
   </w:num>
   <w:num w:numId="41">
     <w:abstractNumId w:val="6"/>
   </w:num>
   <w:num w:numId="42">
-    <w:abstractNumId w:val="14"/>
+    <w:abstractNumId w:val="15"/>
   </w:num>
   <w:num w:numId="43">
-    <w:abstractNumId w:val="31"/>
+    <w:abstractNumId w:val="32"/>
+  </w:num>
+  <w:num w:numId="44">
+    <w:abstractNumId w:val="8"/>
   </w:num>
 </w:numbering>
 </file>

</xml_diff>

<commit_message>
Date: 13 Jan 2026
</commit_message>
<xml_diff>
--- a/Notes_Selenium_15.docx
+++ b/Notes_Selenium_15.docx
@@ -10659,30 +10659,202 @@
         </w:rPr>
         <w:t>Tags needs to be specified in feature file</w:t>
       </w:r>
+    </w:p>
+    <w:p>
+      <w:pPr>
+        <w:pStyle w:val="ListParagraph"/>
+        <w:numPr>
+          <w:ilvl w:val="0"/>
+          <w:numId w:val="44"/>
+        </w:numPr>
+        <w:rPr>
+          <w:sz w:val="26"/>
+          <w:szCs w:val="24"/>
+          <w:lang w:val="en-US"/>
+        </w:rPr>
+      </w:pPr>
+      <w:r>
+        <w:rPr>
+          <w:sz w:val="26"/>
+          <w:szCs w:val="24"/>
+          <w:lang w:val="en-US"/>
+        </w:rPr>
+        <w:t>Execution criteria needs to be specified in Runner class</w:t>
+      </w:r>
+    </w:p>
+    <w:p>
+      <w:pPr>
+        <w:rPr>
+          <w:b/>
+          <w:bCs/>
+          <w:sz w:val="26"/>
+          <w:szCs w:val="24"/>
+          <w:lang w:val="en-US"/>
+        </w:rPr>
+      </w:pPr>
+      <w:r>
+        <w:rPr>
+          <w:b/>
+          <w:bCs/>
+          <w:sz w:val="26"/>
+          <w:szCs w:val="24"/>
+          <w:lang w:val="en-US"/>
+        </w:rPr>
+        <w:lastRenderedPageBreak/>
+        <w:t>Hooks in Cucumber</w:t>
+      </w:r>
+    </w:p>
+    <w:p>
+      <w:pPr>
+        <w:pStyle w:val="ListParagraph"/>
+        <w:numPr>
+          <w:ilvl w:val="0"/>
+          <w:numId w:val="45"/>
+        </w:numPr>
+        <w:rPr>
+          <w:sz w:val="26"/>
+          <w:szCs w:val="24"/>
+          <w:lang w:val="en-US"/>
+        </w:rPr>
+      </w:pPr>
+      <w:r>
+        <w:rPr>
+          <w:sz w:val="26"/>
+          <w:szCs w:val="24"/>
+          <w:lang w:val="en-US"/>
+        </w:rPr>
+        <w:t>These are methods those get executed before and after every scenario.</w:t>
+      </w:r>
+    </w:p>
+    <w:p>
+      <w:pPr>
+        <w:pStyle w:val="ListParagraph"/>
+        <w:numPr>
+          <w:ilvl w:val="0"/>
+          <w:numId w:val="45"/>
+        </w:numPr>
+        <w:rPr>
+          <w:sz w:val="26"/>
+          <w:szCs w:val="24"/>
+          <w:lang w:val="en-US"/>
+        </w:rPr>
+      </w:pPr>
+      <w:r>
+        <w:rPr>
+          <w:sz w:val="26"/>
+          <w:szCs w:val="24"/>
+          <w:lang w:val="en-US"/>
+        </w:rPr>
+        <w:t>There are 2 hooks available in Cucumber</w:t>
+      </w:r>
+    </w:p>
+    <w:p>
+      <w:pPr>
+        <w:pStyle w:val="ListParagraph"/>
+        <w:numPr>
+          <w:ilvl w:val="1"/>
+          <w:numId w:val="45"/>
+        </w:numPr>
+        <w:rPr>
+          <w:sz w:val="26"/>
+          <w:szCs w:val="24"/>
+          <w:lang w:val="en-US"/>
+        </w:rPr>
+      </w:pPr>
+      <w:r>
+        <w:rPr>
+          <w:sz w:val="26"/>
+          <w:szCs w:val="24"/>
+          <w:lang w:val="en-US"/>
+        </w:rPr>
+        <w:t>@Before</w:t>
+      </w:r>
+    </w:p>
+    <w:p>
+      <w:pPr>
+        <w:pStyle w:val="ListParagraph"/>
+        <w:numPr>
+          <w:ilvl w:val="1"/>
+          <w:numId w:val="45"/>
+        </w:numPr>
+        <w:rPr>
+          <w:sz w:val="26"/>
+          <w:szCs w:val="24"/>
+          <w:lang w:val="en-US"/>
+        </w:rPr>
+      </w:pPr>
+      <w:r>
+        <w:rPr>
+          <w:sz w:val="26"/>
+          <w:szCs w:val="24"/>
+          <w:lang w:val="en-US"/>
+        </w:rPr>
+        <w:t>@After</w:t>
+      </w:r>
+    </w:p>
+    <w:p>
+      <w:pPr>
+        <w:pStyle w:val="ListParagraph"/>
+        <w:numPr>
+          <w:ilvl w:val="0"/>
+          <w:numId w:val="45"/>
+        </w:numPr>
+        <w:rPr>
+          <w:sz w:val="26"/>
+          <w:szCs w:val="24"/>
+          <w:lang w:val="en-US"/>
+        </w:rPr>
+      </w:pPr>
+      <w:r>
+        <w:rPr>
+          <w:sz w:val="26"/>
+          <w:szCs w:val="24"/>
+          <w:lang w:val="en-US"/>
+        </w:rPr>
+        <w:t>Hooks are never part of feature file.</w:t>
+      </w:r>
+    </w:p>
+    <w:p>
+      <w:pPr>
+        <w:pStyle w:val="ListParagraph"/>
+        <w:numPr>
+          <w:ilvl w:val="0"/>
+          <w:numId w:val="45"/>
+        </w:numPr>
+        <w:rPr>
+          <w:sz w:val="26"/>
+          <w:szCs w:val="24"/>
+          <w:lang w:val="en-US"/>
+        </w:rPr>
+      </w:pPr>
+      <w:r>
+        <w:rPr>
+          <w:sz w:val="26"/>
+          <w:szCs w:val="24"/>
+          <w:lang w:val="en-US"/>
+        </w:rPr>
+        <w:t>You can put the hooks either in step definition class or even you can create separate class for defining hooks.</w:t>
+      </w:r>
       <w:bookmarkStart w:id="0" w:name="_GoBack"/>
       <w:bookmarkEnd w:id="0"/>
     </w:p>
     <w:p>
       <w:pPr>
-        <w:pStyle w:val="ListParagraph"/>
-        <w:numPr>
-          <w:ilvl w:val="0"/>
-          <w:numId w:val="44"/>
-        </w:numPr>
-        <w:rPr>
-          <w:sz w:val="26"/>
-          <w:szCs w:val="24"/>
-          <w:lang w:val="en-US"/>
-        </w:rPr>
-      </w:pPr>
-      <w:r>
-        <w:rPr>
-          <w:sz w:val="26"/>
-          <w:szCs w:val="24"/>
-          <w:lang w:val="en-US"/>
-        </w:rPr>
-        <w:t>Execution criteria needs to be specified in Runner class</w:t>
-      </w:r>
+        <w:rPr>
+          <w:sz w:val="26"/>
+          <w:szCs w:val="24"/>
+          <w:lang w:val="en-US"/>
+        </w:rPr>
+      </w:pPr>
+    </w:p>
+    <w:p>
+      <w:pPr>
+        <w:rPr>
+          <w:sz w:val="26"/>
+          <w:szCs w:val="24"/>
+          <w:lang w:val="en-US"/>
+        </w:rPr>
+      </w:pPr>
     </w:p>
     <w:sectPr>
       <w:pgSz w:w="11906" w:h="16838"/>
@@ -14656,6 +14828,119 @@
     </w:lvl>
   </w:abstractNum>
   <w:abstractNum w:abstractNumId="41">
+    <w:nsid w:val="70511409"/>
+    <w:multiLevelType w:val="hybridMultilevel"/>
+    <w:tmpl w:val="8BBE9C12"/>
+    <w:lvl w:ilvl="0" w:tplc="40090001">
+      <w:start w:val="1"/>
+      <w:numFmt w:val="bullet"/>
+      <w:lvlText w:val=""/>
+      <w:lvlJc w:val="left"/>
+      <w:pPr>
+        <w:ind w:left="720" w:hanging="360"/>
+      </w:pPr>
+      <w:rPr>
+        <w:rFonts w:ascii="Symbol" w:hAnsi="Symbol" w:hint="default"/>
+      </w:rPr>
+    </w:lvl>
+    <w:lvl w:ilvl="1" w:tplc="40090003">
+      <w:start w:val="1"/>
+      <w:numFmt w:val="bullet"/>
+      <w:lvlText w:val="o"/>
+      <w:lvlJc w:val="left"/>
+      <w:pPr>
+        <w:ind w:left="1440" w:hanging="360"/>
+      </w:pPr>
+      <w:rPr>
+        <w:rFonts w:ascii="Courier New" w:hAnsi="Courier New" w:cs="Courier New" w:hint="default"/>
+      </w:rPr>
+    </w:lvl>
+    <w:lvl w:ilvl="2" w:tplc="40090005" w:tentative="1">
+      <w:start w:val="1"/>
+      <w:numFmt w:val="bullet"/>
+      <w:lvlText w:val=""/>
+      <w:lvlJc w:val="left"/>
+      <w:pPr>
+        <w:ind w:left="2160" w:hanging="360"/>
+      </w:pPr>
+      <w:rPr>
+        <w:rFonts w:ascii="Wingdings" w:hAnsi="Wingdings" w:hint="default"/>
+      </w:rPr>
+    </w:lvl>
+    <w:lvl w:ilvl="3" w:tplc="40090001" w:tentative="1">
+      <w:start w:val="1"/>
+      <w:numFmt w:val="bullet"/>
+      <w:lvlText w:val=""/>
+      <w:lvlJc w:val="left"/>
+      <w:pPr>
+        <w:ind w:left="2880" w:hanging="360"/>
+      </w:pPr>
+      <w:rPr>
+        <w:rFonts w:ascii="Symbol" w:hAnsi="Symbol" w:hint="default"/>
+      </w:rPr>
+    </w:lvl>
+    <w:lvl w:ilvl="4" w:tplc="40090003" w:tentative="1">
+      <w:start w:val="1"/>
+      <w:numFmt w:val="bullet"/>
+      <w:lvlText w:val="o"/>
+      <w:lvlJc w:val="left"/>
+      <w:pPr>
+        <w:ind w:left="3600" w:hanging="360"/>
+      </w:pPr>
+      <w:rPr>
+        <w:rFonts w:ascii="Courier New" w:hAnsi="Courier New" w:cs="Courier New" w:hint="default"/>
+      </w:rPr>
+    </w:lvl>
+    <w:lvl w:ilvl="5" w:tplc="40090005" w:tentative="1">
+      <w:start w:val="1"/>
+      <w:numFmt w:val="bullet"/>
+      <w:lvlText w:val=""/>
+      <w:lvlJc w:val="left"/>
+      <w:pPr>
+        <w:ind w:left="4320" w:hanging="360"/>
+      </w:pPr>
+      <w:rPr>
+        <w:rFonts w:ascii="Wingdings" w:hAnsi="Wingdings" w:hint="default"/>
+      </w:rPr>
+    </w:lvl>
+    <w:lvl w:ilvl="6" w:tplc="40090001" w:tentative="1">
+      <w:start w:val="1"/>
+      <w:numFmt w:val="bullet"/>
+      <w:lvlText w:val=""/>
+      <w:lvlJc w:val="left"/>
+      <w:pPr>
+        <w:ind w:left="5040" w:hanging="360"/>
+      </w:pPr>
+      <w:rPr>
+        <w:rFonts w:ascii="Symbol" w:hAnsi="Symbol" w:hint="default"/>
+      </w:rPr>
+    </w:lvl>
+    <w:lvl w:ilvl="7" w:tplc="40090003" w:tentative="1">
+      <w:start w:val="1"/>
+      <w:numFmt w:val="bullet"/>
+      <w:lvlText w:val="o"/>
+      <w:lvlJc w:val="left"/>
+      <w:pPr>
+        <w:ind w:left="5760" w:hanging="360"/>
+      </w:pPr>
+      <w:rPr>
+        <w:rFonts w:ascii="Courier New" w:hAnsi="Courier New" w:cs="Courier New" w:hint="default"/>
+      </w:rPr>
+    </w:lvl>
+    <w:lvl w:ilvl="8" w:tplc="40090005" w:tentative="1">
+      <w:start w:val="1"/>
+      <w:numFmt w:val="bullet"/>
+      <w:lvlText w:val=""/>
+      <w:lvlJc w:val="left"/>
+      <w:pPr>
+        <w:ind w:left="6480" w:hanging="360"/>
+      </w:pPr>
+      <w:rPr>
+        <w:rFonts w:ascii="Wingdings" w:hAnsi="Wingdings" w:hint="default"/>
+      </w:rPr>
+    </w:lvl>
+  </w:abstractNum>
+  <w:abstractNum w:abstractNumId="42">
     <w:nsid w:val="771E184F"/>
     <w:multiLevelType w:val="hybridMultilevel"/>
     <w:tmpl w:val="A18E7122"/>
@@ -14768,7 +15053,7 @@
       </w:rPr>
     </w:lvl>
   </w:abstractNum>
-  <w:abstractNum w:abstractNumId="42">
+  <w:abstractNum w:abstractNumId="43">
     <w:nsid w:val="771F358C"/>
     <w:multiLevelType w:val="hybridMultilevel"/>
     <w:tmpl w:val="08E0D094"/>
@@ -14857,7 +15142,7 @@
       </w:pPr>
     </w:lvl>
   </w:abstractNum>
-  <w:abstractNum w:abstractNumId="43">
+  <w:abstractNum w:abstractNumId="44">
     <w:nsid w:val="7F7B6E0C"/>
     <w:multiLevelType w:val="hybridMultilevel"/>
     <w:tmpl w:val="1D06EEE4"/>
@@ -14971,7 +15256,7 @@
     <w:abstractNumId w:val="38"/>
   </w:num>
   <w:num w:numId="9">
-    <w:abstractNumId w:val="42"/>
+    <w:abstractNumId w:val="43"/>
   </w:num>
   <w:num w:numId="10">
     <w:abstractNumId w:val="19"/>
@@ -15055,7 +15340,7 @@
     <w:abstractNumId w:val="30"/>
   </w:num>
   <w:num w:numId="37">
-    <w:abstractNumId w:val="43"/>
+    <w:abstractNumId w:val="44"/>
   </w:num>
   <w:num w:numId="38">
     <w:abstractNumId w:val="35"/>
@@ -15064,7 +15349,7 @@
     <w:abstractNumId w:val="39"/>
   </w:num>
   <w:num w:numId="40">
-    <w:abstractNumId w:val="41"/>
+    <w:abstractNumId w:val="42"/>
   </w:num>
   <w:num w:numId="41">
     <w:abstractNumId w:val="6"/>
@@ -15077,6 +15362,9 @@
   </w:num>
   <w:num w:numId="44">
     <w:abstractNumId w:val="8"/>
+  </w:num>
+  <w:num w:numId="45">
+    <w:abstractNumId w:val="41"/>
   </w:num>
 </w:numbering>
 </file>

</xml_diff>